<commit_message>
Testkarte mit korrigierter Allergentabelle
Co-Authored-By: Claude Opus 5.5 <noreply@anthropic.com>
</commit_message>
<xml_diff>
--- a/karten/2026-10-07/karte.docx
+++ b/karten/2026-10-07/karte.docx
@@ -681,8 +681,2899 @@
 </w:ftr>
 </file>
 
-<file path=word/footer2.xml><?xml version="1.0" encoding="UTF-8" standalone="yes"?>
-<w:ftr xmlns:wpc="http://schemas.microsoft.com/office/word/2010/wordprocessingCanvas" xmlns:cx="http://schemas.microsoft.com/office/drawing/2014/chartex" xmlns:cx1="http://schemas.microsoft.com/office/drawing/2015/9/8/chartex" xmlns:cx2="http://schemas.microsoft.com/office/drawing/2015/10/21/chartex" xmlns:cx3="http://schemas.microsoft.com/office/drawing/2016/5/9/chartex" xmlns:cx4="http://schemas.microsoft.com/office/drawing/2016/5/10/chartex" xmlns:cx5="http://schemas.microsoft.com/office/drawing/2016/5/11/chartex" xmlns:cx6="http://schemas.microsoft.com/office/drawing/2016/5/12/chartex" xmlns:cx7="http://schemas.microsoft.com/office/drawing/2016/5/13/chartex" xmlns:cx8="http://schemas.microsoft.com/office/drawing/2016/5/14/chartex" xmlns:mc="http://schemas.openxmlformats.org/markup-compatibility/2006" xmlns:m="http://schemas.openxmlformats.org/officeDocument/2006/math" xmlns:aink="http://schemas.microsoft.com/office/drawing/2016/ink" xmlns:am3d="http://schemas.microsoft.com/office/drawing/2017/model3d" xmlns:oel="http://schemas.microsoft.com/office/2019/extlst" xmlns:r="http://schemas.openxmlformats.org/officeDocument/2006/relationships" xmlns:wp14="http://schemas.microsoft.com/office/word/2010/wordprocessingDrawing" xmlns:wp="http://schemas.openxmlformats.org/drawingml/2006/wordprocessingDrawing" xmlns:wpg="http://schemas.microsoft.com/office/word/2010/wordprocessingGroup" xmlns:wpi="http://schemas.microsoft.com/office/word/2010/wordprocessingInk" xmlns:wps="http://schemas.microsoft.com/office/word/2010/wordprocessingShape" xmlns:o="urn:schemas-microsoft-com:office:office" xmlns:v="urn:schemas-microsoft-com:vml" xmlns:w10="urn:schemas-microsoft-com:office:word" xmlns:w="http://schemas.openxmlformats.org/wordprocessingml/2006/main" xmlns:w14="http://schemas.microsoft.com/office/word/2010/wordml" xmlns:w15="http://schemas.microsoft.com/office/word/2012/wordml" xmlns:w16cex="http://schemas.microsoft.com/office/word/2018/wordml/cex" xmlns:w16cid="http://schemas.microsoft.com/office/word/2016/wordml/cid" xmlns:w16="http://schemas.microsoft.com/office/word/2018/wordml" xmlns:w16sdtdh="http://schemas.microsoft.com/office/word/2020/wordml/sdtdatahash" xmlns:w16sdtfl="http://schemas.microsoft.com/office/word/2024/wordml/sdtformatlock" xmlns:w16se="http://schemas.microsoft.com/office/word/2015/wordml/symex" xmlns:w16du="http://schemas.microsoft.com/office/word/2023/wordml/word16du" xmlns:wne="http://schemas.microsoft.com/office/word/2006/wordml" mc:Ignorable="w14 w15 w16se w16cid w16 w16cex w16sdtdh w16sdtfl w16du wp14"><w:p><w:pPr><w:pStyle w:val="berschriftengrnascute20"/><w:spacing w:line="240" w:lineRule="auto"/><w:jc w:val="center"/><w:rPr><w:rFonts w:ascii="Indie Flower" w:hAnsi="Indie Flower" w:cs="Indie Flower"/><w:color w:val="658C43"/></w:rPr></w:pPr><w:r><w:rPr><w:rFonts w:ascii="Indie Flower" w:hAnsi="Indie Flower" w:cs="Indie Flower"/><w:noProof/><w:color w:val="658C43"/></w:rPr><w:drawing><wp:anchor distT="0" distB="0" distL="0" distR="0" simplePos="0" relativeHeight="251660288" behindDoc="0" locked="1" layoutInCell="1" allowOverlap="1"><wp:simplePos x="0" y="0"/><wp:positionH relativeFrom="page"><wp:posOffset>356616</wp:posOffset></wp:positionH><wp:positionV relativeFrom="page"><wp:posOffset>8427720</wp:posOffset></wp:positionV><wp:extent cx="6836664" cy="1517424"/><wp:effectExtent l="0" t="0" r="0" b="0"/><wp:wrapNone/><wp:docPr id="3000" name="Allergentabelle"/><wp:cNvGraphicFramePr/><a:graphic xmlns:a="http://schemas.openxmlformats.org/drawingml/2006/main"><a:graphicData uri="http://schemas.microsoft.com/office/word/2010/wordprocessingShape"><wps:wsp><wps:cNvSpPr txBox="1"/><wps:spPr><a:xfrm><a:off x="0" y="0"/><a:ext cx="6836664" cy="1517424"/></a:xfrm><a:prstGeom prst="rect"><a:avLst/></a:prstGeom><a:noFill/><a:ln><a:noFill/></a:ln></wps:spPr><wps:txbx><w:txbxContent><w:tbl><w:tblPr><w:tblW w:w="10767" w:type="dxa"/><w:tblLayout w:type="fixed"/><w:tblBorders><w:top w:val="single" w:sz="10" w:space="0" w:color="658C43"/><w:left w:val="single" w:sz="10" w:space="0" w:color="658C43"/><w:bottom w:val="single" w:sz="10" w:space="0" w:color="658C43"/><w:right w:val="single" w:sz="10" w:space="0" w:color="658C43"/><w:insideH w:val="single" w:sz="4" w:space="0" w:color="658C43"/><w:insideV w:val="single" w:sz="4" w:space="0" w:color="658C43"/></w:tblBorders><w:tblCellMar><w:top w:w="0" w:type="dxa"/><w:left w:w="0" w:type="dxa"/><w:bottom w:w="0" w:type="dxa"/><w:right w:w="0" w:type="dxa"/></w:tblCellMar><w:tblLook w:val="0000"/></w:tblPr><w:tblGrid><w:gridCol w:w="514"/><w:gridCol w:w="634"/><w:gridCol w:w="605"/><w:gridCol w:w="590"/><w:gridCol w:w="576"/><w:gridCol w:w="806"/><w:gridCol w:w="826"/><w:gridCol w:w="557"/><w:gridCol w:w="1090"/><w:gridCol w:w="763"/><w:gridCol w:w="581"/><w:gridCol w:w="566"/><w:gridCol w:w="600"/><w:gridCol w:w="624"/><w:gridCol w:w="1435"/></w:tblGrid><w:tr><w:trPr><w:cantSplit/><w:trHeight w:val="898" w:hRule="exact"/></w:trPr><w:tc><w:tcPr><w:tcW w:w="514" w:type="dxa"/><w:tcMar><w:top w:w="0" w:type="dxa"/><w:bottom w:w="0" w:type="dxa"/><w:left w:w="20" w:type="dxa"/><w:right w:w="20" w:type="dxa"/></w:tcMar><w:vAlign w:val="center"/></w:tcPr><w:p><w:pPr><w:spacing w:before="0" w:after="0" w:line="240" w:lineRule="auto"/><w:jc w:val="center"/></w:pPr></w:p></w:tc><w:tc><w:tcPr><w:tcW w:w="634" w:type="dxa"/><w:tcMar><w:top w:w="0" w:type="dxa"/><w:bottom w:w="0" w:type="dxa"/><w:left w:w="20" w:type="dxa"/><w:right w:w="20" w:type="dxa"/></w:tcMar><w:vAlign w:val="center"/></w:tcPr><w:p><w:pPr><w:spacing w:before="0" w:after="0" w:line="240" w:lineRule="auto"/><w:jc w:val="center"/></w:pPr><w:r><w:rPr><w:noProof/></w:rPr><w:drawing><wp:inline distT="0" distB="0" distL="0" distR="0"><wp:extent cx="237744" cy="237744"/><wp:effectExtent l="0" t="0" r="0" b="0"/><wp:docPr id="3101" name="Allergen Gluten" descr="Gluten"/><wp:cNvGraphicFramePr><a:graphicFrameLocks xmlns:a="http://schemas.openxmlformats.org/drawingml/2006/main" noChangeAspect="1"/></wp:cNvGraphicFramePr><a:graphic xmlns:a="http://schemas.openxmlformats.org/drawingml/2006/main"><a:graphicData uri="http://schemas.openxmlformats.org/drawingml/2006/picture"><pic:pic xmlns:pic="http://schemas.openxmlformats.org/drawingml/2006/picture"><pic:nvPicPr><pic:cNvPr id="3101" name="allergen-gluten.png"/><pic:cNvPicPr/></pic:nvPicPr><pic:blipFill><a:blip r:embed="rIdAllergenPng1"><a:extLst><a:ext uri="{96DAC541-7B7A-43D3-8B79-37D633B846F1}"><asvg:svgBlip xmlns:asvg="http://schemas.microsoft.com/office/drawing/2016/SVG/main" r:embed="rIdAllergenSvg1"/></a:ext></a:extLst></a:blip><a:stretch><a:fillRect/></a:stretch></pic:blipFill><pic:spPr><a:xfrm><a:off x="0" y="0"/><a:ext cx="237744" cy="237744"/></a:xfrm><a:prstGeom prst="rect"><a:avLst/></a:prstGeom></pic:spPr></pic:pic></a:graphicData></a:graphic></wp:inline></w:drawing></w:r></w:p><w:p><w:pPr><w:spacing w:before="0" w:after="0" w:line="220" w:lineRule="auto"/><w:jc w:val="center"/></w:pPr><w:r><w:rPr><w:rFonts w:ascii="Glegoo" w:hAnsi="Glegoo" w:cs="Glegoo"/><w:color w:val="4A4A4A"/><w:sz w:val="12"/><w:szCs w:val="12"/></w:rPr><w:t xml:space="preserve">Gluten</w:t></w:r></w:p></w:tc><w:tc><w:tcPr><w:tcW w:w="605" w:type="dxa"/><w:tcMar><w:top w:w="0" w:type="dxa"/><w:bottom w:w="0" w:type="dxa"/><w:left w:w="20" w:type="dxa"/><w:right w:w="20" w:type="dxa"/></w:tcMar><w:vAlign w:val="center"/></w:tcPr><w:p><w:pPr><w:spacing w:before="0" w:after="0" w:line="240" w:lineRule="auto"/><w:jc w:val="center"/></w:pPr><w:r><w:rPr><w:noProof/></w:rPr><w:drawing><wp:inline distT="0" distB="0" distL="0" distR="0"><wp:extent cx="237744" cy="237744"/><wp:effectExtent l="0" t="0" r="0" b="0"/><wp:docPr id="3102" name="Allergen Milch" descr="Milch"/><wp:cNvGraphicFramePr><a:graphicFrameLocks xmlns:a="http://schemas.openxmlformats.org/drawingml/2006/main" noChangeAspect="1"/></wp:cNvGraphicFramePr><a:graphic xmlns:a="http://schemas.openxmlformats.org/drawingml/2006/main"><a:graphicData uri="http://schemas.openxmlformats.org/drawingml/2006/picture"><pic:pic xmlns:pic="http://schemas.openxmlformats.org/drawingml/2006/picture"><pic:nvPicPr><pic:cNvPr id="3102" name="allergen-milch.png"/><pic:cNvPicPr/></pic:nvPicPr><pic:blipFill><a:blip r:embed="rIdAllergenPng2"><a:extLst><a:ext uri="{96DAC541-7B7A-43D3-8B79-37D633B846F1}"><asvg:svgBlip xmlns:asvg="http://schemas.microsoft.com/office/drawing/2016/SVG/main" r:embed="rIdAllergenSvg2"/></a:ext></a:extLst></a:blip><a:stretch><a:fillRect/></a:stretch></pic:blipFill><pic:spPr><a:xfrm><a:off x="0" y="0"/><a:ext cx="237744" cy="237744"/></a:xfrm><a:prstGeom prst="rect"><a:avLst/></a:prstGeom></pic:spPr></pic:pic></a:graphicData></a:graphic></wp:inline></w:drawing></w:r></w:p><w:p><w:pPr><w:spacing w:before="0" w:after="0" w:line="220" w:lineRule="auto"/><w:jc w:val="center"/></w:pPr><w:r><w:rPr><w:rFonts w:ascii="Glegoo" w:hAnsi="Glegoo" w:cs="Glegoo"/><w:color w:val="4A4A4A"/><w:sz w:val="12"/><w:szCs w:val="12"/></w:rPr><w:t xml:space="preserve">Milch</w:t></w:r></w:p></w:tc><w:tc><w:tcPr><w:tcW w:w="590" w:type="dxa"/><w:tcMar><w:top w:w="0" w:type="dxa"/><w:bottom w:w="0" w:type="dxa"/><w:left w:w="20" w:type="dxa"/><w:right w:w="20" w:type="dxa"/></w:tcMar><w:vAlign w:val="center"/></w:tcPr><w:p><w:pPr><w:spacing w:before="0" w:after="0" w:line="240" w:lineRule="auto"/><w:jc w:val="center"/></w:pPr><w:r><w:rPr><w:noProof/></w:rPr><w:drawing><wp:inline distT="0" distB="0" distL="0" distR="0"><wp:extent cx="237744" cy="237744"/><wp:effectExtent l="0" t="0" r="0" b="0"/><wp:docPr id="3103" name="Allergen Eier" descr="Eier"/><wp:cNvGraphicFramePr><a:graphicFrameLocks xmlns:a="http://schemas.openxmlformats.org/drawingml/2006/main" noChangeAspect="1"/></wp:cNvGraphicFramePr><a:graphic xmlns:a="http://schemas.openxmlformats.org/drawingml/2006/main"><a:graphicData uri="http://schemas.openxmlformats.org/drawingml/2006/picture"><pic:pic xmlns:pic="http://schemas.openxmlformats.org/drawingml/2006/picture"><pic:nvPicPr><pic:cNvPr id="3103" name="allergen-eier.png"/><pic:cNvPicPr/></pic:nvPicPr><pic:blipFill><a:blip r:embed="rIdAllergenPng3"><a:extLst><a:ext uri="{96DAC541-7B7A-43D3-8B79-37D633B846F1}"><asvg:svgBlip xmlns:asvg="http://schemas.microsoft.com/office/drawing/2016/SVG/main" r:embed="rIdAllergenSvg3"/></a:ext></a:extLst></a:blip><a:stretch><a:fillRect/></a:stretch></pic:blipFill><pic:spPr><a:xfrm><a:off x="0" y="0"/><a:ext cx="237744" cy="237744"/></a:xfrm><a:prstGeom prst="rect"><a:avLst/></a:prstGeom></pic:spPr></pic:pic></a:graphicData></a:graphic></wp:inline></w:drawing></w:r></w:p><w:p><w:pPr><w:spacing w:before="0" w:after="0" w:line="220" w:lineRule="auto"/><w:jc w:val="center"/></w:pPr><w:r><w:rPr><w:rFonts w:ascii="Glegoo" w:hAnsi="Glegoo" w:cs="Glegoo"/><w:color w:val="4A4A4A"/><w:sz w:val="12"/><w:szCs w:val="12"/></w:rPr><w:t xml:space="preserve">Eier</w:t></w:r></w:p></w:tc><w:tc><w:tcPr><w:tcW w:w="576" w:type="dxa"/><w:tcMar><w:top w:w="0" w:type="dxa"/><w:bottom w:w="0" w:type="dxa"/><w:left w:w="20" w:type="dxa"/><w:right w:w="20" w:type="dxa"/></w:tcMar><w:vAlign w:val="center"/></w:tcPr><w:p><w:pPr><w:spacing w:before="0" w:after="0" w:line="240" w:lineRule="auto"/><w:jc w:val="center"/></w:pPr><w:r><w:rPr><w:noProof/></w:rPr><w:drawing><wp:inline distT="0" distB="0" distL="0" distR="0"><wp:extent cx="237744" cy="237744"/><wp:effectExtent l="0" t="0" r="0" b="0"/><wp:docPr id="3104" name="Allergen Fisch" descr="Fisch"/><wp:cNvGraphicFramePr><a:graphicFrameLocks xmlns:a="http://schemas.openxmlformats.org/drawingml/2006/main" noChangeAspect="1"/></wp:cNvGraphicFramePr><a:graphic xmlns:a="http://schemas.openxmlformats.org/drawingml/2006/main"><a:graphicData uri="http://schemas.openxmlformats.org/drawingml/2006/picture"><pic:pic xmlns:pic="http://schemas.openxmlformats.org/drawingml/2006/picture"><pic:nvPicPr><pic:cNvPr id="3104" name="allergen-fisch.png"/><pic:cNvPicPr/></pic:nvPicPr><pic:blipFill><a:blip r:embed="rIdAllergenPng4"><a:extLst><a:ext uri="{96DAC541-7B7A-43D3-8B79-37D633B846F1}"><asvg:svgBlip xmlns:asvg="http://schemas.microsoft.com/office/drawing/2016/SVG/main" r:embed="rIdAllergenSvg4"/></a:ext></a:extLst></a:blip><a:stretch><a:fillRect/></a:stretch></pic:blipFill><pic:spPr><a:xfrm><a:off x="0" y="0"/><a:ext cx="237744" cy="237744"/></a:xfrm><a:prstGeom prst="rect"><a:avLst/></a:prstGeom></pic:spPr></pic:pic></a:graphicData></a:graphic></wp:inline></w:drawing></w:r></w:p><w:p><w:pPr><w:spacing w:before="0" w:after="0" w:line="220" w:lineRule="auto"/><w:jc w:val="center"/></w:pPr><w:r><w:rPr><w:rFonts w:ascii="Glegoo" w:hAnsi="Glegoo" w:cs="Glegoo"/><w:color w:val="4A4A4A"/><w:sz w:val="12"/><w:szCs w:val="12"/></w:rPr><w:t xml:space="preserve">Fisch</w:t></w:r></w:p></w:tc><w:tc><w:tcPr><w:tcW w:w="806" w:type="dxa"/><w:tcMar><w:top w:w="0" w:type="dxa"/><w:bottom w:w="0" w:type="dxa"/><w:left w:w="20" w:type="dxa"/><w:right w:w="20" w:type="dxa"/></w:tcMar><w:vAlign w:val="center"/></w:tcPr><w:p><w:pPr><w:spacing w:before="0" w:after="0" w:line="240" w:lineRule="auto"/><w:jc w:val="center"/></w:pPr><w:r><w:rPr><w:noProof/></w:rPr><w:drawing><wp:inline distT="0" distB="0" distL="0" distR="0"><wp:extent cx="237744" cy="237744"/><wp:effectExtent l="0" t="0" r="0" b="0"/><wp:docPr id="3105" name="Allergen Krebstiere" descr="Krebstiere"/><wp:cNvGraphicFramePr><a:graphicFrameLocks xmlns:a="http://schemas.openxmlformats.org/drawingml/2006/main" noChangeAspect="1"/></wp:cNvGraphicFramePr><a:graphic xmlns:a="http://schemas.openxmlformats.org/drawingml/2006/main"><a:graphicData uri="http://schemas.openxmlformats.org/drawingml/2006/picture"><pic:pic xmlns:pic="http://schemas.openxmlformats.org/drawingml/2006/picture"><pic:nvPicPr><pic:cNvPr id="3105" name="allergen-krebstiere.png"/><pic:cNvPicPr/></pic:nvPicPr><pic:blipFill><a:blip r:embed="rIdAllergenPng5"><a:extLst><a:ext uri="{96DAC541-7B7A-43D3-8B79-37D633B846F1}"><asvg:svgBlip xmlns:asvg="http://schemas.microsoft.com/office/drawing/2016/SVG/main" r:embed="rIdAllergenSvg5"/></a:ext></a:extLst></a:blip><a:stretch><a:fillRect/></a:stretch></pic:blipFill><pic:spPr><a:xfrm><a:off x="0" y="0"/><a:ext cx="237744" cy="237744"/></a:xfrm><a:prstGeom prst="rect"><a:avLst/></a:prstGeom></pic:spPr></pic:pic></a:graphicData></a:graphic></wp:inline></w:drawing></w:r></w:p><w:p><w:pPr><w:spacing w:before="0" w:after="0" w:line="220" w:lineRule="auto"/><w:jc w:val="center"/></w:pPr><w:r><w:rPr><w:rFonts w:ascii="Glegoo" w:hAnsi="Glegoo" w:cs="Glegoo"/><w:color w:val="4A4A4A"/><w:sz w:val="12"/><w:szCs w:val="12"/></w:rPr><w:t xml:space="preserve">Krebstiere</w:t></w:r></w:p></w:tc><w:tc><w:tcPr><w:tcW w:w="826" w:type="dxa"/><w:tcMar><w:top w:w="0" w:type="dxa"/><w:bottom w:w="0" w:type="dxa"/><w:left w:w="20" w:type="dxa"/><w:right w:w="20" w:type="dxa"/></w:tcMar><w:vAlign w:val="center"/></w:tcPr><w:p><w:pPr><w:spacing w:before="0" w:after="0" w:line="240" w:lineRule="auto"/><w:jc w:val="center"/></w:pPr><w:r><w:rPr><w:noProof/></w:rPr><w:drawing><wp:inline distT="0" distB="0" distL="0" distR="0"><wp:extent cx="237744" cy="237744"/><wp:effectExtent l="0" t="0" r="0" b="0"/><wp:docPr id="3106" name="Allergen Weichtiere" descr="Weichtiere"/><wp:cNvGraphicFramePr><a:graphicFrameLocks xmlns:a="http://schemas.openxmlformats.org/drawingml/2006/main" noChangeAspect="1"/></wp:cNvGraphicFramePr><a:graphic xmlns:a="http://schemas.openxmlformats.org/drawingml/2006/main"><a:graphicData uri="http://schemas.openxmlformats.org/drawingml/2006/picture"><pic:pic xmlns:pic="http://schemas.openxmlformats.org/drawingml/2006/picture"><pic:nvPicPr><pic:cNvPr id="3106" name="allergen-weichtiere.png"/><pic:cNvPicPr/></pic:nvPicPr><pic:blipFill><a:blip r:embed="rIdAllergenPng6"><a:extLst><a:ext uri="{96DAC541-7B7A-43D3-8B79-37D633B846F1}"><asvg:svgBlip xmlns:asvg="http://schemas.microsoft.com/office/drawing/2016/SVG/main" r:embed="rIdAllergenSvg6"/></a:ext></a:extLst></a:blip><a:stretch><a:fillRect/></a:stretch></pic:blipFill><pic:spPr><a:xfrm><a:off x="0" y="0"/><a:ext cx="237744" cy="237744"/></a:xfrm><a:prstGeom prst="rect"><a:avLst/></a:prstGeom></pic:spPr></pic:pic></a:graphicData></a:graphic></wp:inline></w:drawing></w:r></w:p><w:p><w:pPr><w:spacing w:before="0" w:after="0" w:line="220" w:lineRule="auto"/><w:jc w:val="center"/></w:pPr><w:r><w:rPr><w:rFonts w:ascii="Glegoo" w:hAnsi="Glegoo" w:cs="Glegoo"/><w:color w:val="4A4A4A"/><w:sz w:val="12"/><w:szCs w:val="12"/></w:rPr><w:t xml:space="preserve">Weichtiere</w:t></w:r></w:p></w:tc><w:tc><w:tcPr><w:tcW w:w="557" w:type="dxa"/><w:tcMar><w:top w:w="0" w:type="dxa"/><w:bottom w:w="0" w:type="dxa"/><w:left w:w="20" w:type="dxa"/><w:right w:w="20" w:type="dxa"/></w:tcMar><w:vAlign w:val="center"/></w:tcPr><w:p><w:pPr><w:spacing w:before="0" w:after="0" w:line="240" w:lineRule="auto"/><w:jc w:val="center"/></w:pPr><w:r><w:rPr><w:noProof/></w:rPr><w:drawing><wp:inline distT="0" distB="0" distL="0" distR="0"><wp:extent cx="237744" cy="237744"/><wp:effectExtent l="0" t="0" r="0" b="0"/><wp:docPr id="3107" name="Allergen Senf" descr="Senf"/><wp:cNvGraphicFramePr><a:graphicFrameLocks xmlns:a="http://schemas.openxmlformats.org/drawingml/2006/main" noChangeAspect="1"/></wp:cNvGraphicFramePr><a:graphic xmlns:a="http://schemas.openxmlformats.org/drawingml/2006/main"><a:graphicData uri="http://schemas.openxmlformats.org/drawingml/2006/picture"><pic:pic xmlns:pic="http://schemas.openxmlformats.org/drawingml/2006/picture"><pic:nvPicPr><pic:cNvPr id="3107" name="allergen-senf.png"/><pic:cNvPicPr/></pic:nvPicPr><pic:blipFill><a:blip r:embed="rIdAllergenPng7"><a:extLst><a:ext uri="{96DAC541-7B7A-43D3-8B79-37D633B846F1}"><asvg:svgBlip xmlns:asvg="http://schemas.microsoft.com/office/drawing/2016/SVG/main" r:embed="rIdAllergenSvg7"/></a:ext></a:extLst></a:blip><a:stretch><a:fillRect/></a:stretch></pic:blipFill><pic:spPr><a:xfrm><a:off x="0" y="0"/><a:ext cx="237744" cy="237744"/></a:xfrm><a:prstGeom prst="rect"><a:avLst/></a:prstGeom></pic:spPr></pic:pic></a:graphicData></a:graphic></wp:inline></w:drawing></w:r></w:p><w:p><w:pPr><w:spacing w:before="0" w:after="0" w:line="220" w:lineRule="auto"/><w:jc w:val="center"/></w:pPr><w:r><w:rPr><w:rFonts w:ascii="Glegoo" w:hAnsi="Glegoo" w:cs="Glegoo"/><w:color w:val="4A4A4A"/><w:sz w:val="12"/><w:szCs w:val="12"/></w:rPr><w:t xml:space="preserve">Senf</w:t></w:r></w:p></w:tc><w:tc><w:tcPr><w:tcW w:w="1090" w:type="dxa"/><w:tcMar><w:top w:w="0" w:type="dxa"/><w:bottom w:w="0" w:type="dxa"/><w:left w:w="20" w:type="dxa"/><w:right w:w="20" w:type="dxa"/></w:tcMar><w:vAlign w:val="center"/></w:tcPr><w:p><w:pPr><w:spacing w:before="0" w:after="0" w:line="240" w:lineRule="auto"/><w:jc w:val="center"/></w:pPr><w:r><w:rPr><w:noProof/></w:rPr><w:drawing><wp:inline distT="0" distB="0" distL="0" distR="0"><wp:extent cx="237744" cy="237744"/><wp:effectExtent l="0" t="0" r="0" b="0"/><wp:docPr id="3108" name="Allergen Schalenfrüchte" descr="Schalenfrüchte"/><wp:cNvGraphicFramePr><a:graphicFrameLocks xmlns:a="http://schemas.openxmlformats.org/drawingml/2006/main" noChangeAspect="1"/></wp:cNvGraphicFramePr><a:graphic xmlns:a="http://schemas.openxmlformats.org/drawingml/2006/main"><a:graphicData uri="http://schemas.openxmlformats.org/drawingml/2006/picture"><pic:pic xmlns:pic="http://schemas.openxmlformats.org/drawingml/2006/picture"><pic:nvPicPr><pic:cNvPr id="3108" name="allergen-schalenfruechte.png"/><pic:cNvPicPr/></pic:nvPicPr><pic:blipFill><a:blip r:embed="rIdAllergenPng8"><a:extLst><a:ext uri="{96DAC541-7B7A-43D3-8B79-37D633B846F1}"><asvg:svgBlip xmlns:asvg="http://schemas.microsoft.com/office/drawing/2016/SVG/main" r:embed="rIdAllergenSvg8"/></a:ext></a:extLst></a:blip><a:stretch><a:fillRect/></a:stretch></pic:blipFill><pic:spPr><a:xfrm><a:off x="0" y="0"/><a:ext cx="237744" cy="237744"/></a:xfrm><a:prstGeom prst="rect"><a:avLst/></a:prstGeom></pic:spPr></pic:pic></a:graphicData></a:graphic></wp:inline></w:drawing></w:r></w:p><w:p><w:pPr><w:spacing w:before="0" w:after="0" w:line="220" w:lineRule="auto"/><w:jc w:val="center"/></w:pPr><w:r><w:rPr><w:rFonts w:ascii="Glegoo" w:hAnsi="Glegoo" w:cs="Glegoo"/><w:color w:val="4A4A4A"/><w:sz w:val="12"/><w:szCs w:val="12"/></w:rPr><w:t xml:space="preserve">Schalenfrüchte</w:t></w:r></w:p></w:tc><w:tc><w:tcPr><w:tcW w:w="763" w:type="dxa"/><w:tcMar><w:top w:w="0" w:type="dxa"/><w:bottom w:w="0" w:type="dxa"/><w:left w:w="20" w:type="dxa"/><w:right w:w="20" w:type="dxa"/></w:tcMar><w:vAlign w:val="center"/></w:tcPr><w:p><w:pPr><w:spacing w:before="0" w:after="0" w:line="240" w:lineRule="auto"/><w:jc w:val="center"/></w:pPr><w:r><w:rPr><w:noProof/></w:rPr><w:drawing><wp:inline distT="0" distB="0" distL="0" distR="0"><wp:extent cx="237744" cy="237744"/><wp:effectExtent l="0" t="0" r="0" b="0"/><wp:docPr id="3109" name="Allergen Erdnüsse" descr="Erdnüsse"/><wp:cNvGraphicFramePr><a:graphicFrameLocks xmlns:a="http://schemas.openxmlformats.org/drawingml/2006/main" noChangeAspect="1"/></wp:cNvGraphicFramePr><a:graphic xmlns:a="http://schemas.openxmlformats.org/drawingml/2006/main"><a:graphicData uri="http://schemas.openxmlformats.org/drawingml/2006/picture"><pic:pic xmlns:pic="http://schemas.openxmlformats.org/drawingml/2006/picture"><pic:nvPicPr><pic:cNvPr id="3109" name="allergen-erdnuesse.png"/><pic:cNvPicPr/></pic:nvPicPr><pic:blipFill><a:blip r:embed="rIdAllergenPng9"><a:extLst><a:ext uri="{96DAC541-7B7A-43D3-8B79-37D633B846F1}"><asvg:svgBlip xmlns:asvg="http://schemas.microsoft.com/office/drawing/2016/SVG/main" r:embed="rIdAllergenSvg9"/></a:ext></a:extLst></a:blip><a:stretch><a:fillRect/></a:stretch></pic:blipFill><pic:spPr><a:xfrm><a:off x="0" y="0"/><a:ext cx="237744" cy="237744"/></a:xfrm><a:prstGeom prst="rect"><a:avLst/></a:prstGeom></pic:spPr></pic:pic></a:graphicData></a:graphic></wp:inline></w:drawing></w:r></w:p><w:p><w:pPr><w:spacing w:before="0" w:after="0" w:line="220" w:lineRule="auto"/><w:jc w:val="center"/></w:pPr><w:r><w:rPr><w:rFonts w:ascii="Glegoo" w:hAnsi="Glegoo" w:cs="Glegoo"/><w:color w:val="4A4A4A"/><w:sz w:val="12"/><w:szCs w:val="12"/></w:rPr><w:t xml:space="preserve">Erdnüsse</w:t></w:r></w:p></w:tc><w:tc><w:tcPr><w:tcW w:w="581" w:type="dxa"/><w:tcMar><w:top w:w="0" w:type="dxa"/><w:bottom w:w="0" w:type="dxa"/><w:left w:w="20" w:type="dxa"/><w:right w:w="20" w:type="dxa"/></w:tcMar><w:vAlign w:val="center"/></w:tcPr><w:p><w:pPr><w:spacing w:before="0" w:after="0" w:line="240" w:lineRule="auto"/><w:jc w:val="center"/></w:pPr><w:r><w:rPr><w:noProof/></w:rPr><w:drawing><wp:inline distT="0" distB="0" distL="0" distR="0"><wp:extent cx="237744" cy="237744"/><wp:effectExtent l="0" t="0" r="0" b="0"/><wp:docPr id="3110" name="Allergen Sesam" descr="Sesam"/><wp:cNvGraphicFramePr><a:graphicFrameLocks xmlns:a="http://schemas.openxmlformats.org/drawingml/2006/main" noChangeAspect="1"/></wp:cNvGraphicFramePr><a:graphic xmlns:a="http://schemas.openxmlformats.org/drawingml/2006/main"><a:graphicData uri="http://schemas.openxmlformats.org/drawingml/2006/picture"><pic:pic xmlns:pic="http://schemas.openxmlformats.org/drawingml/2006/picture"><pic:nvPicPr><pic:cNvPr id="3110" name="allergen-sesam.png"/><pic:cNvPicPr/></pic:nvPicPr><pic:blipFill><a:blip r:embed="rIdAllergenPng10"><a:extLst><a:ext uri="{96DAC541-7B7A-43D3-8B79-37D633B846F1}"><asvg:svgBlip xmlns:asvg="http://schemas.microsoft.com/office/drawing/2016/SVG/main" r:embed="rIdAllergenSvg10"/></a:ext></a:extLst></a:blip><a:stretch><a:fillRect/></a:stretch></pic:blipFill><pic:spPr><a:xfrm><a:off x="0" y="0"/><a:ext cx="237744" cy="237744"/></a:xfrm><a:prstGeom prst="rect"><a:avLst/></a:prstGeom></pic:spPr></pic:pic></a:graphicData></a:graphic></wp:inline></w:drawing></w:r></w:p><w:p><w:pPr><w:spacing w:before="0" w:after="0" w:line="220" w:lineRule="auto"/><w:jc w:val="center"/></w:pPr><w:r><w:rPr><w:rFonts w:ascii="Glegoo" w:hAnsi="Glegoo" w:cs="Glegoo"/><w:color w:val="4A4A4A"/><w:sz w:val="12"/><w:szCs w:val="12"/></w:rPr><w:t xml:space="preserve">Sesam</w:t></w:r></w:p></w:tc><w:tc><w:tcPr><w:tcW w:w="566" w:type="dxa"/><w:tcMar><w:top w:w="0" w:type="dxa"/><w:bottom w:w="0" w:type="dxa"/><w:left w:w="20" w:type="dxa"/><w:right w:w="20" w:type="dxa"/></w:tcMar><w:vAlign w:val="center"/></w:tcPr><w:p><w:pPr><w:spacing w:before="0" w:after="0" w:line="240" w:lineRule="auto"/><w:jc w:val="center"/></w:pPr><w:r><w:rPr><w:noProof/></w:rPr><w:drawing><wp:inline distT="0" distB="0" distL="0" distR="0"><wp:extent cx="237744" cy="237744"/><wp:effectExtent l="0" t="0" r="0" b="0"/><wp:docPr id="3111" name="Allergen Soja" descr="Soja"/><wp:cNvGraphicFramePr><a:graphicFrameLocks xmlns:a="http://schemas.openxmlformats.org/drawingml/2006/main" noChangeAspect="1"/></wp:cNvGraphicFramePr><a:graphic xmlns:a="http://schemas.openxmlformats.org/drawingml/2006/main"><a:graphicData uri="http://schemas.openxmlformats.org/drawingml/2006/picture"><pic:pic xmlns:pic="http://schemas.openxmlformats.org/drawingml/2006/picture"><pic:nvPicPr><pic:cNvPr id="3111" name="allergen-soja.png"/><pic:cNvPicPr/></pic:nvPicPr><pic:blipFill><a:blip r:embed="rIdAllergenPng11"><a:extLst><a:ext uri="{96DAC541-7B7A-43D3-8B79-37D633B846F1}"><asvg:svgBlip xmlns:asvg="http://schemas.microsoft.com/office/drawing/2016/SVG/main" r:embed="rIdAllergenSvg11"/></a:ext></a:extLst></a:blip><a:stretch><a:fillRect/></a:stretch></pic:blipFill><pic:spPr><a:xfrm><a:off x="0" y="0"/><a:ext cx="237744" cy="237744"/></a:xfrm><a:prstGeom prst="rect"><a:avLst/></a:prstGeom></pic:spPr></pic:pic></a:graphicData></a:graphic></wp:inline></w:drawing></w:r></w:p><w:p><w:pPr><w:spacing w:before="0" w:after="0" w:line="220" w:lineRule="auto"/><w:jc w:val="center"/></w:pPr><w:r><w:rPr><w:rFonts w:ascii="Glegoo" w:hAnsi="Glegoo" w:cs="Glegoo"/><w:color w:val="4A4A4A"/><w:sz w:val="12"/><w:szCs w:val="12"/></w:rPr><w:t xml:space="preserve">Soja</w:t></w:r></w:p></w:tc><w:tc><w:tcPr><w:tcW w:w="600" w:type="dxa"/><w:tcMar><w:top w:w="0" w:type="dxa"/><w:bottom w:w="0" w:type="dxa"/><w:left w:w="20" w:type="dxa"/><w:right w:w="20" w:type="dxa"/></w:tcMar><w:vAlign w:val="center"/></w:tcPr><w:p><w:pPr><w:spacing w:before="0" w:after="0" w:line="240" w:lineRule="auto"/><w:jc w:val="center"/></w:pPr><w:r><w:rPr><w:noProof/></w:rPr><w:drawing><wp:inline distT="0" distB="0" distL="0" distR="0"><wp:extent cx="237744" cy="237744"/><wp:effectExtent l="0" t="0" r="0" b="0"/><wp:docPr id="3112" name="Allergen Lupine" descr="Lupine"/><wp:cNvGraphicFramePr><a:graphicFrameLocks xmlns:a="http://schemas.openxmlformats.org/drawingml/2006/main" noChangeAspect="1"/></wp:cNvGraphicFramePr><a:graphic xmlns:a="http://schemas.openxmlformats.org/drawingml/2006/main"><a:graphicData uri="http://schemas.openxmlformats.org/drawingml/2006/picture"><pic:pic xmlns:pic="http://schemas.openxmlformats.org/drawingml/2006/picture"><pic:nvPicPr><pic:cNvPr id="3112" name="allergen-lupine.png"/><pic:cNvPicPr/></pic:nvPicPr><pic:blipFill><a:blip r:embed="rIdAllergenPng12"><a:extLst><a:ext uri="{96DAC541-7B7A-43D3-8B79-37D633B846F1}"><asvg:svgBlip xmlns:asvg="http://schemas.microsoft.com/office/drawing/2016/SVG/main" r:embed="rIdAllergenSvg12"/></a:ext></a:extLst></a:blip><a:stretch><a:fillRect/></a:stretch></pic:blipFill><pic:spPr><a:xfrm><a:off x="0" y="0"/><a:ext cx="237744" cy="237744"/></a:xfrm><a:prstGeom prst="rect"><a:avLst/></a:prstGeom></pic:spPr></pic:pic></a:graphicData></a:graphic></wp:inline></w:drawing></w:r></w:p><w:p><w:pPr><w:spacing w:before="0" w:after="0" w:line="220" w:lineRule="auto"/><w:jc w:val="center"/></w:pPr><w:r><w:rPr><w:rFonts w:ascii="Glegoo" w:hAnsi="Glegoo" w:cs="Glegoo"/><w:color w:val="4A4A4A"/><w:sz w:val="12"/><w:szCs w:val="12"/></w:rPr><w:t xml:space="preserve">Lupine</w:t></w:r></w:p></w:tc><w:tc><w:tcPr><w:tcW w:w="624" w:type="dxa"/><w:tcMar><w:top w:w="0" w:type="dxa"/><w:bottom w:w="0" w:type="dxa"/><w:left w:w="20" w:type="dxa"/><w:right w:w="20" w:type="dxa"/></w:tcMar><w:vAlign w:val="center"/></w:tcPr><w:p><w:pPr><w:spacing w:before="0" w:after="0" w:line="240" w:lineRule="auto"/><w:jc w:val="center"/></w:pPr><w:r><w:rPr><w:noProof/></w:rPr><w:drawing><wp:inline distT="0" distB="0" distL="0" distR="0"><wp:extent cx="237744" cy="237744"/><wp:effectExtent l="0" t="0" r="0" b="0"/><wp:docPr id="3113" name="Allergen Sellerie" descr="Sellerie"/><wp:cNvGraphicFramePr><a:graphicFrameLocks xmlns:a="http://schemas.openxmlformats.org/drawingml/2006/main" noChangeAspect="1"/></wp:cNvGraphicFramePr><a:graphic xmlns:a="http://schemas.openxmlformats.org/drawingml/2006/main"><a:graphicData uri="http://schemas.openxmlformats.org/drawingml/2006/picture"><pic:pic xmlns:pic="http://schemas.openxmlformats.org/drawingml/2006/picture"><pic:nvPicPr><pic:cNvPr id="3113" name="allergen-sellerie.png"/><pic:cNvPicPr/></pic:nvPicPr><pic:blipFill><a:blip r:embed="rIdAllergenPng13"><a:extLst><a:ext uri="{96DAC541-7B7A-43D3-8B79-37D633B846F1}"><asvg:svgBlip xmlns:asvg="http://schemas.microsoft.com/office/drawing/2016/SVG/main" r:embed="rIdAllergenSvg13"/></a:ext></a:extLst></a:blip><a:stretch><a:fillRect/></a:stretch></pic:blipFill><pic:spPr><a:xfrm><a:off x="0" y="0"/><a:ext cx="237744" cy="237744"/></a:xfrm><a:prstGeom prst="rect"><a:avLst/></a:prstGeom></pic:spPr></pic:pic></a:graphicData></a:graphic></wp:inline></w:drawing></w:r></w:p><w:p><w:pPr><w:spacing w:before="0" w:after="0" w:line="220" w:lineRule="auto"/><w:jc w:val="center"/></w:pPr><w:r><w:rPr><w:rFonts w:ascii="Glegoo" w:hAnsi="Glegoo" w:cs="Glegoo"/><w:color w:val="4A4A4A"/><w:sz w:val="12"/><w:szCs w:val="12"/></w:rPr><w:t xml:space="preserve">Sellerie</w:t></w:r></w:p></w:tc><w:tc><w:tcPr><w:tcW w:w="1435" w:type="dxa"/><w:tcMar><w:top w:w="0" w:type="dxa"/><w:bottom w:w="0" w:type="dxa"/><w:left w:w="20" w:type="dxa"/><w:right w:w="20" w:type="dxa"/></w:tcMar><w:vAlign w:val="center"/></w:tcPr><w:p><w:pPr><w:spacing w:before="0" w:after="0" w:line="240" w:lineRule="auto"/><w:jc w:val="center"/></w:pPr><w:r><w:rPr><w:noProof/></w:rPr><w:drawing><wp:inline distT="0" distB="0" distL="0" distR="0"><wp:extent cx="237744" cy="237744"/><wp:effectExtent l="0" t="0" r="0" b="0"/><wp:docPr id="3114" name="Allergen Schwefeldioxid u. Sulfite" descr="Schwefeldioxid u. Sulfite"/><wp:cNvGraphicFramePr><a:graphicFrameLocks xmlns:a="http://schemas.openxmlformats.org/drawingml/2006/main" noChangeAspect="1"/></wp:cNvGraphicFramePr><a:graphic xmlns:a="http://schemas.openxmlformats.org/drawingml/2006/main"><a:graphicData uri="http://schemas.openxmlformats.org/drawingml/2006/picture"><pic:pic xmlns:pic="http://schemas.openxmlformats.org/drawingml/2006/picture"><pic:nvPicPr><pic:cNvPr id="3114" name="allergen-sulfite.png"/><pic:cNvPicPr/></pic:nvPicPr><pic:blipFill><a:blip r:embed="rIdAllergenPng14"><a:extLst><a:ext uri="{96DAC541-7B7A-43D3-8B79-37D633B846F1}"><asvg:svgBlip xmlns:asvg="http://schemas.microsoft.com/office/drawing/2016/SVG/main" r:embed="rIdAllergenSvg14"/></a:ext></a:extLst></a:blip><a:stretch><a:fillRect/></a:stretch></pic:blipFill><pic:spPr><a:xfrm><a:off x="0" y="0"/><a:ext cx="237744" cy="237744"/></a:xfrm><a:prstGeom prst="rect"><a:avLst/></a:prstGeom></pic:spPr></pic:pic></a:graphicData></a:graphic></wp:inline></w:drawing></w:r></w:p><w:p><w:pPr><w:spacing w:before="0" w:after="0" w:line="200" w:lineRule="auto"/><w:jc w:val="center"/></w:pPr><w:r><w:rPr><w:rFonts w:ascii="Glegoo" w:hAnsi="Glegoo" w:cs="Glegoo"/><w:color w:val="4A4A4A"/><w:sz w:val="10"/><w:szCs w:val="10"/></w:rPr><w:t xml:space="preserve">Schwefeldioxid u. Sulfit &gt;10 mg/kg, ltr.</w:t></w:r></w:p></w:tc></w:tr><w:tr><w:trPr><w:cantSplit/><w:trHeight w:val="361" w:hRule="exact"/></w:trPr><w:tc><w:tcPr><w:tcW w:w="514" w:type="dxa"/><w:tcMar><w:top w:w="0" w:type="dxa"/><w:bottom w:w="0" w:type="dxa"/><w:left w:w="20" w:type="dxa"/><w:right w:w="20" w:type="dxa"/></w:tcMar><w:vAlign w:val="center"/></w:tcPr><w:p><w:pPr><w:spacing w:before="0" w:after="0" w:line="240" w:lineRule="auto"/><w:ind w:left="90"/><w:jc w:val="left"/></w:pPr><w:r><w:rPr><w:rFonts w:ascii="Glegoo" w:hAnsi="Glegoo" w:cs="Glegoo"/><w:color w:val="658C43"/><w:sz w:val="15"/><w:szCs w:val="15"/></w:rPr><w:t xml:space="preserve">Di.</w:t></w:r></w:p></w:tc><w:tc><w:tcPr><w:tcW w:w="634" w:type="dxa"/><w:tcMar><w:top w:w="0" w:type="dxa"/><w:bottom w:w="0" w:type="dxa"/><w:left w:w="20" w:type="dxa"/><w:right w:w="20" w:type="dxa"/></w:tcMar><w:vAlign w:val="center"/></w:tcPr><w:p><w:pPr><w:spacing w:before="0" w:after="0" w:line="240" w:lineRule="auto"/><w:jc w:val="center"/></w:pPr><w:r><w:rPr><w:rFonts w:ascii="Indie Flower" w:hAnsi="Indie Flower" w:cs="Indie Flower"/><w:color w:val="658C43"/><w:sz w:val="24"/><w:szCs w:val="24"/></w:rPr><w:t/></w:r></w:p></w:tc><w:tc><w:tcPr><w:tcW w:w="605" w:type="dxa"/><w:tcMar><w:top w:w="0" w:type="dxa"/><w:bottom w:w="0" w:type="dxa"/><w:left w:w="20" w:type="dxa"/><w:right w:w="20" w:type="dxa"/></w:tcMar><w:vAlign w:val="center"/></w:tcPr><w:p><w:pPr><w:spacing w:before="0" w:after="0" w:line="240" w:lineRule="auto"/><w:jc w:val="center"/></w:pPr><w:r><w:rPr><w:rFonts w:ascii="Indie Flower" w:hAnsi="Indie Flower" w:cs="Indie Flower"/><w:color w:val="658C43"/><w:sz w:val="24"/><w:szCs w:val="24"/></w:rPr><w:t/></w:r></w:p></w:tc><w:tc><w:tcPr><w:tcW w:w="590" w:type="dxa"/><w:tcMar><w:top w:w="0" w:type="dxa"/><w:bottom w:w="0" w:type="dxa"/><w:left w:w="20" w:type="dxa"/><w:right w:w="20" w:type="dxa"/></w:tcMar><w:vAlign w:val="center"/></w:tcPr><w:p><w:pPr><w:spacing w:before="0" w:after="0" w:line="240" w:lineRule="auto"/><w:jc w:val="center"/></w:pPr><w:r><w:rPr><w:rFonts w:ascii="Indie Flower" w:hAnsi="Indie Flower" w:cs="Indie Flower"/><w:color w:val="658C43"/><w:sz w:val="24"/><w:szCs w:val="24"/></w:rPr><w:t/></w:r></w:p></w:tc><w:tc><w:tcPr><w:tcW w:w="576" w:type="dxa"/><w:tcMar><w:top w:w="0" w:type="dxa"/><w:bottom w:w="0" w:type="dxa"/><w:left w:w="20" w:type="dxa"/><w:right w:w="20" w:type="dxa"/></w:tcMar><w:vAlign w:val="center"/></w:tcPr><w:p><w:pPr><w:spacing w:before="0" w:after="0" w:line="240" w:lineRule="auto"/><w:jc w:val="center"/></w:pPr><w:r><w:rPr><w:rFonts w:ascii="Indie Flower" w:hAnsi="Indie Flower" w:cs="Indie Flower"/><w:color w:val="658C43"/><w:sz w:val="24"/><w:szCs w:val="24"/></w:rPr><w:t/></w:r></w:p></w:tc><w:tc><w:tcPr><w:tcW w:w="806" w:type="dxa"/><w:tcMar><w:top w:w="0" w:type="dxa"/><w:bottom w:w="0" w:type="dxa"/><w:left w:w="20" w:type="dxa"/><w:right w:w="20" w:type="dxa"/></w:tcMar><w:vAlign w:val="center"/></w:tcPr><w:p><w:pPr><w:spacing w:before="0" w:after="0" w:line="240" w:lineRule="auto"/><w:jc w:val="center"/></w:pPr><w:r><w:rPr><w:rFonts w:ascii="Indie Flower" w:hAnsi="Indie Flower" w:cs="Indie Flower"/><w:color w:val="658C43"/><w:sz w:val="24"/><w:szCs w:val="24"/></w:rPr><w:t/></w:r></w:p></w:tc><w:tc><w:tcPr><w:tcW w:w="826" w:type="dxa"/><w:tcMar><w:top w:w="0" w:type="dxa"/><w:bottom w:w="0" w:type="dxa"/><w:left w:w="20" w:type="dxa"/><w:right w:w="20" w:type="dxa"/></w:tcMar><w:vAlign w:val="center"/></w:tcPr><w:p><w:pPr><w:spacing w:before="0" w:after="0" w:line="240" w:lineRule="auto"/><w:jc w:val="center"/></w:pPr><w:r><w:rPr><w:rFonts w:ascii="Indie Flower" w:hAnsi="Indie Flower" w:cs="Indie Flower"/><w:color w:val="658C43"/><w:sz w:val="24"/><w:szCs w:val="24"/></w:rPr><w:t/></w:r></w:p></w:tc><w:tc><w:tcPr><w:tcW w:w="557" w:type="dxa"/><w:tcMar><w:top w:w="0" w:type="dxa"/><w:bottom w:w="0" w:type="dxa"/><w:left w:w="20" w:type="dxa"/><w:right w:w="20" w:type="dxa"/></w:tcMar><w:vAlign w:val="center"/></w:tcPr><w:p><w:pPr><w:spacing w:before="0" w:after="0" w:line="240" w:lineRule="auto"/><w:jc w:val="center"/></w:pPr><w:r><w:rPr><w:rFonts w:ascii="Indie Flower" w:hAnsi="Indie Flower" w:cs="Indie Flower"/><w:color w:val="658C43"/><w:sz w:val="24"/><w:szCs w:val="24"/></w:rPr><w:t/></w:r></w:p></w:tc><w:tc><w:tcPr><w:tcW w:w="1090" w:type="dxa"/><w:tcMar><w:top w:w="0" w:type="dxa"/><w:bottom w:w="0" w:type="dxa"/><w:left w:w="20" w:type="dxa"/><w:right w:w="20" w:type="dxa"/></w:tcMar><w:vAlign w:val="center"/></w:tcPr><w:p><w:pPr><w:spacing w:before="0" w:after="0" w:line="240" w:lineRule="auto"/><w:jc w:val="center"/></w:pPr><w:r><w:rPr><w:rFonts w:ascii="Indie Flower" w:hAnsi="Indie Flower" w:cs="Indie Flower"/><w:color w:val="658C43"/><w:sz w:val="24"/><w:szCs w:val="24"/></w:rPr><w:t/></w:r></w:p></w:tc><w:tc><w:tcPr><w:tcW w:w="763" w:type="dxa"/><w:tcMar><w:top w:w="0" w:type="dxa"/><w:bottom w:w="0" w:type="dxa"/><w:left w:w="20" w:type="dxa"/><w:right w:w="20" w:type="dxa"/></w:tcMar><w:vAlign w:val="center"/></w:tcPr><w:p><w:pPr><w:spacing w:before="0" w:after="0" w:line="240" w:lineRule="auto"/><w:jc w:val="center"/></w:pPr><w:r><w:rPr><w:rFonts w:ascii="Indie Flower" w:hAnsi="Indie Flower" w:cs="Indie Flower"/><w:color w:val="658C43"/><w:sz w:val="24"/><w:szCs w:val="24"/></w:rPr><w:t/></w:r></w:p></w:tc><w:tc><w:tcPr><w:tcW w:w="581" w:type="dxa"/><w:tcMar><w:top w:w="0" w:type="dxa"/><w:bottom w:w="0" w:type="dxa"/><w:left w:w="20" w:type="dxa"/><w:right w:w="20" w:type="dxa"/></w:tcMar><w:vAlign w:val="center"/></w:tcPr><w:p><w:pPr><w:spacing w:before="0" w:after="0" w:line="240" w:lineRule="auto"/><w:jc w:val="center"/></w:pPr><w:r><w:rPr><w:rFonts w:ascii="Indie Flower" w:hAnsi="Indie Flower" w:cs="Indie Flower"/><w:color w:val="658C43"/><w:sz w:val="24"/><w:szCs w:val="24"/></w:rPr><w:t/></w:r></w:p></w:tc><w:tc><w:tcPr><w:tcW w:w="566" w:type="dxa"/><w:tcMar><w:top w:w="0" w:type="dxa"/><w:bottom w:w="0" w:type="dxa"/><w:left w:w="20" w:type="dxa"/><w:right w:w="20" w:type="dxa"/></w:tcMar><w:vAlign w:val="center"/></w:tcPr><w:p><w:pPr><w:spacing w:before="0" w:after="0" w:line="240" w:lineRule="auto"/><w:jc w:val="center"/></w:pPr><w:r><w:rPr><w:rFonts w:ascii="Indie Flower" w:hAnsi="Indie Flower" w:cs="Indie Flower"/><w:color w:val="658C43"/><w:sz w:val="24"/><w:szCs w:val="24"/></w:rPr><w:t/></w:r></w:p></w:tc><w:tc><w:tcPr><w:tcW w:w="600" w:type="dxa"/><w:tcMar><w:top w:w="0" w:type="dxa"/><w:bottom w:w="0" w:type="dxa"/><w:left w:w="20" w:type="dxa"/><w:right w:w="20" w:type="dxa"/></w:tcMar><w:vAlign w:val="center"/></w:tcPr><w:p><w:pPr><w:spacing w:before="0" w:after="0" w:line="240" w:lineRule="auto"/><w:jc w:val="center"/></w:pPr><w:r><w:rPr><w:rFonts w:ascii="Indie Flower" w:hAnsi="Indie Flower" w:cs="Indie Flower"/><w:color w:val="658C43"/><w:sz w:val="24"/><w:szCs w:val="24"/></w:rPr><w:t/></w:r></w:p></w:tc><w:tc><w:tcPr><w:tcW w:w="624" w:type="dxa"/><w:tcMar><w:top w:w="0" w:type="dxa"/><w:bottom w:w="0" w:type="dxa"/><w:left w:w="20" w:type="dxa"/><w:right w:w="20" w:type="dxa"/></w:tcMar><w:vAlign w:val="center"/></w:tcPr><w:p><w:pPr><w:spacing w:before="0" w:after="0" w:line="240" w:lineRule="auto"/><w:jc w:val="center"/></w:pPr><w:r><w:rPr><w:rFonts w:ascii="Indie Flower" w:hAnsi="Indie Flower" w:cs="Indie Flower"/><w:color w:val="658C43"/><w:sz w:val="24"/><w:szCs w:val="24"/></w:rPr><w:t/></w:r></w:p></w:tc><w:tc><w:tcPr><w:tcW w:w="1435" w:type="dxa"/><w:tcMar><w:top w:w="0" w:type="dxa"/><w:bottom w:w="0" w:type="dxa"/><w:left w:w="20" w:type="dxa"/><w:right w:w="20" w:type="dxa"/></w:tcMar><w:vAlign w:val="center"/></w:tcPr><w:p><w:pPr><w:spacing w:before="0" w:after="0" w:line="240" w:lineRule="auto"/><w:jc w:val="center"/></w:pPr><w:r><w:rPr><w:rFonts w:ascii="Indie Flower" w:hAnsi="Indie Flower" w:cs="Indie Flower"/><w:color w:val="658C43"/><w:sz w:val="24"/><w:szCs w:val="24"/></w:rPr><w:t/></w:r></w:p></w:tc></w:tr><w:tr><w:trPr><w:cantSplit/><w:trHeight w:val="361" w:hRule="exact"/></w:trPr><w:tc><w:tcPr><w:tcW w:w="514" w:type="dxa"/><w:tcMar><w:top w:w="0" w:type="dxa"/><w:bottom w:w="0" w:type="dxa"/><w:left w:w="20" w:type="dxa"/><w:right w:w="20" w:type="dxa"/></w:tcMar><w:vAlign w:val="center"/></w:tcPr><w:p><w:pPr><w:spacing w:before="0" w:after="0" w:line="240" w:lineRule="auto"/><w:ind w:left="90"/><w:jc w:val="left"/></w:pPr><w:r><w:rPr><w:rFonts w:ascii="Glegoo" w:hAnsi="Glegoo" w:cs="Glegoo"/><w:color w:val="658C43"/><w:sz w:val="15"/><w:szCs w:val="15"/></w:rPr><w:t xml:space="preserve">Mi.</w:t></w:r></w:p></w:tc><w:tc><w:tcPr><w:tcW w:w="634" w:type="dxa"/><w:tcMar><w:top w:w="0" w:type="dxa"/><w:bottom w:w="0" w:type="dxa"/><w:left w:w="20" w:type="dxa"/><w:right w:w="20" w:type="dxa"/></w:tcMar><w:vAlign w:val="center"/></w:tcPr><w:p><w:pPr><w:spacing w:before="0" w:after="0" w:line="240" w:lineRule="auto"/><w:jc w:val="center"/></w:pPr><w:r><w:rPr><w:rFonts w:ascii="Indie Flower" w:hAnsi="Indie Flower" w:cs="Indie Flower"/><w:color w:val="658C43"/><w:sz w:val="24"/><w:szCs w:val="24"/></w:rPr><w:t xml:space="preserve">x</w:t></w:r></w:p></w:tc><w:tc><w:tcPr><w:tcW w:w="605" w:type="dxa"/><w:tcMar><w:top w:w="0" w:type="dxa"/><w:bottom w:w="0" w:type="dxa"/><w:left w:w="20" w:type="dxa"/><w:right w:w="20" w:type="dxa"/></w:tcMar><w:vAlign w:val="center"/></w:tcPr><w:p><w:pPr><w:spacing w:before="0" w:after="0" w:line="240" w:lineRule="auto"/><w:jc w:val="center"/></w:pPr><w:r><w:rPr><w:rFonts w:ascii="Indie Flower" w:hAnsi="Indie Flower" w:cs="Indie Flower"/><w:color w:val="658C43"/><w:sz w:val="24"/><w:szCs w:val="24"/></w:rPr><w:t xml:space="preserve">x</w:t></w:r></w:p></w:tc><w:tc><w:tcPr><w:tcW w:w="590" w:type="dxa"/><w:tcMar><w:top w:w="0" w:type="dxa"/><w:bottom w:w="0" w:type="dxa"/><w:left w:w="20" w:type="dxa"/><w:right w:w="20" w:type="dxa"/></w:tcMar><w:vAlign w:val="center"/></w:tcPr><w:p><w:pPr><w:spacing w:before="0" w:after="0" w:line="240" w:lineRule="auto"/><w:jc w:val="center"/></w:pPr><w:r><w:rPr><w:rFonts w:ascii="Indie Flower" w:hAnsi="Indie Flower" w:cs="Indie Flower"/><w:color w:val="658C43"/><w:sz w:val="24"/><w:szCs w:val="24"/></w:rPr><w:t xml:space="preserve">x</w:t></w:r></w:p></w:tc><w:tc><w:tcPr><w:tcW w:w="576" w:type="dxa"/><w:tcMar><w:top w:w="0" w:type="dxa"/><w:bottom w:w="0" w:type="dxa"/><w:left w:w="20" w:type="dxa"/><w:right w:w="20" w:type="dxa"/></w:tcMar><w:vAlign w:val="center"/></w:tcPr><w:p><w:pPr><w:spacing w:before="0" w:after="0" w:line="240" w:lineRule="auto"/><w:jc w:val="center"/></w:pPr><w:r><w:rPr><w:rFonts w:ascii="Indie Flower" w:hAnsi="Indie Flower" w:cs="Indie Flower"/><w:color w:val="658C43"/><w:sz w:val="24"/><w:szCs w:val="24"/></w:rPr><w:t/></w:r></w:p></w:tc><w:tc><w:tcPr><w:tcW w:w="806" w:type="dxa"/><w:tcMar><w:top w:w="0" w:type="dxa"/><w:bottom w:w="0" w:type="dxa"/><w:left w:w="20" w:type="dxa"/><w:right w:w="20" w:type="dxa"/></w:tcMar><w:vAlign w:val="center"/></w:tcPr><w:p><w:pPr><w:spacing w:before="0" w:after="0" w:line="240" w:lineRule="auto"/><w:jc w:val="center"/></w:pPr><w:r><w:rPr><w:rFonts w:ascii="Indie Flower" w:hAnsi="Indie Flower" w:cs="Indie Flower"/><w:color w:val="658C43"/><w:sz w:val="24"/><w:szCs w:val="24"/></w:rPr><w:t/></w:r></w:p></w:tc><w:tc><w:tcPr><w:tcW w:w="826" w:type="dxa"/><w:tcMar><w:top w:w="0" w:type="dxa"/><w:bottom w:w="0" w:type="dxa"/><w:left w:w="20" w:type="dxa"/><w:right w:w="20" w:type="dxa"/></w:tcMar><w:vAlign w:val="center"/></w:tcPr><w:p><w:pPr><w:spacing w:before="0" w:after="0" w:line="240" w:lineRule="auto"/><w:jc w:val="center"/></w:pPr><w:r><w:rPr><w:rFonts w:ascii="Indie Flower" w:hAnsi="Indie Flower" w:cs="Indie Flower"/><w:color w:val="658C43"/><w:sz w:val="24"/><w:szCs w:val="24"/></w:rPr><w:t/></w:r></w:p></w:tc><w:tc><w:tcPr><w:tcW w:w="557" w:type="dxa"/><w:tcMar><w:top w:w="0" w:type="dxa"/><w:bottom w:w="0" w:type="dxa"/><w:left w:w="20" w:type="dxa"/><w:right w:w="20" w:type="dxa"/></w:tcMar><w:vAlign w:val="center"/></w:tcPr><w:p><w:pPr><w:spacing w:before="0" w:after="0" w:line="240" w:lineRule="auto"/><w:jc w:val="center"/></w:pPr><w:r><w:rPr><w:rFonts w:ascii="Indie Flower" w:hAnsi="Indie Flower" w:cs="Indie Flower"/><w:color w:val="658C43"/><w:sz w:val="24"/><w:szCs w:val="24"/></w:rPr><w:t xml:space="preserve">x</w:t></w:r></w:p></w:tc><w:tc><w:tcPr><w:tcW w:w="1090" w:type="dxa"/><w:tcMar><w:top w:w="0" w:type="dxa"/><w:bottom w:w="0" w:type="dxa"/><w:left w:w="20" w:type="dxa"/><w:right w:w="20" w:type="dxa"/></w:tcMar><w:vAlign w:val="center"/></w:tcPr><w:p><w:pPr><w:spacing w:before="0" w:after="0" w:line="240" w:lineRule="auto"/><w:jc w:val="center"/></w:pPr><w:r><w:rPr><w:rFonts w:ascii="Indie Flower" w:hAnsi="Indie Flower" w:cs="Indie Flower"/><w:color w:val="658C43"/><w:sz w:val="24"/><w:szCs w:val="24"/></w:rPr><w:t/></w:r></w:p></w:tc><w:tc><w:tcPr><w:tcW w:w="763" w:type="dxa"/><w:tcMar><w:top w:w="0" w:type="dxa"/><w:bottom w:w="0" w:type="dxa"/><w:left w:w="20" w:type="dxa"/><w:right w:w="20" w:type="dxa"/></w:tcMar><w:vAlign w:val="center"/></w:tcPr><w:p><w:pPr><w:spacing w:before="0" w:after="0" w:line="240" w:lineRule="auto"/><w:jc w:val="center"/></w:pPr><w:r><w:rPr><w:rFonts w:ascii="Indie Flower" w:hAnsi="Indie Flower" w:cs="Indie Flower"/><w:color w:val="658C43"/><w:sz w:val="24"/><w:szCs w:val="24"/></w:rPr><w:t/></w:r></w:p></w:tc><w:tc><w:tcPr><w:tcW w:w="581" w:type="dxa"/><w:tcMar><w:top w:w="0" w:type="dxa"/><w:bottom w:w="0" w:type="dxa"/><w:left w:w="20" w:type="dxa"/><w:right w:w="20" w:type="dxa"/></w:tcMar><w:vAlign w:val="center"/></w:tcPr><w:p><w:pPr><w:spacing w:before="0" w:after="0" w:line="240" w:lineRule="auto"/><w:jc w:val="center"/></w:pPr><w:r><w:rPr><w:rFonts w:ascii="Indie Flower" w:hAnsi="Indie Flower" w:cs="Indie Flower"/><w:color w:val="658C43"/><w:sz w:val="24"/><w:szCs w:val="24"/></w:rPr><w:t/></w:r></w:p></w:tc><w:tc><w:tcPr><w:tcW w:w="566" w:type="dxa"/><w:tcMar><w:top w:w="0" w:type="dxa"/><w:bottom w:w="0" w:type="dxa"/><w:left w:w="20" w:type="dxa"/><w:right w:w="20" w:type="dxa"/></w:tcMar><w:vAlign w:val="center"/></w:tcPr><w:p><w:pPr><w:spacing w:before="0" w:after="0" w:line="240" w:lineRule="auto"/><w:jc w:val="center"/></w:pPr><w:r><w:rPr><w:rFonts w:ascii="Indie Flower" w:hAnsi="Indie Flower" w:cs="Indie Flower"/><w:color w:val="658C43"/><w:sz w:val="24"/><w:szCs w:val="24"/></w:rPr><w:t/></w:r></w:p></w:tc><w:tc><w:tcPr><w:tcW w:w="600" w:type="dxa"/><w:tcMar><w:top w:w="0" w:type="dxa"/><w:bottom w:w="0" w:type="dxa"/><w:left w:w="20" w:type="dxa"/><w:right w:w="20" w:type="dxa"/></w:tcMar><w:vAlign w:val="center"/></w:tcPr><w:p><w:pPr><w:spacing w:before="0" w:after="0" w:line="240" w:lineRule="auto"/><w:jc w:val="center"/></w:pPr><w:r><w:rPr><w:rFonts w:ascii="Indie Flower" w:hAnsi="Indie Flower" w:cs="Indie Flower"/><w:color w:val="658C43"/><w:sz w:val="24"/><w:szCs w:val="24"/></w:rPr><w:t/></w:r></w:p></w:tc><w:tc><w:tcPr><w:tcW w:w="624" w:type="dxa"/><w:tcMar><w:top w:w="0" w:type="dxa"/><w:bottom w:w="0" w:type="dxa"/><w:left w:w="20" w:type="dxa"/><w:right w:w="20" w:type="dxa"/></w:tcMar><w:vAlign w:val="center"/></w:tcPr><w:p><w:pPr><w:spacing w:before="0" w:after="0" w:line="240" w:lineRule="auto"/><w:jc w:val="center"/></w:pPr><w:r><w:rPr><w:rFonts w:ascii="Indie Flower" w:hAnsi="Indie Flower" w:cs="Indie Flower"/><w:color w:val="658C43"/><w:sz w:val="24"/><w:szCs w:val="24"/></w:rPr><w:t xml:space="preserve">x</w:t></w:r></w:p></w:tc><w:tc><w:tcPr><w:tcW w:w="1435" w:type="dxa"/><w:tcMar><w:top w:w="0" w:type="dxa"/><w:bottom w:w="0" w:type="dxa"/><w:left w:w="20" w:type="dxa"/><w:right w:w="20" w:type="dxa"/></w:tcMar><w:vAlign w:val="center"/></w:tcPr><w:p><w:pPr><w:spacing w:before="0" w:after="0" w:line="240" w:lineRule="auto"/><w:jc w:val="center"/></w:pPr><w:r><w:rPr><w:rFonts w:ascii="Indie Flower" w:hAnsi="Indie Flower" w:cs="Indie Flower"/><w:color w:val="658C43"/><w:sz w:val="24"/><w:szCs w:val="24"/></w:rPr><w:t/></w:r></w:p></w:tc></w:tr><w:tr><w:trPr><w:cantSplit/><w:trHeight w:val="361" w:hRule="exact"/></w:trPr><w:tc><w:tcPr><w:tcW w:w="514" w:type="dxa"/><w:tcMar><w:top w:w="0" w:type="dxa"/><w:bottom w:w="0" w:type="dxa"/><w:left w:w="20" w:type="dxa"/><w:right w:w="20" w:type="dxa"/></w:tcMar><w:vAlign w:val="center"/></w:tcPr><w:p><w:pPr><w:spacing w:before="0" w:after="0" w:line="240" w:lineRule="auto"/><w:ind w:left="90"/><w:jc w:val="left"/></w:pPr><w:r><w:rPr><w:rFonts w:ascii="Glegoo" w:hAnsi="Glegoo" w:cs="Glegoo"/><w:color w:val="658C43"/><w:sz w:val="15"/><w:szCs w:val="15"/></w:rPr><w:t xml:space="preserve">Do.</w:t></w:r></w:p></w:tc><w:tc><w:tcPr><w:tcW w:w="634" w:type="dxa"/><w:tcMar><w:top w:w="0" w:type="dxa"/><w:bottom w:w="0" w:type="dxa"/><w:left w:w="20" w:type="dxa"/><w:right w:w="20" w:type="dxa"/></w:tcMar><w:vAlign w:val="center"/></w:tcPr><w:p><w:pPr><w:spacing w:before="0" w:after="0" w:line="240" w:lineRule="auto"/><w:jc w:val="center"/></w:pPr><w:r><w:rPr><w:rFonts w:ascii="Indie Flower" w:hAnsi="Indie Flower" w:cs="Indie Flower"/><w:color w:val="658C43"/><w:sz w:val="24"/><w:szCs w:val="24"/></w:rPr><w:t xml:space="preserve">x</w:t></w:r></w:p></w:tc><w:tc><w:tcPr><w:tcW w:w="605" w:type="dxa"/><w:tcMar><w:top w:w="0" w:type="dxa"/><w:bottom w:w="0" w:type="dxa"/><w:left w:w="20" w:type="dxa"/><w:right w:w="20" w:type="dxa"/></w:tcMar><w:vAlign w:val="center"/></w:tcPr><w:p><w:pPr><w:spacing w:before="0" w:after="0" w:line="240" w:lineRule="auto"/><w:jc w:val="center"/></w:pPr><w:r><w:rPr><w:rFonts w:ascii="Indie Flower" w:hAnsi="Indie Flower" w:cs="Indie Flower"/><w:color w:val="658C43"/><w:sz w:val="24"/><w:szCs w:val="24"/></w:rPr><w:t xml:space="preserve">x</w:t></w:r></w:p></w:tc><w:tc><w:tcPr><w:tcW w:w="590" w:type="dxa"/><w:tcMar><w:top w:w="0" w:type="dxa"/><w:bottom w:w="0" w:type="dxa"/><w:left w:w="20" w:type="dxa"/><w:right w:w="20" w:type="dxa"/></w:tcMar><w:vAlign w:val="center"/></w:tcPr><w:p><w:pPr><w:spacing w:before="0" w:after="0" w:line="240" w:lineRule="auto"/><w:jc w:val="center"/></w:pPr><w:r><w:rPr><w:rFonts w:ascii="Indie Flower" w:hAnsi="Indie Flower" w:cs="Indie Flower"/><w:color w:val="658C43"/><w:sz w:val="24"/><w:szCs w:val="24"/></w:rPr><w:t xml:space="preserve">x</w:t></w:r></w:p></w:tc><w:tc><w:tcPr><w:tcW w:w="576" w:type="dxa"/><w:tcMar><w:top w:w="0" w:type="dxa"/><w:bottom w:w="0" w:type="dxa"/><w:left w:w="20" w:type="dxa"/><w:right w:w="20" w:type="dxa"/></w:tcMar><w:vAlign w:val="center"/></w:tcPr><w:p><w:pPr><w:spacing w:before="0" w:after="0" w:line="240" w:lineRule="auto"/><w:jc w:val="center"/></w:pPr><w:r><w:rPr><w:rFonts w:ascii="Indie Flower" w:hAnsi="Indie Flower" w:cs="Indie Flower"/><w:color w:val="658C43"/><w:sz w:val="24"/><w:szCs w:val="24"/></w:rPr><w:t/></w:r></w:p></w:tc><w:tc><w:tcPr><w:tcW w:w="806" w:type="dxa"/><w:tcMar><w:top w:w="0" w:type="dxa"/><w:bottom w:w="0" w:type="dxa"/><w:left w:w="20" w:type="dxa"/><w:right w:w="20" w:type="dxa"/></w:tcMar><w:vAlign w:val="center"/></w:tcPr><w:p><w:pPr><w:spacing w:before="0" w:after="0" w:line="240" w:lineRule="auto"/><w:jc w:val="center"/></w:pPr><w:r><w:rPr><w:rFonts w:ascii="Indie Flower" w:hAnsi="Indie Flower" w:cs="Indie Flower"/><w:color w:val="658C43"/><w:sz w:val="24"/><w:szCs w:val="24"/></w:rPr><w:t/></w:r></w:p></w:tc><w:tc><w:tcPr><w:tcW w:w="826" w:type="dxa"/><w:tcMar><w:top w:w="0" w:type="dxa"/><w:bottom w:w="0" w:type="dxa"/><w:left w:w="20" w:type="dxa"/><w:right w:w="20" w:type="dxa"/></w:tcMar><w:vAlign w:val="center"/></w:tcPr><w:p><w:pPr><w:spacing w:before="0" w:after="0" w:line="240" w:lineRule="auto"/><w:jc w:val="center"/></w:pPr><w:r><w:rPr><w:rFonts w:ascii="Indie Flower" w:hAnsi="Indie Flower" w:cs="Indie Flower"/><w:color w:val="658C43"/><w:sz w:val="24"/><w:szCs w:val="24"/></w:rPr><w:t/></w:r></w:p></w:tc><w:tc><w:tcPr><w:tcW w:w="557" w:type="dxa"/><w:tcMar><w:top w:w="0" w:type="dxa"/><w:bottom w:w="0" w:type="dxa"/><w:left w:w="20" w:type="dxa"/><w:right w:w="20" w:type="dxa"/></w:tcMar><w:vAlign w:val="center"/></w:tcPr><w:p><w:pPr><w:spacing w:before="0" w:after="0" w:line="240" w:lineRule="auto"/><w:jc w:val="center"/></w:pPr><w:r><w:rPr><w:rFonts w:ascii="Indie Flower" w:hAnsi="Indie Flower" w:cs="Indie Flower"/><w:color w:val="658C43"/><w:sz w:val="24"/><w:szCs w:val="24"/></w:rPr><w:t xml:space="preserve">x</w:t></w:r></w:p></w:tc><w:tc><w:tcPr><w:tcW w:w="1090" w:type="dxa"/><w:tcMar><w:top w:w="0" w:type="dxa"/><w:bottom w:w="0" w:type="dxa"/><w:left w:w="20" w:type="dxa"/><w:right w:w="20" w:type="dxa"/></w:tcMar><w:vAlign w:val="center"/></w:tcPr><w:p><w:pPr><w:spacing w:before="0" w:after="0" w:line="240" w:lineRule="auto"/><w:jc w:val="center"/></w:pPr><w:r><w:rPr><w:rFonts w:ascii="Indie Flower" w:hAnsi="Indie Flower" w:cs="Indie Flower"/><w:color w:val="658C43"/><w:sz w:val="24"/><w:szCs w:val="24"/></w:rPr><w:t/></w:r></w:p></w:tc><w:tc><w:tcPr><w:tcW w:w="763" w:type="dxa"/><w:tcMar><w:top w:w="0" w:type="dxa"/><w:bottom w:w="0" w:type="dxa"/><w:left w:w="20" w:type="dxa"/><w:right w:w="20" w:type="dxa"/></w:tcMar><w:vAlign w:val="center"/></w:tcPr><w:p><w:pPr><w:spacing w:before="0" w:after="0" w:line="240" w:lineRule="auto"/><w:jc w:val="center"/></w:pPr><w:r><w:rPr><w:rFonts w:ascii="Indie Flower" w:hAnsi="Indie Flower" w:cs="Indie Flower"/><w:color w:val="658C43"/><w:sz w:val="24"/><w:szCs w:val="24"/></w:rPr><w:t/></w:r></w:p></w:tc><w:tc><w:tcPr><w:tcW w:w="581" w:type="dxa"/><w:tcMar><w:top w:w="0" w:type="dxa"/><w:bottom w:w="0" w:type="dxa"/><w:left w:w="20" w:type="dxa"/><w:right w:w="20" w:type="dxa"/></w:tcMar><w:vAlign w:val="center"/></w:tcPr><w:p><w:pPr><w:spacing w:before="0" w:after="0" w:line="240" w:lineRule="auto"/><w:jc w:val="center"/></w:pPr><w:r><w:rPr><w:rFonts w:ascii="Indie Flower" w:hAnsi="Indie Flower" w:cs="Indie Flower"/><w:color w:val="658C43"/><w:sz w:val="24"/><w:szCs w:val="24"/></w:rPr><w:t/></w:r></w:p></w:tc><w:tc><w:tcPr><w:tcW w:w="566" w:type="dxa"/><w:tcMar><w:top w:w="0" w:type="dxa"/><w:bottom w:w="0" w:type="dxa"/><w:left w:w="20" w:type="dxa"/><w:right w:w="20" w:type="dxa"/></w:tcMar><w:vAlign w:val="center"/></w:tcPr><w:p><w:pPr><w:spacing w:before="0" w:after="0" w:line="240" w:lineRule="auto"/><w:jc w:val="center"/></w:pPr><w:r><w:rPr><w:rFonts w:ascii="Indie Flower" w:hAnsi="Indie Flower" w:cs="Indie Flower"/><w:color w:val="658C43"/><w:sz w:val="24"/><w:szCs w:val="24"/></w:rPr><w:t/></w:r></w:p></w:tc><w:tc><w:tcPr><w:tcW w:w="600" w:type="dxa"/><w:tcMar><w:top w:w="0" w:type="dxa"/><w:bottom w:w="0" w:type="dxa"/><w:left w:w="20" w:type="dxa"/><w:right w:w="20" w:type="dxa"/></w:tcMar><w:vAlign w:val="center"/></w:tcPr><w:p><w:pPr><w:spacing w:before="0" w:after="0" w:line="240" w:lineRule="auto"/><w:jc w:val="center"/></w:pPr><w:r><w:rPr><w:rFonts w:ascii="Indie Flower" w:hAnsi="Indie Flower" w:cs="Indie Flower"/><w:color w:val="658C43"/><w:sz w:val="24"/><w:szCs w:val="24"/></w:rPr><w:t/></w:r></w:p></w:tc><w:tc><w:tcPr><w:tcW w:w="624" w:type="dxa"/><w:tcMar><w:top w:w="0" w:type="dxa"/><w:bottom w:w="0" w:type="dxa"/><w:left w:w="20" w:type="dxa"/><w:right w:w="20" w:type="dxa"/></w:tcMar><w:vAlign w:val="center"/></w:tcPr><w:p><w:pPr><w:spacing w:before="0" w:after="0" w:line="240" w:lineRule="auto"/><w:jc w:val="center"/></w:pPr><w:r><w:rPr><w:rFonts w:ascii="Indie Flower" w:hAnsi="Indie Flower" w:cs="Indie Flower"/><w:color w:val="658C43"/><w:sz w:val="24"/><w:szCs w:val="24"/></w:rPr><w:t xml:space="preserve">x</w:t></w:r></w:p></w:tc><w:tc><w:tcPr><w:tcW w:w="1435" w:type="dxa"/><w:tcMar><w:top w:w="0" w:type="dxa"/><w:bottom w:w="0" w:type="dxa"/><w:left w:w="20" w:type="dxa"/><w:right w:w="20" w:type="dxa"/></w:tcMar><w:vAlign w:val="center"/></w:tcPr><w:p><w:pPr><w:spacing w:before="0" w:after="0" w:line="240" w:lineRule="auto"/><w:jc w:val="center"/></w:pPr><w:r><w:rPr><w:rFonts w:ascii="Indie Flower" w:hAnsi="Indie Flower" w:cs="Indie Flower"/><w:color w:val="658C43"/><w:sz w:val="24"/><w:szCs w:val="24"/></w:rPr><w:t/></w:r></w:p></w:tc></w:tr><w:tr><w:trPr><w:cantSplit/><w:trHeight w:val="361" w:hRule="exact"/></w:trPr><w:tc><w:tcPr><w:tcW w:w="514" w:type="dxa"/><w:tcMar><w:top w:w="0" w:type="dxa"/><w:bottom w:w="0" w:type="dxa"/><w:left w:w="20" w:type="dxa"/><w:right w:w="20" w:type="dxa"/></w:tcMar><w:vAlign w:val="center"/></w:tcPr><w:p><w:pPr><w:spacing w:before="0" w:after="0" w:line="240" w:lineRule="auto"/><w:ind w:left="90"/><w:jc w:val="left"/></w:pPr><w:r><w:rPr><w:rFonts w:ascii="Glegoo" w:hAnsi="Glegoo" w:cs="Glegoo"/><w:color w:val="658C43"/><w:sz w:val="15"/><w:szCs w:val="15"/></w:rPr><w:t xml:space="preserve">Fr.</w:t></w:r></w:p></w:tc><w:tc><w:tcPr><w:tcW w:w="634" w:type="dxa"/><w:tcMar><w:top w:w="0" w:type="dxa"/><w:bottom w:w="0" w:type="dxa"/><w:left w:w="20" w:type="dxa"/><w:right w:w="20" w:type="dxa"/></w:tcMar><w:vAlign w:val="center"/></w:tcPr><w:p><w:pPr><w:spacing w:before="0" w:after="0" w:line="240" w:lineRule="auto"/><w:jc w:val="center"/></w:pPr><w:r><w:rPr><w:rFonts w:ascii="Indie Flower" w:hAnsi="Indie Flower" w:cs="Indie Flower"/><w:color w:val="658C43"/><w:sz w:val="24"/><w:szCs w:val="24"/></w:rPr><w:t xml:space="preserve">x</w:t></w:r></w:p></w:tc><w:tc><w:tcPr><w:tcW w:w="605" w:type="dxa"/><w:tcMar><w:top w:w="0" w:type="dxa"/><w:bottom w:w="0" w:type="dxa"/><w:left w:w="20" w:type="dxa"/><w:right w:w="20" w:type="dxa"/></w:tcMar><w:vAlign w:val="center"/></w:tcPr><w:p><w:pPr><w:spacing w:before="0" w:after="0" w:line="240" w:lineRule="auto"/><w:jc w:val="center"/></w:pPr><w:r><w:rPr><w:rFonts w:ascii="Indie Flower" w:hAnsi="Indie Flower" w:cs="Indie Flower"/><w:color w:val="658C43"/><w:sz w:val="24"/><w:szCs w:val="24"/></w:rPr><w:t xml:space="preserve">x</w:t></w:r></w:p></w:tc><w:tc><w:tcPr><w:tcW w:w="590" w:type="dxa"/><w:tcMar><w:top w:w="0" w:type="dxa"/><w:bottom w:w="0" w:type="dxa"/><w:left w:w="20" w:type="dxa"/><w:right w:w="20" w:type="dxa"/></w:tcMar><w:vAlign w:val="center"/></w:tcPr><w:p><w:pPr><w:spacing w:before="0" w:after="0" w:line="240" w:lineRule="auto"/><w:jc w:val="center"/></w:pPr><w:r><w:rPr><w:rFonts w:ascii="Indie Flower" w:hAnsi="Indie Flower" w:cs="Indie Flower"/><w:color w:val="658C43"/><w:sz w:val="24"/><w:szCs w:val="24"/></w:rPr><w:t xml:space="preserve">x</w:t></w:r></w:p></w:tc><w:tc><w:tcPr><w:tcW w:w="576" w:type="dxa"/><w:tcMar><w:top w:w="0" w:type="dxa"/><w:bottom w:w="0" w:type="dxa"/><w:left w:w="20" w:type="dxa"/><w:right w:w="20" w:type="dxa"/></w:tcMar><w:vAlign w:val="center"/></w:tcPr><w:p><w:pPr><w:spacing w:before="0" w:after="0" w:line="240" w:lineRule="auto"/><w:jc w:val="center"/></w:pPr><w:r><w:rPr><w:rFonts w:ascii="Indie Flower" w:hAnsi="Indie Flower" w:cs="Indie Flower"/><w:color w:val="658C43"/><w:sz w:val="24"/><w:szCs w:val="24"/></w:rPr><w:t xml:space="preserve">x</w:t></w:r></w:p></w:tc><w:tc><w:tcPr><w:tcW w:w="806" w:type="dxa"/><w:tcMar><w:top w:w="0" w:type="dxa"/><w:bottom w:w="0" w:type="dxa"/><w:left w:w="20" w:type="dxa"/><w:right w:w="20" w:type="dxa"/></w:tcMar><w:vAlign w:val="center"/></w:tcPr><w:p><w:pPr><w:spacing w:before="0" w:after="0" w:line="240" w:lineRule="auto"/><w:jc w:val="center"/></w:pPr><w:r><w:rPr><w:rFonts w:ascii="Indie Flower" w:hAnsi="Indie Flower" w:cs="Indie Flower"/><w:color w:val="658C43"/><w:sz w:val="24"/><w:szCs w:val="24"/></w:rPr><w:t/></w:r></w:p></w:tc><w:tc><w:tcPr><w:tcW w:w="826" w:type="dxa"/><w:tcMar><w:top w:w="0" w:type="dxa"/><w:bottom w:w="0" w:type="dxa"/><w:left w:w="20" w:type="dxa"/><w:right w:w="20" w:type="dxa"/></w:tcMar><w:vAlign w:val="center"/></w:tcPr><w:p><w:pPr><w:spacing w:before="0" w:after="0" w:line="240" w:lineRule="auto"/><w:jc w:val="center"/></w:pPr><w:r><w:rPr><w:rFonts w:ascii="Indie Flower" w:hAnsi="Indie Flower" w:cs="Indie Flower"/><w:color w:val="658C43"/><w:sz w:val="24"/><w:szCs w:val="24"/></w:rPr><w:t/></w:r></w:p></w:tc><w:tc><w:tcPr><w:tcW w:w="557" w:type="dxa"/><w:tcMar><w:top w:w="0" w:type="dxa"/><w:bottom w:w="0" w:type="dxa"/><w:left w:w="20" w:type="dxa"/><w:right w:w="20" w:type="dxa"/></w:tcMar><w:vAlign w:val="center"/></w:tcPr><w:p><w:pPr><w:spacing w:before="0" w:after="0" w:line="240" w:lineRule="auto"/><w:jc w:val="center"/></w:pPr><w:r><w:rPr><w:rFonts w:ascii="Indie Flower" w:hAnsi="Indie Flower" w:cs="Indie Flower"/><w:color w:val="658C43"/><w:sz w:val="24"/><w:szCs w:val="24"/></w:rPr><w:t xml:space="preserve">x</w:t></w:r></w:p></w:tc><w:tc><w:tcPr><w:tcW w:w="1090" w:type="dxa"/><w:tcMar><w:top w:w="0" w:type="dxa"/><w:bottom w:w="0" w:type="dxa"/><w:left w:w="20" w:type="dxa"/><w:right w:w="20" w:type="dxa"/></w:tcMar><w:vAlign w:val="center"/></w:tcPr><w:p><w:pPr><w:spacing w:before="0" w:after="0" w:line="240" w:lineRule="auto"/><w:jc w:val="center"/></w:pPr><w:r><w:rPr><w:rFonts w:ascii="Indie Flower" w:hAnsi="Indie Flower" w:cs="Indie Flower"/><w:color w:val="658C43"/><w:sz w:val="24"/><w:szCs w:val="24"/></w:rPr><w:t/></w:r></w:p></w:tc><w:tc><w:tcPr><w:tcW w:w="763" w:type="dxa"/><w:tcMar><w:top w:w="0" w:type="dxa"/><w:bottom w:w="0" w:type="dxa"/><w:left w:w="20" w:type="dxa"/><w:right w:w="20" w:type="dxa"/></w:tcMar><w:vAlign w:val="center"/></w:tcPr><w:p><w:pPr><w:spacing w:before="0" w:after="0" w:line="240" w:lineRule="auto"/><w:jc w:val="center"/></w:pPr><w:r><w:rPr><w:rFonts w:ascii="Indie Flower" w:hAnsi="Indie Flower" w:cs="Indie Flower"/><w:color w:val="658C43"/><w:sz w:val="24"/><w:szCs w:val="24"/></w:rPr><w:t/></w:r></w:p></w:tc><w:tc><w:tcPr><w:tcW w:w="581" w:type="dxa"/><w:tcMar><w:top w:w="0" w:type="dxa"/><w:bottom w:w="0" w:type="dxa"/><w:left w:w="20" w:type="dxa"/><w:right w:w="20" w:type="dxa"/></w:tcMar><w:vAlign w:val="center"/></w:tcPr><w:p><w:pPr><w:spacing w:before="0" w:after="0" w:line="240" w:lineRule="auto"/><w:jc w:val="center"/></w:pPr><w:r><w:rPr><w:rFonts w:ascii="Indie Flower" w:hAnsi="Indie Flower" w:cs="Indie Flower"/><w:color w:val="658C43"/><w:sz w:val="24"/><w:szCs w:val="24"/></w:rPr><w:t/></w:r></w:p></w:tc><w:tc><w:tcPr><w:tcW w:w="566" w:type="dxa"/><w:tcMar><w:top w:w="0" w:type="dxa"/><w:bottom w:w="0" w:type="dxa"/><w:left w:w="20" w:type="dxa"/><w:right w:w="20" w:type="dxa"/></w:tcMar><w:vAlign w:val="center"/></w:tcPr><w:p><w:pPr><w:spacing w:before="0" w:after="0" w:line="240" w:lineRule="auto"/><w:jc w:val="center"/></w:pPr><w:r><w:rPr><w:rFonts w:ascii="Indie Flower" w:hAnsi="Indie Flower" w:cs="Indie Flower"/><w:color w:val="658C43"/><w:sz w:val="24"/><w:szCs w:val="24"/></w:rPr><w:t/></w:r></w:p></w:tc><w:tc><w:tcPr><w:tcW w:w="600" w:type="dxa"/><w:tcMar><w:top w:w="0" w:type="dxa"/><w:bottom w:w="0" w:type="dxa"/><w:left w:w="20" w:type="dxa"/><w:right w:w="20" w:type="dxa"/></w:tcMar><w:vAlign w:val="center"/></w:tcPr><w:p><w:pPr><w:spacing w:before="0" w:after="0" w:line="240" w:lineRule="auto"/><w:jc w:val="center"/></w:pPr><w:r><w:rPr><w:rFonts w:ascii="Indie Flower" w:hAnsi="Indie Flower" w:cs="Indie Flower"/><w:color w:val="658C43"/><w:sz w:val="24"/><w:szCs w:val="24"/></w:rPr><w:t/></w:r></w:p></w:tc><w:tc><w:tcPr><w:tcW w:w="624" w:type="dxa"/><w:tcMar><w:top w:w="0" w:type="dxa"/><w:bottom w:w="0" w:type="dxa"/><w:left w:w="20" w:type="dxa"/><w:right w:w="20" w:type="dxa"/></w:tcMar><w:vAlign w:val="center"/></w:tcPr><w:p><w:pPr><w:spacing w:before="0" w:after="0" w:line="240" w:lineRule="auto"/><w:jc w:val="center"/></w:pPr><w:r><w:rPr><w:rFonts w:ascii="Indie Flower" w:hAnsi="Indie Flower" w:cs="Indie Flower"/><w:color w:val="658C43"/><w:sz w:val="24"/><w:szCs w:val="24"/></w:rPr><w:t xml:space="preserve">x</w:t></w:r></w:p></w:tc><w:tc><w:tcPr><w:tcW w:w="1435" w:type="dxa"/><w:tcMar><w:top w:w="0" w:type="dxa"/><w:bottom w:w="0" w:type="dxa"/><w:left w:w="20" w:type="dxa"/><w:right w:w="20" w:type="dxa"/></w:tcMar><w:vAlign w:val="center"/></w:tcPr><w:p><w:pPr><w:spacing w:before="0" w:after="0" w:line="240" w:lineRule="auto"/><w:jc w:val="center"/></w:pPr><w:r><w:rPr><w:rFonts w:ascii="Indie Flower" w:hAnsi="Indie Flower" w:cs="Indie Flower"/><w:color w:val="658C43"/><w:sz w:val="24"/><w:szCs w:val="24"/></w:rPr><w:t/></w:r></w:p></w:tc></w:tr></w:tbl><w:p><w:pPr><w:spacing w:before="0" w:after="0" w:line="20" w:lineRule="exact"/><w:rPr><w:sz w:val="2"/></w:rPr></w:pPr></w:p></w:txbxContent></wps:txbx><wps:bodyPr rot="0" vert="horz" wrap="square" lIns="0" tIns="0" rIns="0" bIns="0" anchor="t" anchorCtr="0"><a:noAutofit/></wps:bodyPr></wps:wsp></a:graphicData></a:graphic></wp:anchor></w:drawing></w:r></w:p><w:p><w:pPr><w:spacing w:before="0" w:after="0" w:line="220" w:lineRule="auto"/><w:jc w:val="center"/></w:pPr><w:r><w:rPr><w:rFonts w:ascii="Glegoo" w:hAnsi="Glegoo" w:cs="Glegoo"/><w:color w:val="4A4A4A"/><w:sz w:val="12"/><w:szCs w:val="12"/></w:rPr><w:t xml:space="preserve">Gluten</w:t></w:r></w:p></w:tc><w:tc><w:tcPr><w:tcW w:w="605" w:type="dxa"/><w:tcMar><w:top w:w="0" w:type="dxa"/><w:bottom w:w="0" w:type="dxa"/><w:left w:w="20" w:type="dxa"/><w:right w:w="20" w:type="dxa"/></w:tcMar><w:vAlign w:val="center"/></w:tcPr><w:p><w:pPr><w:spacing w:before="0" w:after="0" w:line="240" w:lineRule="auto"/><w:jc w:val="center"/></w:pPr><w:r><w:rPr><w:noProof/></w:rPr><w:drawing><wp:inline distT="0" distB="0" distL="0" distR="0"><wp:extent cx="237744" cy="237744"/><wp:effectExtent l="0" t="0" r="0" b="0"/><wp:docPr id="3102" name="Allergen Milch" descr="Milch"/><wp:cNvGraphicFramePr><a:graphicFrameLocks xmlns:a="http://schemas.openxmlformats.org/drawingml/2006/main" noChangeAspect="1"/></wp:cNvGraphicFramePr><a:graphic xmlns:a="http://schemas.openxmlformats.org/drawingml/2006/main"><a:graphicData uri="http://schemas.openxmlformats.org/drawingml/2006/picture"><pic:pic xmlns:pic="http://schemas.openxmlformats.org/drawingml/2006/picture"><pic:nvPicPr><pic:cNvPr id="3102" name="allergen-milch.png"/><pic:cNvPicPr/></pic:nvPicPr><pic:blipFill><a:blip r:embed="rIdAllergenPng2"><a:extLst><a:ext uri="{96DAC541-7B7A-43D3-8B79-37D633B846F1}"><asvg:svgBlip xmlns:asvg="http://schemas.microsoft.com/office/drawing/2016/SVG/main" r:embed="rIdAllergenSvg2"/></a:ext></a:extLst></a:blip><a:stretch><a:fillRect/></a:stretch></pic:blipFill><pic:spPr><a:xfrm><a:off x="0" y="0"/><a:ext cx="237744" cy="237744"/></a:xfrm><a:prstGeom prst="rect"><a:avLst/></a:prstGeom></pic:spPr></pic:pic></a:graphicData></a:graphic></wp:inline></w:drawing></w:r></w:p><w:p><w:pPr><w:spacing w:before="0" w:after="0" w:line="220" w:lineRule="auto"/><w:jc w:val="center"/></w:pPr><w:r><w:rPr><w:rFonts w:ascii="Glegoo" w:hAnsi="Glegoo" w:cs="Glegoo"/><w:color w:val="4A4A4A"/><w:sz w:val="12"/><w:szCs w:val="12"/></w:rPr><w:t xml:space="preserve">Milch</w:t></w:r></w:p></w:tc><w:tc><w:tcPr><w:tcW w:w="590" w:type="dxa"/><w:tcMar><w:top w:w="0" w:type="dxa"/><w:bottom w:w="0" w:type="dxa"/><w:left w:w="20" w:type="dxa"/><w:right w:w="20" w:type="dxa"/></w:tcMar><w:vAlign w:val="center"/></w:tcPr><w:p><w:pPr><w:spacing w:before="0" w:after="0" w:line="240" w:lineRule="auto"/><w:jc w:val="center"/></w:pPr><w:r><w:rPr><w:noProof/></w:rPr><w:drawing><wp:inline distT="0" distB="0" distL="0" distR="0"><wp:extent cx="237744" cy="237744"/><wp:effectExtent l="0" t="0" r="0" b="0"/><wp:docPr id="3103" name="Allergen Eier" descr="Eier"/><wp:cNvGraphicFramePr><a:graphicFrameLocks xmlns:a="http://schemas.openxmlformats.org/drawingml/2006/main" noChangeAspect="1"/></wp:cNvGraphicFramePr><a:graphic xmlns:a="http://schemas.openxmlformats.org/drawingml/2006/main"><a:graphicData uri="http://schemas.openxmlformats.org/drawingml/2006/picture"><pic:pic xmlns:pic="http://schemas.openxmlformats.org/drawingml/2006/picture"><pic:nvPicPr><pic:cNvPr id="3103" name="allergen-eier.png"/><pic:cNvPicPr/></pic:nvPicPr><pic:blipFill><a:blip r:embed="rIdAllergenPng3"><a:extLst><a:ext uri="{96DAC541-7B7A-43D3-8B79-37D633B846F1}"><asvg:svgBlip xmlns:asvg="http://schemas.microsoft.com/office/drawing/2016/SVG/main" r:embed="rIdAllergenSvg3"/></a:ext></a:extLst></a:blip><a:stretch><a:fillRect/></a:stretch></pic:blipFill><pic:spPr><a:xfrm><a:off x="0" y="0"/><a:ext cx="237744" cy="237744"/></a:xfrm><a:prstGeom prst="rect"><a:avLst/></a:prstGeom></pic:spPr></pic:pic></a:graphicData></a:graphic></wp:inline></w:drawing></w:r></w:p><w:p><w:pPr><w:spacing w:before="0" w:after="0" w:line="220" w:lineRule="auto"/><w:jc w:val="center"/></w:pPr><w:r><w:rPr><w:rFonts w:ascii="Glegoo" w:hAnsi="Glegoo" w:cs="Glegoo"/><w:color w:val="4A4A4A"/><w:sz w:val="12"/><w:szCs w:val="12"/></w:rPr><w:t xml:space="preserve">Eier</w:t></w:r></w:p></w:tc><w:tc><w:tcPr><w:tcW w:w="576" w:type="dxa"/><w:tcMar><w:top w:w="0" w:type="dxa"/><w:bottom w:w="0" w:type="dxa"/><w:left w:w="20" w:type="dxa"/><w:right w:w="20" w:type="dxa"/></w:tcMar><w:vAlign w:val="center"/></w:tcPr><w:p><w:pPr><w:spacing w:before="0" w:after="0" w:line="240" w:lineRule="auto"/><w:jc w:val="center"/></w:pPr><w:r><w:rPr><w:noProof/></w:rPr><w:drawing><wp:inline distT="0" distB="0" distL="0" distR="0"><wp:extent cx="237744" cy="237744"/><wp:effectExtent l="0" t="0" r="0" b="0"/><wp:docPr id="3104" name="Allergen Fisch" descr="Fisch"/><wp:cNvGraphicFramePr><a:graphicFrameLocks xmlns:a="http://schemas.openxmlformats.org/drawingml/2006/main" noChangeAspect="1"/></wp:cNvGraphicFramePr><a:graphic xmlns:a="http://schemas.openxmlformats.org/drawingml/2006/main"><a:graphicData uri="http://schemas.openxmlformats.org/drawingml/2006/picture"><pic:pic xmlns:pic="http://schemas.openxmlformats.org/drawingml/2006/picture"><pic:nvPicPr><pic:cNvPr id="3104" name="allergen-fisch.png"/><pic:cNvPicPr/></pic:nvPicPr><pic:blipFill><a:blip r:embed="rIdAllergenPng4"><a:extLst><a:ext uri="{96DAC541-7B7A-43D3-8B79-37D633B846F1}"><asvg:svgBlip xmlns:asvg="http://schemas.microsoft.com/office/drawing/2016/SVG/main" r:embed="rIdAllergenSvg4"/></a:ext></a:extLst></a:blip><a:stretch><a:fillRect/></a:stretch></pic:blipFill><pic:spPr><a:xfrm><a:off x="0" y="0"/><a:ext cx="237744" cy="237744"/></a:xfrm><a:prstGeom prst="rect"><a:avLst/></a:prstGeom></pic:spPr></pic:pic></a:graphicData></a:graphic></wp:inline></w:drawing></w:r></w:p><w:p><w:pPr><w:spacing w:before="0" w:after="0" w:line="220" w:lineRule="auto"/><w:jc w:val="center"/></w:pPr><w:r><w:rPr><w:rFonts w:ascii="Glegoo" w:hAnsi="Glegoo" w:cs="Glegoo"/><w:color w:val="4A4A4A"/><w:sz w:val="12"/><w:szCs w:val="12"/></w:rPr><w:t xml:space="preserve">Fisch</w:t></w:r></w:p></w:tc><w:tc><w:tcPr><w:tcW w:w="806" w:type="dxa"/><w:tcMar><w:top w:w="0" w:type="dxa"/><w:bottom w:w="0" w:type="dxa"/><w:left w:w="20" w:type="dxa"/><w:right w:w="20" w:type="dxa"/></w:tcMar><w:vAlign w:val="center"/></w:tcPr><w:p><w:pPr><w:spacing w:before="0" w:after="0" w:line="240" w:lineRule="auto"/><w:jc w:val="center"/></w:pPr><w:r><w:rPr><w:noProof/></w:rPr><w:drawing><wp:inline distT="0" distB="0" distL="0" distR="0"><wp:extent cx="237744" cy="237744"/><wp:effectExtent l="0" t="0" r="0" b="0"/><wp:docPr id="3105" name="Allergen Krebstiere" descr="Krebstiere"/><wp:cNvGraphicFramePr><a:graphicFrameLocks xmlns:a="http://schemas.openxmlformats.org/drawingml/2006/main" noChangeAspect="1"/></wp:cNvGraphicFramePr><a:graphic xmlns:a="http://schemas.openxmlformats.org/drawingml/2006/main"><a:graphicData uri="http://schemas.openxmlformats.org/drawingml/2006/picture"><pic:pic xmlns:pic="http://schemas.openxmlformats.org/drawingml/2006/picture"><pic:nvPicPr><pic:cNvPr id="3105" name="allergen-krebstiere.png"/><pic:cNvPicPr/></pic:nvPicPr><pic:blipFill><a:blip r:embed="rIdAllergenPng5"><a:extLst><a:ext uri="{96DAC541-7B7A-43D3-8B79-37D633B846F1}"><asvg:svgBlip xmlns:asvg="http://schemas.microsoft.com/office/drawing/2016/SVG/main" r:embed="rIdAllergenSvg5"/></a:ext></a:extLst></a:blip><a:stretch><a:fillRect/></a:stretch></pic:blipFill><pic:spPr><a:xfrm><a:off x="0" y="0"/><a:ext cx="237744" cy="237744"/></a:xfrm><a:prstGeom prst="rect"><a:avLst/></a:prstGeom></pic:spPr></pic:pic></a:graphicData></a:graphic></wp:inline></w:drawing></w:r></w:p><w:p><w:pPr><w:spacing w:before="0" w:after="0" w:line="220" w:lineRule="auto"/><w:jc w:val="center"/></w:pPr><w:r><w:rPr><w:rFonts w:ascii="Glegoo" w:hAnsi="Glegoo" w:cs="Glegoo"/><w:color w:val="4A4A4A"/><w:sz w:val="12"/><w:szCs w:val="12"/></w:rPr><w:t xml:space="preserve">Krebstiere</w:t></w:r></w:p></w:tc><w:tc><w:tcPr><w:tcW w:w="826" w:type="dxa"/><w:tcMar><w:top w:w="0" w:type="dxa"/><w:bottom w:w="0" w:type="dxa"/><w:left w:w="20" w:type="dxa"/><w:right w:w="20" w:type="dxa"/></w:tcMar><w:vAlign w:val="center"/></w:tcPr><w:p><w:pPr><w:spacing w:before="0" w:after="0" w:line="240" w:lineRule="auto"/><w:jc w:val="center"/></w:pPr><w:r><w:rPr><w:noProof/></w:rPr><w:drawing><wp:inline distT="0" distB="0" distL="0" distR="0"><wp:extent cx="237744" cy="237744"/><wp:effectExtent l="0" t="0" r="0" b="0"/><wp:docPr id="3106" name="Allergen Weichtiere" descr="Weichtiere"/><wp:cNvGraphicFramePr><a:graphicFrameLocks xmlns:a="http://schemas.openxmlformats.org/drawingml/2006/main" noChangeAspect="1"/></wp:cNvGraphicFramePr><a:graphic xmlns:a="http://schemas.openxmlformats.org/drawingml/2006/main"><a:graphicData uri="http://schemas.openxmlformats.org/drawingml/2006/picture"><pic:pic xmlns:pic="http://schemas.openxmlformats.org/drawingml/2006/picture"><pic:nvPicPr><pic:cNvPr id="3106" name="allergen-weichtiere.png"/><pic:cNvPicPr/></pic:nvPicPr><pic:blipFill><a:blip r:embed="rIdAllergenPng6"><a:extLst><a:ext uri="{96DAC541-7B7A-43D3-8B79-37D633B846F1}"><asvg:svgBlip xmlns:asvg="http://schemas.microsoft.com/office/drawing/2016/SVG/main" r:embed="rIdAllergenSvg6"/></a:ext></a:extLst></a:blip><a:stretch><a:fillRect/></a:stretch></pic:blipFill><pic:spPr><a:xfrm><a:off x="0" y="0"/><a:ext cx="237744" cy="237744"/></a:xfrm><a:prstGeom prst="rect"><a:avLst/></a:prstGeom></pic:spPr></pic:pic></a:graphicData></a:graphic></wp:inline></w:drawing></w:r></w:p><w:p><w:pPr><w:spacing w:before="0" w:after="0" w:line="220" w:lineRule="auto"/><w:jc w:val="center"/></w:pPr><w:r><w:rPr><w:rFonts w:ascii="Glegoo" w:hAnsi="Glegoo" w:cs="Glegoo"/><w:color w:val="4A4A4A"/><w:sz w:val="12"/><w:szCs w:val="12"/></w:rPr><w:t xml:space="preserve">Weichtiere</w:t></w:r></w:p></w:tc><w:tc><w:tcPr><w:tcW w:w="557" w:type="dxa"/><w:tcMar><w:top w:w="0" w:type="dxa"/><w:bottom w:w="0" w:type="dxa"/><w:left w:w="20" w:type="dxa"/><w:right w:w="20" w:type="dxa"/></w:tcMar><w:vAlign w:val="center"/></w:tcPr><w:p><w:pPr><w:spacing w:before="0" w:after="0" w:line="240" w:lineRule="auto"/><w:jc w:val="center"/></w:pPr><w:r><w:rPr><w:noProof/></w:rPr><w:drawing><wp:inline distT="0" distB="0" distL="0" distR="0"><wp:extent cx="237744" cy="237744"/><wp:effectExtent l="0" t="0" r="0" b="0"/><wp:docPr id="3107" name="Allergen Senf" descr="Senf"/><wp:cNvGraphicFramePr><a:graphicFrameLocks xmlns:a="http://schemas.openxmlformats.org/drawingml/2006/main" noChangeAspect="1"/></wp:cNvGraphicFramePr><a:graphic xmlns:a="http://schemas.openxmlformats.org/drawingml/2006/main"><a:graphicData uri="http://schemas.openxmlformats.org/drawingml/2006/picture"><pic:pic xmlns:pic="http://schemas.openxmlformats.org/drawingml/2006/picture"><pic:nvPicPr><pic:cNvPr id="3107" name="allergen-senf.png"/><pic:cNvPicPr/></pic:nvPicPr><pic:blipFill><a:blip r:embed="rIdAllergenPng7"><a:extLst><a:ext uri="{96DAC541-7B7A-43D3-8B79-37D633B846F1}"><asvg:svgBlip xmlns:asvg="http://schemas.microsoft.com/office/drawing/2016/SVG/main" r:embed="rIdAllergenSvg7"/></a:ext></a:extLst></a:blip><a:stretch><a:fillRect/></a:stretch></pic:blipFill><pic:spPr><a:xfrm><a:off x="0" y="0"/><a:ext cx="237744" cy="237744"/></a:xfrm><a:prstGeom prst="rect"><a:avLst/></a:prstGeom></pic:spPr></pic:pic></a:graphicData></a:graphic></wp:inline></w:drawing></w:r></w:p><w:p><w:pPr><w:spacing w:before="0" w:after="0" w:line="220" w:lineRule="auto"/><w:jc w:val="center"/></w:pPr><w:r><w:rPr><w:rFonts w:ascii="Glegoo" w:hAnsi="Glegoo" w:cs="Glegoo"/><w:color w:val="4A4A4A"/><w:sz w:val="12"/><w:szCs w:val="12"/></w:rPr><w:t xml:space="preserve">Senf</w:t></w:r></w:p></w:tc><w:tc><w:tcPr><w:tcW w:w="1090" w:type="dxa"/><w:tcMar><w:top w:w="0" w:type="dxa"/><w:bottom w:w="0" w:type="dxa"/><w:left w:w="20" w:type="dxa"/><w:right w:w="20" w:type="dxa"/></w:tcMar><w:vAlign w:val="center"/></w:tcPr><w:p><w:pPr><w:spacing w:before="0" w:after="0" w:line="240" w:lineRule="auto"/><w:jc w:val="center"/></w:pPr><w:r><w:rPr><w:noProof/></w:rPr><w:drawing><wp:inline distT="0" distB="0" distL="0" distR="0"><wp:extent cx="237744" cy="237744"/><wp:effectExtent l="0" t="0" r="0" b="0"/><wp:docPr id="3108" name="Allergen Schalenfrüchte" descr="Schalenfrüchte"/><wp:cNvGraphicFramePr><a:graphicFrameLocks xmlns:a="http://schemas.openxmlformats.org/drawingml/2006/main" noChangeAspect="1"/></wp:cNvGraphicFramePr><a:graphic xmlns:a="http://schemas.openxmlformats.org/drawingml/2006/main"><a:graphicData uri="http://schemas.openxmlformats.org/drawingml/2006/picture"><pic:pic xmlns:pic="http://schemas.openxmlformats.org/drawingml/2006/picture"><pic:nvPicPr><pic:cNvPr id="3108" name="allergen-schalenfruechte.png"/><pic:cNvPicPr/></pic:nvPicPr><pic:blipFill><a:blip r:embed="rIdAllergenPng8"><a:extLst><a:ext uri="{96DAC541-7B7A-43D3-8B79-37D633B846F1}"><asvg:svgBlip xmlns:asvg="http://schemas.microsoft.com/office/drawing/2016/SVG/main" r:embed="rIdAllergenSvg8"/></a:ext></a:extLst></a:blip><a:stretch><a:fillRect/></a:stretch></pic:blipFill><pic:spPr><a:xfrm><a:off x="0" y="0"/><a:ext cx="237744" cy="237744"/></a:xfrm><a:prstGeom prst="rect"><a:avLst/></a:prstGeom></pic:spPr></pic:pic></a:graphicData></a:graphic></wp:inline></w:drawing></w:r></w:p><w:p><w:pPr><w:spacing w:before="0" w:after="0" w:line="220" w:lineRule="auto"/><w:jc w:val="center"/></w:pPr><w:r><w:rPr><w:rFonts w:ascii="Glegoo" w:hAnsi="Glegoo" w:cs="Glegoo"/><w:color w:val="4A4A4A"/><w:sz w:val="12"/><w:szCs w:val="12"/></w:rPr><w:t xml:space="preserve">Schalen­früchte</w:t></w:r></w:p></w:tc><w:tc><w:tcPr><w:tcW w:w="763" w:type="dxa"/><w:tcMar><w:top w:w="0" w:type="dxa"/><w:bottom w:w="0" w:type="dxa"/><w:left w:w="20" w:type="dxa"/><w:right w:w="20" w:type="dxa"/></w:tcMar><w:vAlign w:val="center"/></w:tcPr><w:p><w:pPr><w:spacing w:before="0" w:after="0" w:line="240" w:lineRule="auto"/><w:jc w:val="center"/></w:pPr><w:r><w:rPr><w:noProof/></w:rPr><w:drawing><wp:inline distT="0" distB="0" distL="0" distR="0"><wp:extent cx="237744" cy="237744"/><wp:effectExtent l="0" t="0" r="0" b="0"/><wp:docPr id="3109" name="Allergen Erdnüsse" descr="Erdnüsse"/><wp:cNvGraphicFramePr><a:graphicFrameLocks xmlns:a="http://schemas.openxmlformats.org/drawingml/2006/main" noChangeAspect="1"/></wp:cNvGraphicFramePr><a:graphic xmlns:a="http://schemas.openxmlformats.org/drawingml/2006/main"><a:graphicData uri="http://schemas.openxmlformats.org/drawingml/2006/picture"><pic:pic xmlns:pic="http://schemas.openxmlformats.org/drawingml/2006/picture"><pic:nvPicPr><pic:cNvPr id="3109" name="allergen-erdnuesse.png"/><pic:cNvPicPr/></pic:nvPicPr><pic:blipFill><a:blip r:embed="rIdAllergenPng9"><a:extLst><a:ext uri="{96DAC541-7B7A-43D3-8B79-37D633B846F1}"><asvg:svgBlip xmlns:asvg="http://schemas.microsoft.com/office/drawing/2016/SVG/main" r:embed="rIdAllergenSvg9"/></a:ext></a:extLst></a:blip><a:stretch><a:fillRect/></a:stretch></pic:blipFill><pic:spPr><a:xfrm><a:off x="0" y="0"/><a:ext cx="237744" cy="237744"/></a:xfrm><a:prstGeom prst="rect"><a:avLst/></a:prstGeom></pic:spPr></pic:pic></a:graphicData></a:graphic></wp:inline></w:drawing></w:r></w:p><w:p><w:pPr><w:spacing w:before="0" w:after="0" w:line="220" w:lineRule="auto"/><w:jc w:val="center"/></w:pPr><w:r><w:rPr><w:rFonts w:ascii="Glegoo" w:hAnsi="Glegoo" w:cs="Glegoo"/><w:color w:val="4A4A4A"/><w:sz w:val="12"/><w:szCs w:val="12"/></w:rPr><w:t xml:space="preserve">Erdnüsse</w:t></w:r></w:p></w:tc><w:tc><w:tcPr><w:tcW w:w="581" w:type="dxa"/><w:tcMar><w:top w:w="0" w:type="dxa"/><w:bottom w:w="0" w:type="dxa"/><w:left w:w="20" w:type="dxa"/><w:right w:w="20" w:type="dxa"/></w:tcMar><w:vAlign w:val="center"/></w:tcPr><w:p><w:pPr><w:spacing w:before="0" w:after="0" w:line="240" w:lineRule="auto"/><w:jc w:val="center"/></w:pPr><w:r><w:rPr><w:noProof/></w:rPr><w:drawing><wp:inline distT="0" distB="0" distL="0" distR="0"><wp:extent cx="237744" cy="237744"/><wp:effectExtent l="0" t="0" r="0" b="0"/><wp:docPr id="3110" name="Allergen Sesam" descr="Sesam"/><wp:cNvGraphicFramePr><a:graphicFrameLocks xmlns:a="http://schemas.openxmlformats.org/drawingml/2006/main" noChangeAspect="1"/></wp:cNvGraphicFramePr><a:graphic xmlns:a="http://schemas.openxmlformats.org/drawingml/2006/main"><a:graphicData uri="http://schemas.openxmlformats.org/drawingml/2006/picture"><pic:pic xmlns:pic="http://schemas.openxmlformats.org/drawingml/2006/picture"><pic:nvPicPr><pic:cNvPr id="3110" name="allergen-sesam.png"/><pic:cNvPicPr/></pic:nvPicPr><pic:blipFill><a:blip r:embed="rIdAllergenPng10"><a:extLst><a:ext uri="{96DAC541-7B7A-43D3-8B79-37D633B846F1}"><asvg:svgBlip xmlns:asvg="http://schemas.microsoft.com/office/drawing/2016/SVG/main" r:embed="rIdAllergenSvg10"/></a:ext></a:extLst></a:blip><a:stretch><a:fillRect/></a:stretch></pic:blipFill><pic:spPr><a:xfrm><a:off x="0" y="0"/><a:ext cx="237744" cy="237744"/></a:xfrm><a:prstGeom prst="rect"><a:avLst/></a:prstGeom></pic:spPr></pic:pic></a:graphicData></a:graphic></wp:inline></w:drawing></w:r></w:p><w:p><w:pPr><w:spacing w:before="0" w:after="0" w:line="220" w:lineRule="auto"/><w:jc w:val="center"/></w:pPr><w:r><w:rPr><w:rFonts w:ascii="Glegoo" w:hAnsi="Glegoo" w:cs="Glegoo"/><w:color w:val="4A4A4A"/><w:sz w:val="12"/><w:szCs w:val="12"/></w:rPr><w:t xml:space="preserve">Sesam</w:t></w:r></w:p></w:tc><w:tc><w:tcPr><w:tcW w:w="566" w:type="dxa"/><w:tcMar><w:top w:w="0" w:type="dxa"/><w:bottom w:w="0" w:type="dxa"/><w:left w:w="20" w:type="dxa"/><w:right w:w="20" w:type="dxa"/></w:tcMar><w:vAlign w:val="center"/></w:tcPr><w:p><w:pPr><w:spacing w:before="0" w:after="0" w:line="240" w:lineRule="auto"/><w:jc w:val="center"/></w:pPr><w:r><w:rPr><w:noProof/></w:rPr><w:drawing><wp:inline distT="0" distB="0" distL="0" distR="0"><wp:extent cx="237744" cy="237744"/><wp:effectExtent l="0" t="0" r="0" b="0"/><wp:docPr id="3111" name="Allergen Soja" descr="Soja"/><wp:cNvGraphicFramePr><a:graphicFrameLocks xmlns:a="http://schemas.openxmlformats.org/drawingml/2006/main" noChangeAspect="1"/></wp:cNvGraphicFramePr><a:graphic xmlns:a="http://schemas.openxmlformats.org/drawingml/2006/main"><a:graphicData uri="http://schemas.openxmlformats.org/drawingml/2006/picture"><pic:pic xmlns:pic="http://schemas.openxmlformats.org/drawingml/2006/picture"><pic:nvPicPr><pic:cNvPr id="3111" name="allergen-soja.png"/><pic:cNvPicPr/></pic:nvPicPr><pic:blipFill><a:blip r:embed="rIdAllergenPng11"><a:extLst><a:ext uri="{96DAC541-7B7A-43D3-8B79-37D633B846F1}"><asvg:svgBlip xmlns:asvg="http://schemas.microsoft.com/office/drawing/2016/SVG/main" r:embed="rIdAllergenSvg11"/></a:ext></a:extLst></a:blip><a:stretch><a:fillRect/></a:stretch></pic:blipFill><pic:spPr><a:xfrm><a:off x="0" y="0"/><a:ext cx="237744" cy="237744"/></a:xfrm><a:prstGeom prst="rect"><a:avLst/></a:prstGeom></pic:spPr></pic:pic></a:graphicData></a:graphic></wp:inline></w:drawing></w:r></w:p><w:p><w:pPr><w:spacing w:before="0" w:after="0" w:line="220" w:lineRule="auto"/><w:jc w:val="center"/></w:pPr><w:r><w:rPr><w:rFonts w:ascii="Glegoo" w:hAnsi="Glegoo" w:cs="Glegoo"/><w:color w:val="4A4A4A"/><w:sz w:val="12"/><w:szCs w:val="12"/></w:rPr><w:t xml:space="preserve">Soja</w:t></w:r></w:p></w:tc><w:tc><w:tcPr><w:tcW w:w="600" w:type="dxa"/><w:tcMar><w:top w:w="0" w:type="dxa"/><w:bottom w:w="0" w:type="dxa"/><w:left w:w="20" w:type="dxa"/><w:right w:w="20" w:type="dxa"/></w:tcMar><w:vAlign w:val="center"/></w:tcPr><w:p><w:pPr><w:spacing w:before="0" w:after="0" w:line="240" w:lineRule="auto"/><w:jc w:val="center"/></w:pPr><w:r><w:rPr><w:noProof/></w:rPr><w:drawing><wp:inline distT="0" distB="0" distL="0" distR="0"><wp:extent cx="237744" cy="237744"/><wp:effectExtent l="0" t="0" r="0" b="0"/><wp:docPr id="3112" name="Allergen Lupine" descr="Lupine"/><wp:cNvGraphicFramePr><a:graphicFrameLocks xmlns:a="http://schemas.openxmlformats.org/drawingml/2006/main" noChangeAspect="1"/></wp:cNvGraphicFramePr><a:graphic xmlns:a="http://schemas.openxmlformats.org/drawingml/2006/main"><a:graphicData uri="http://schemas.openxmlformats.org/drawingml/2006/picture"><pic:pic xmlns:pic="http://schemas.openxmlformats.org/drawingml/2006/picture"><pic:nvPicPr><pic:cNvPr id="3112" name="allergen-lupine.png"/><pic:cNvPicPr/></pic:nvPicPr><pic:blipFill><a:blip r:embed="rIdAllergenPng12"><a:extLst><a:ext uri="{96DAC541-7B7A-43D3-8B79-37D633B846F1}"><asvg:svgBlip xmlns:asvg="http://schemas.microsoft.com/office/drawing/2016/SVG/main" r:embed="rIdAllergenSvg12"/></a:ext></a:extLst></a:blip><a:stretch><a:fillRect/></a:stretch></pic:blipFill><pic:spPr><a:xfrm><a:off x="0" y="0"/><a:ext cx="237744" cy="237744"/></a:xfrm><a:prstGeom prst="rect"><a:avLst/></a:prstGeom></pic:spPr></pic:pic></a:graphicData></a:graphic></wp:inline></w:drawing></w:r></w:p><w:p><w:pPr><w:spacing w:before="0" w:after="0" w:line="220" w:lineRule="auto"/><w:jc w:val="center"/></w:pPr><w:r><w:rPr><w:rFonts w:ascii="Glegoo" w:hAnsi="Glegoo" w:cs="Glegoo"/><w:color w:val="4A4A4A"/><w:sz w:val="12"/><w:szCs w:val="12"/></w:rPr><w:t xml:space="preserve">Lupine</w:t></w:r></w:p></w:tc><w:tc><w:tcPr><w:tcW w:w="624" w:type="dxa"/><w:tcMar><w:top w:w="0" w:type="dxa"/><w:bottom w:w="0" w:type="dxa"/><w:left w:w="20" w:type="dxa"/><w:right w:w="20" w:type="dxa"/></w:tcMar><w:vAlign w:val="center"/></w:tcPr><w:p><w:pPr><w:spacing w:before="0" w:after="0" w:line="240" w:lineRule="auto"/><w:jc w:val="center"/></w:pPr><w:r><w:rPr><w:noProof/></w:rPr><w:drawing><wp:inline distT="0" distB="0" distL="0" distR="0"><wp:extent cx="237744" cy="237744"/><wp:effectExtent l="0" t="0" r="0" b="0"/><wp:docPr id="3113" name="Allergen Sellerie" descr="Sellerie"/><wp:cNvGraphicFramePr><a:graphicFrameLocks xmlns:a="http://schemas.openxmlformats.org/drawingml/2006/main" noChangeAspect="1"/></wp:cNvGraphicFramePr><a:graphic xmlns:a="http://schemas.openxmlformats.org/drawingml/2006/main"><a:graphicData uri="http://schemas.openxmlformats.org/drawingml/2006/picture"><pic:pic xmlns:pic="http://schemas.openxmlformats.org/drawingml/2006/picture"><pic:nvPicPr><pic:cNvPr id="3113" name="allergen-sellerie.png"/><pic:cNvPicPr/></pic:nvPicPr><pic:blipFill><a:blip r:embed="rIdAllergenPng13"><a:extLst><a:ext uri="{96DAC541-7B7A-43D3-8B79-37D633B846F1}"><asvg:svgBlip xmlns:asvg="http://schemas.microsoft.com/office/drawing/2016/SVG/main" r:embed="rIdAllergenSvg13"/></a:ext></a:extLst></a:blip><a:stretch><a:fillRect/></a:stretch></pic:blipFill><pic:spPr><a:xfrm><a:off x="0" y="0"/><a:ext cx="237744" cy="237744"/></a:xfrm><a:prstGeom prst="rect"><a:avLst/></a:prstGeom></pic:spPr></pic:pic></a:graphicData></a:graphic></wp:inline></w:drawing></w:r></w:p><w:p><w:pPr><w:spacing w:before="0" w:after="0" w:line="220" w:lineRule="auto"/><w:jc w:val="center"/></w:pPr><w:r><w:rPr><w:rFonts w:ascii="Glegoo" w:hAnsi="Glegoo" w:cs="Glegoo"/><w:color w:val="4A4A4A"/><w:sz w:val="12"/><w:szCs w:val="12"/></w:rPr><w:t xml:space="preserve">Sellerie</w:t></w:r></w:p></w:tc><w:tc><w:tcPr><w:tcW w:w="1435" w:type="dxa"/><w:tcMar><w:top w:w="0" w:type="dxa"/><w:bottom w:w="0" w:type="dxa"/><w:left w:w="20" w:type="dxa"/><w:right w:w="20" w:type="dxa"/></w:tcMar><w:vAlign w:val="center"/></w:tcPr><w:p><w:pPr><w:spacing w:before="0" w:after="0" w:line="240" w:lineRule="auto"/><w:jc w:val="center"/></w:pPr><w:r><w:rPr><w:noProof/></w:rPr><w:drawing><wp:inline distT="0" distB="0" distL="0" distR="0"><wp:extent cx="237744" cy="237744"/><wp:effectExtent l="0" t="0" r="0" b="0"/><wp:docPr id="3114" name="Allergen Schwefeldioxid u. Sulfite" descr="Schwefeldioxid u. Sulfite"/><wp:cNvGraphicFramePr><a:graphicFrameLocks xmlns:a="http://schemas.openxmlformats.org/drawingml/2006/main" noChangeAspect="1"/></wp:cNvGraphicFramePr><a:graphic xmlns:a="http://schemas.openxmlformats.org/drawingml/2006/main"><a:graphicData uri="http://schemas.openxmlformats.org/drawingml/2006/picture"><pic:pic xmlns:pic="http://schemas.openxmlformats.org/drawingml/2006/picture"><pic:nvPicPr><pic:cNvPr id="3114" name="allergen-sulfite.png"/><pic:cNvPicPr/></pic:nvPicPr><pic:blipFill><a:blip r:embed="rIdAllergenPng14"><a:extLst><a:ext uri="{96DAC541-7B7A-43D3-8B79-37D633B846F1}"><asvg:svgBlip xmlns:asvg="http://schemas.microsoft.com/office/drawing/2016/SVG/main" r:embed="rIdAllergenSvg14"/></a:ext></a:extLst></a:blip><a:stretch><a:fillRect/></a:stretch></pic:blipFill><pic:spPr><a:xfrm><a:off x="0" y="0"/><a:ext cx="237744" cy="237744"/></a:xfrm><a:prstGeom prst="rect"><a:avLst/></a:prstGeom></pic:spPr></pic:pic></a:graphicData></a:graphic></wp:inline></w:drawing></w:r></w:p><w:p><w:pPr><w:spacing w:before="0" w:after="0" w:line="200" w:lineRule="auto"/><w:jc w:val="center"/></w:pPr><w:r><w:rPr><w:rFonts w:ascii="Glegoo" w:hAnsi="Glegoo" w:cs="Glegoo"/><w:color w:val="4A4A4A"/><w:sz w:val="10"/><w:szCs w:val="10"/></w:rPr><w:t xml:space="preserve">Schwefeldioxid u. Sulfit &gt;10 mg/kg, ltr.</w:t></w:r></w:p></w:tc></w:tr><w:tr><w:trPr><w:cantSplit/><w:trHeight w:val="361" w:hRule="exact"/></w:trPr><w:tc><w:tcPr><w:tcW w:w="514" w:type="dxa"/><w:tcMar><w:top w:w="0" w:type="dxa"/><w:bottom w:w="0" w:type="dxa"/><w:left w:w="20" w:type="dxa"/><w:right w:w="20" w:type="dxa"/></w:tcMar><w:vAlign w:val="center"/></w:tcPr><w:p><w:pPr><w:spacing w:before="0" w:after="0" w:line="240" w:lineRule="auto"/><w:ind w:left="90"/><w:jc w:val="left"/></w:pPr><w:r><w:rPr><w:rFonts w:ascii="Glegoo" w:hAnsi="Glegoo" w:cs="Glegoo"/><w:color w:val="658C43"/><w:sz w:val="15"/><w:szCs w:val="15"/></w:rPr><w:t xml:space="preserve">Di.</w:t></w:r></w:p></w:tc><w:tc><w:tcPr><w:tcW w:w="634" w:type="dxa"/><w:tcMar><w:top w:w="0" w:type="dxa"/><w:bottom w:w="0" w:type="dxa"/><w:left w:w="20" w:type="dxa"/><w:right w:w="20" w:type="dxa"/></w:tcMar><w:vAlign w:val="center"/></w:tcPr><w:p><w:pPr><w:spacing w:before="0" w:after="0" w:line="240" w:lineRule="auto"/><w:jc w:val="center"/></w:pPr><w:r><w:rPr><w:rFonts w:ascii="Indie Flower" w:hAnsi="Indie Flower" w:cs="Indie Flower"/><w:color w:val="658C43"/><w:sz w:val="24"/><w:szCs w:val="24"/></w:rPr><w:t/></w:r></w:p></w:tc><w:tc><w:tcPr><w:tcW w:w="605" w:type="dxa"/><w:tcMar><w:top w:w="0" w:type="dxa"/><w:bottom w:w="0" w:type="dxa"/><w:left w:w="20" w:type="dxa"/><w:right w:w="20" w:type="dxa"/></w:tcMar><w:vAlign w:val="center"/></w:tcPr><w:p><w:pPr><w:spacing w:before="0" w:after="0" w:line="240" w:lineRule="auto"/><w:jc w:val="center"/></w:pPr><w:r><w:rPr><w:rFonts w:ascii="Indie Flower" w:hAnsi="Indie Flower" w:cs="Indie Flower"/><w:color w:val="658C43"/><w:sz w:val="24"/><w:szCs w:val="24"/></w:rPr><w:t/></w:r></w:p></w:tc><w:tc><w:tcPr><w:tcW w:w="590" w:type="dxa"/><w:tcMar><w:top w:w="0" w:type="dxa"/><w:bottom w:w="0" w:type="dxa"/><w:left w:w="20" w:type="dxa"/><w:right w:w="20" w:type="dxa"/></w:tcMar><w:vAlign w:val="center"/></w:tcPr><w:p><w:pPr><w:spacing w:before="0" w:after="0" w:line="240" w:lineRule="auto"/><w:jc w:val="center"/></w:pPr><w:r><w:rPr><w:rFonts w:ascii="Indie Flower" w:hAnsi="Indie Flower" w:cs="Indie Flower"/><w:color w:val="658C43"/><w:sz w:val="24"/><w:szCs w:val="24"/></w:rPr><w:t/></w:r></w:p></w:tc><w:tc><w:tcPr><w:tcW w:w="576" w:type="dxa"/><w:tcMar><w:top w:w="0" w:type="dxa"/><w:bottom w:w="0" w:type="dxa"/><w:left w:w="20" w:type="dxa"/><w:right w:w="20" w:type="dxa"/></w:tcMar><w:vAlign w:val="center"/></w:tcPr><w:p><w:pPr><w:spacing w:before="0" w:after="0" w:line="240" w:lineRule="auto"/><w:jc w:val="center"/></w:pPr><w:r><w:rPr><w:rFonts w:ascii="Indie Flower" w:hAnsi="Indie Flower" w:cs="Indie Flower"/><w:color w:val="658C43"/><w:sz w:val="24"/><w:szCs w:val="24"/></w:rPr><w:t/></w:r></w:p></w:tc><w:tc><w:tcPr><w:tcW w:w="806" w:type="dxa"/><w:tcMar><w:top w:w="0" w:type="dxa"/><w:bottom w:w="0" w:type="dxa"/><w:left w:w="20" w:type="dxa"/><w:right w:w="20" w:type="dxa"/></w:tcMar><w:vAlign w:val="center"/></w:tcPr><w:p><w:pPr><w:spacing w:before="0" w:after="0" w:line="240" w:lineRule="auto"/><w:jc w:val="center"/></w:pPr><w:r><w:rPr><w:rFonts w:ascii="Indie Flower" w:hAnsi="Indie Flower" w:cs="Indie Flower"/><w:color w:val="658C43"/><w:sz w:val="24"/><w:szCs w:val="24"/></w:rPr><w:t/></w:r></w:p></w:tc><w:tc><w:tcPr><w:tcW w:w="826" w:type="dxa"/><w:tcMar><w:top w:w="0" w:type="dxa"/><w:bottom w:w="0" w:type="dxa"/><w:left w:w="20" w:type="dxa"/><w:right w:w="20" w:type="dxa"/></w:tcMar><w:vAlign w:val="center"/></w:tcPr><w:p><w:pPr><w:spacing w:before="0" w:after="0" w:line="240" w:lineRule="auto"/><w:jc w:val="center"/></w:pPr><w:r><w:rPr><w:rFonts w:ascii="Indie Flower" w:hAnsi="Indie Flower" w:cs="Indie Flower"/><w:color w:val="658C43"/><w:sz w:val="24"/><w:szCs w:val="24"/></w:rPr><w:t/></w:r></w:p></w:tc><w:tc><w:tcPr><w:tcW w:w="557" w:type="dxa"/><w:tcMar><w:top w:w="0" w:type="dxa"/><w:bottom w:w="0" w:type="dxa"/><w:left w:w="20" w:type="dxa"/><w:right w:w="20" w:type="dxa"/></w:tcMar><w:vAlign w:val="center"/></w:tcPr><w:p><w:pPr><w:spacing w:before="0" w:after="0" w:line="240" w:lineRule="auto"/><w:jc w:val="center"/></w:pPr><w:r><w:rPr><w:rFonts w:ascii="Indie Flower" w:hAnsi="Indie Flower" w:cs="Indie Flower"/><w:color w:val="658C43"/><w:sz w:val="24"/><w:szCs w:val="24"/></w:rPr><w:t/></w:r></w:p></w:tc><w:tc><w:tcPr><w:tcW w:w="1090" w:type="dxa"/><w:tcMar><w:top w:w="0" w:type="dxa"/><w:bottom w:w="0" w:type="dxa"/><w:left w:w="20" w:type="dxa"/><w:right w:w="20" w:type="dxa"/></w:tcMar><w:vAlign w:val="center"/></w:tcPr><w:p><w:pPr><w:spacing w:before="0" w:after="0" w:line="240" w:lineRule="auto"/><w:jc w:val="center"/></w:pPr><w:r><w:rPr><w:rFonts w:ascii="Indie Flower" w:hAnsi="Indie Flower" w:cs="Indie Flower"/><w:color w:val="658C43"/><w:sz w:val="24"/><w:szCs w:val="24"/></w:rPr><w:t/></w:r></w:p></w:tc><w:tc><w:tcPr><w:tcW w:w="763" w:type="dxa"/><w:tcMar><w:top w:w="0" w:type="dxa"/><w:bottom w:w="0" w:type="dxa"/><w:left w:w="20" w:type="dxa"/><w:right w:w="20" w:type="dxa"/></w:tcMar><w:vAlign w:val="center"/></w:tcPr><w:p><w:pPr><w:spacing w:before="0" w:after="0" w:line="240" w:lineRule="auto"/><w:jc w:val="center"/></w:pPr><w:r><w:rPr><w:rFonts w:ascii="Indie Flower" w:hAnsi="Indie Flower" w:cs="Indie Flower"/><w:color w:val="658C43"/><w:sz w:val="24"/><w:szCs w:val="24"/></w:rPr><w:t/></w:r></w:p></w:tc><w:tc><w:tcPr><w:tcW w:w="581" w:type="dxa"/><w:tcMar><w:top w:w="0" w:type="dxa"/><w:bottom w:w="0" w:type="dxa"/><w:left w:w="20" w:type="dxa"/><w:right w:w="20" w:type="dxa"/></w:tcMar><w:vAlign w:val="center"/></w:tcPr><w:p><w:pPr><w:spacing w:before="0" w:after="0" w:line="240" w:lineRule="auto"/><w:jc w:val="center"/></w:pPr><w:r><w:rPr><w:rFonts w:ascii="Indie Flower" w:hAnsi="Indie Flower" w:cs="Indie Flower"/><w:color w:val="658C43"/><w:sz w:val="24"/><w:szCs w:val="24"/></w:rPr><w:t/></w:r></w:p></w:tc><w:tc><w:tcPr><w:tcW w:w="566" w:type="dxa"/><w:tcMar><w:top w:w="0" w:type="dxa"/><w:bottom w:w="0" w:type="dxa"/><w:left w:w="20" w:type="dxa"/><w:right w:w="20" w:type="dxa"/></w:tcMar><w:vAlign w:val="center"/></w:tcPr><w:p><w:pPr><w:spacing w:before="0" w:after="0" w:line="240" w:lineRule="auto"/><w:jc w:val="center"/></w:pPr><w:r><w:rPr><w:rFonts w:ascii="Indie Flower" w:hAnsi="Indie Flower" w:cs="Indie Flower"/><w:color w:val="658C43"/><w:sz w:val="24"/><w:szCs w:val="24"/></w:rPr><w:t/></w:r></w:p></w:tc><w:tc><w:tcPr><w:tcW w:w="600" w:type="dxa"/><w:tcMar><w:top w:w="0" w:type="dxa"/><w:bottom w:w="0" w:type="dxa"/><w:left w:w="20" w:type="dxa"/><w:right w:w="20" w:type="dxa"/></w:tcMar><w:vAlign w:val="center"/></w:tcPr><w:p><w:pPr><w:spacing w:before="0" w:after="0" w:line="240" w:lineRule="auto"/><w:jc w:val="center"/></w:pPr><w:r><w:rPr><w:rFonts w:ascii="Indie Flower" w:hAnsi="Indie Flower" w:cs="Indie Flower"/><w:color w:val="658C43"/><w:sz w:val="24"/><w:szCs w:val="24"/></w:rPr><w:t/></w:r></w:p></w:tc><w:tc><w:tcPr><w:tcW w:w="624" w:type="dxa"/><w:tcMar><w:top w:w="0" w:type="dxa"/><w:bottom w:w="0" w:type="dxa"/><w:left w:w="20" w:type="dxa"/><w:right w:w="20" w:type="dxa"/></w:tcMar><w:vAlign w:val="center"/></w:tcPr><w:p><w:pPr><w:spacing w:before="0" w:after="0" w:line="240" w:lineRule="auto"/><w:jc w:val="center"/></w:pPr><w:r><w:rPr><w:rFonts w:ascii="Indie Flower" w:hAnsi="Indie Flower" w:cs="Indie Flower"/><w:color w:val="658C43"/><w:sz w:val="24"/><w:szCs w:val="24"/></w:rPr><w:t/></w:r></w:p></w:tc><w:tc><w:tcPr><w:tcW w:w="1435" w:type="dxa"/><w:tcMar><w:top w:w="0" w:type="dxa"/><w:bottom w:w="0" w:type="dxa"/><w:left w:w="20" w:type="dxa"/><w:right w:w="20" w:type="dxa"/></w:tcMar><w:vAlign w:val="center"/></w:tcPr><w:p><w:pPr><w:spacing w:before="0" w:after="0" w:line="240" w:lineRule="auto"/><w:jc w:val="center"/></w:pPr><w:r><w:rPr><w:rFonts w:ascii="Indie Flower" w:hAnsi="Indie Flower" w:cs="Indie Flower"/><w:color w:val="658C43"/><w:sz w:val="24"/><w:szCs w:val="24"/></w:rPr><w:t/></w:r></w:p></w:tc></w:tr><w:tr><w:trPr><w:cantSplit/><w:trHeight w:val="361" w:hRule="exact"/></w:trPr><w:tc><w:tcPr><w:tcW w:w="514" w:type="dxa"/><w:tcMar><w:top w:w="0" w:type="dxa"/><w:bottom w:w="0" w:type="dxa"/><w:left w:w="20" w:type="dxa"/><w:right w:w="20" w:type="dxa"/></w:tcMar><w:vAlign w:val="center"/></w:tcPr><w:p><w:pPr><w:spacing w:before="0" w:after="0" w:line="240" w:lineRule="auto"/><w:ind w:left="90"/><w:jc w:val="left"/></w:pPr><w:r><w:rPr><w:rFonts w:ascii="Glegoo" w:hAnsi="Glegoo" w:cs="Glegoo"/><w:color w:val="658C43"/><w:sz w:val="15"/><w:szCs w:val="15"/></w:rPr><w:t xml:space="preserve">Mi.</w:t></w:r></w:p></w:tc><w:tc><w:tcPr><w:tcW w:w="634" w:type="dxa"/><w:tcMar><w:top w:w="0" w:type="dxa"/><w:bottom w:w="0" w:type="dxa"/><w:left w:w="20" w:type="dxa"/><w:right w:w="20" w:type="dxa"/></w:tcMar><w:vAlign w:val="center"/></w:tcPr><w:p><w:pPr><w:spacing w:before="0" w:after="0" w:line="240" w:lineRule="auto"/><w:jc w:val="center"/></w:pPr><w:r><w:rPr><w:rFonts w:ascii="Indie Flower" w:hAnsi="Indie Flower" w:cs="Indie Flower"/><w:color w:val="658C43"/><w:sz w:val="24"/><w:szCs w:val="24"/></w:rPr><w:t xml:space="preserve">x</w:t></w:r></w:p></w:tc><w:tc><w:tcPr><w:tcW w:w="605" w:type="dxa"/><w:tcMar><w:top w:w="0" w:type="dxa"/><w:bottom w:w="0" w:type="dxa"/><w:left w:w="20" w:type="dxa"/><w:right w:w="20" w:type="dxa"/></w:tcMar><w:vAlign w:val="center"/></w:tcPr><w:p><w:pPr><w:spacing w:before="0" w:after="0" w:line="240" w:lineRule="auto"/><w:jc w:val="center"/></w:pPr><w:r><w:rPr><w:rFonts w:ascii="Indie Flower" w:hAnsi="Indie Flower" w:cs="Indie Flower"/><w:color w:val="658C43"/><w:sz w:val="24"/><w:szCs w:val="24"/></w:rPr><w:t xml:space="preserve">x</w:t></w:r></w:p></w:tc><w:tc><w:tcPr><w:tcW w:w="590" w:type="dxa"/><w:tcMar><w:top w:w="0" w:type="dxa"/><w:bottom w:w="0" w:type="dxa"/><w:left w:w="20" w:type="dxa"/><w:right w:w="20" w:type="dxa"/></w:tcMar><w:vAlign w:val="center"/></w:tcPr><w:p><w:pPr><w:spacing w:before="0" w:after="0" w:line="240" w:lineRule="auto"/><w:jc w:val="center"/></w:pPr><w:r><w:rPr><w:rFonts w:ascii="Indie Flower" w:hAnsi="Indie Flower" w:cs="Indie Flower"/><w:color w:val="658C43"/><w:sz w:val="24"/><w:szCs w:val="24"/></w:rPr><w:t xml:space="preserve">x</w:t></w:r></w:p></w:tc><w:tc><w:tcPr><w:tcW w:w="576" w:type="dxa"/><w:tcMar><w:top w:w="0" w:type="dxa"/><w:bottom w:w="0" w:type="dxa"/><w:left w:w="20" w:type="dxa"/><w:right w:w="20" w:type="dxa"/></w:tcMar><w:vAlign w:val="center"/></w:tcPr><w:p><w:pPr><w:spacing w:before="0" w:after="0" w:line="240" w:lineRule="auto"/><w:jc w:val="center"/></w:pPr><w:r><w:rPr><w:rFonts w:ascii="Indie Flower" w:hAnsi="Indie Flower" w:cs="Indie Flower"/><w:color w:val="658C43"/><w:sz w:val="24"/><w:szCs w:val="24"/></w:rPr><w:t/></w:r></w:p></w:tc><w:tc><w:tcPr><w:tcW w:w="806" w:type="dxa"/><w:tcMar><w:top w:w="0" w:type="dxa"/><w:bottom w:w="0" w:type="dxa"/><w:left w:w="20" w:type="dxa"/><w:right w:w="20" w:type="dxa"/></w:tcMar><w:vAlign w:val="center"/></w:tcPr><w:p><w:pPr><w:spacing w:before="0" w:after="0" w:line="240" w:lineRule="auto"/><w:jc w:val="center"/></w:pPr><w:r><w:rPr><w:rFonts w:ascii="Indie Flower" w:hAnsi="Indie Flower" w:cs="Indie Flower"/><w:color w:val="658C43"/><w:sz w:val="24"/><w:szCs w:val="24"/></w:rPr><w:t/></w:r></w:p></w:tc><w:tc><w:tcPr><w:tcW w:w="826" w:type="dxa"/><w:tcMar><w:top w:w="0" w:type="dxa"/><w:bottom w:w="0" w:type="dxa"/><w:left w:w="20" w:type="dxa"/><w:right w:w="20" w:type="dxa"/></w:tcMar><w:vAlign w:val="center"/></w:tcPr><w:p><w:pPr><w:spacing w:before="0" w:after="0" w:line="240" w:lineRule="auto"/><w:jc w:val="center"/></w:pPr><w:r><w:rPr><w:rFonts w:ascii="Indie Flower" w:hAnsi="Indie Flower" w:cs="Indie Flower"/><w:color w:val="658C43"/><w:sz w:val="24"/><w:szCs w:val="24"/></w:rPr><w:t/></w:r></w:p></w:tc><w:tc><w:tcPr><w:tcW w:w="557" w:type="dxa"/><w:tcMar><w:top w:w="0" w:type="dxa"/><w:bottom w:w="0" w:type="dxa"/><w:left w:w="20" w:type="dxa"/><w:right w:w="20" w:type="dxa"/></w:tcMar><w:vAlign w:val="center"/></w:tcPr><w:p><w:pPr><w:spacing w:before="0" w:after="0" w:line="240" w:lineRule="auto"/><w:jc w:val="center"/></w:pPr><w:r><w:rPr><w:rFonts w:ascii="Indie Flower" w:hAnsi="Indie Flower" w:cs="Indie Flower"/><w:color w:val="658C43"/><w:sz w:val="24"/><w:szCs w:val="24"/></w:rPr><w:t xml:space="preserve">x</w:t></w:r></w:p></w:tc><w:tc><w:tcPr><w:tcW w:w="1090" w:type="dxa"/><w:tcMar><w:top w:w="0" w:type="dxa"/><w:bottom w:w="0" w:type="dxa"/><w:left w:w="20" w:type="dxa"/><w:right w:w="20" w:type="dxa"/></w:tcMar><w:vAlign w:val="center"/></w:tcPr><w:p><w:pPr><w:spacing w:before="0" w:after="0" w:line="240" w:lineRule="auto"/><w:jc w:val="center"/></w:pPr><w:r><w:rPr><w:rFonts w:ascii="Indie Flower" w:hAnsi="Indie Flower" w:cs="Indie Flower"/><w:color w:val="658C43"/><w:sz w:val="24"/><w:szCs w:val="24"/></w:rPr><w:t/></w:r></w:p></w:tc><w:tc><w:tcPr><w:tcW w:w="763" w:type="dxa"/><w:tcMar><w:top w:w="0" w:type="dxa"/><w:bottom w:w="0" w:type="dxa"/><w:left w:w="20" w:type="dxa"/><w:right w:w="20" w:type="dxa"/></w:tcMar><w:vAlign w:val="center"/></w:tcPr><w:p><w:pPr><w:spacing w:before="0" w:after="0" w:line="240" w:lineRule="auto"/><w:jc w:val="center"/></w:pPr><w:r><w:rPr><w:rFonts w:ascii="Indie Flower" w:hAnsi="Indie Flower" w:cs="Indie Flower"/><w:color w:val="658C43"/><w:sz w:val="24"/><w:szCs w:val="24"/></w:rPr><w:t/></w:r></w:p></w:tc><w:tc><w:tcPr><w:tcW w:w="581" w:type="dxa"/><w:tcMar><w:top w:w="0" w:type="dxa"/><w:bottom w:w="0" w:type="dxa"/><w:left w:w="20" w:type="dxa"/><w:right w:w="20" w:type="dxa"/></w:tcMar><w:vAlign w:val="center"/></w:tcPr><w:p><w:pPr><w:spacing w:before="0" w:after="0" w:line="240" w:lineRule="auto"/><w:jc w:val="center"/></w:pPr><w:r><w:rPr><w:rFonts w:ascii="Indie Flower" w:hAnsi="Indie Flower" w:cs="Indie Flower"/><w:color w:val="658C43"/><w:sz w:val="24"/><w:szCs w:val="24"/></w:rPr><w:t/></w:r></w:p></w:tc><w:tc><w:tcPr><w:tcW w:w="566" w:type="dxa"/><w:tcMar><w:top w:w="0" w:type="dxa"/><w:bottom w:w="0" w:type="dxa"/><w:left w:w="20" w:type="dxa"/><w:right w:w="20" w:type="dxa"/></w:tcMar><w:vAlign w:val="center"/></w:tcPr><w:p><w:pPr><w:spacing w:before="0" w:after="0" w:line="240" w:lineRule="auto"/><w:jc w:val="center"/></w:pPr><w:r><w:rPr><w:rFonts w:ascii="Indie Flower" w:hAnsi="Indie Flower" w:cs="Indie Flower"/><w:color w:val="658C43"/><w:sz w:val="24"/><w:szCs w:val="24"/></w:rPr><w:t/></w:r></w:p></w:tc><w:tc><w:tcPr><w:tcW w:w="600" w:type="dxa"/><w:tcMar><w:top w:w="0" w:type="dxa"/><w:bottom w:w="0" w:type="dxa"/><w:left w:w="20" w:type="dxa"/><w:right w:w="20" w:type="dxa"/></w:tcMar><w:vAlign w:val="center"/></w:tcPr><w:p><w:pPr><w:spacing w:before="0" w:after="0" w:line="240" w:lineRule="auto"/><w:jc w:val="center"/></w:pPr><w:r><w:rPr><w:rFonts w:ascii="Indie Flower" w:hAnsi="Indie Flower" w:cs="Indie Flower"/><w:color w:val="658C43"/><w:sz w:val="24"/><w:szCs w:val="24"/></w:rPr><w:t/></w:r></w:p></w:tc><w:tc><w:tcPr><w:tcW w:w="624" w:type="dxa"/><w:tcMar><w:top w:w="0" w:type="dxa"/><w:bottom w:w="0" w:type="dxa"/><w:left w:w="20" w:type="dxa"/><w:right w:w="20" w:type="dxa"/></w:tcMar><w:vAlign w:val="center"/></w:tcPr><w:p><w:pPr><w:spacing w:before="0" w:after="0" w:line="240" w:lineRule="auto"/><w:jc w:val="center"/></w:pPr><w:r><w:rPr><w:rFonts w:ascii="Indie Flower" w:hAnsi="Indie Flower" w:cs="Indie Flower"/><w:color w:val="658C43"/><w:sz w:val="24"/><w:szCs w:val="24"/></w:rPr><w:t xml:space="preserve">x</w:t></w:r></w:p></w:tc><w:tc><w:tcPr><w:tcW w:w="1435" w:type="dxa"/><w:tcMar><w:top w:w="0" w:type="dxa"/><w:bottom w:w="0" w:type="dxa"/><w:left w:w="20" w:type="dxa"/><w:right w:w="20" w:type="dxa"/></w:tcMar><w:vAlign w:val="center"/></w:tcPr><w:p><w:pPr><w:spacing w:before="0" w:after="0" w:line="240" w:lineRule="auto"/><w:jc w:val="center"/></w:pPr><w:r><w:rPr><w:rFonts w:ascii="Indie Flower" w:hAnsi="Indie Flower" w:cs="Indie Flower"/><w:color w:val="658C43"/><w:sz w:val="24"/><w:szCs w:val="24"/></w:rPr><w:t/></w:r></w:p></w:tc></w:tr><w:tr><w:trPr><w:cantSplit/><w:trHeight w:val="361" w:hRule="exact"/></w:trPr><w:tc><w:tcPr><w:tcW w:w="514" w:type="dxa"/><w:tcMar><w:top w:w="0" w:type="dxa"/><w:bottom w:w="0" w:type="dxa"/><w:left w:w="20" w:type="dxa"/><w:right w:w="20" w:type="dxa"/></w:tcMar><w:vAlign w:val="center"/></w:tcPr><w:p><w:pPr><w:spacing w:before="0" w:after="0" w:line="240" w:lineRule="auto"/><w:ind w:left="90"/><w:jc w:val="left"/></w:pPr><w:r><w:rPr><w:rFonts w:ascii="Glegoo" w:hAnsi="Glegoo" w:cs="Glegoo"/><w:color w:val="658C43"/><w:sz w:val="15"/><w:szCs w:val="15"/></w:rPr><w:t xml:space="preserve">Do.</w:t></w:r></w:p></w:tc><w:tc><w:tcPr><w:tcW w:w="634" w:type="dxa"/><w:tcMar><w:top w:w="0" w:type="dxa"/><w:bottom w:w="0" w:type="dxa"/><w:left w:w="20" w:type="dxa"/><w:right w:w="20" w:type="dxa"/></w:tcMar><w:vAlign w:val="center"/></w:tcPr><w:p><w:pPr><w:spacing w:before="0" w:after="0" w:line="240" w:lineRule="auto"/><w:jc w:val="center"/></w:pPr><w:r><w:rPr><w:rFonts w:ascii="Indie Flower" w:hAnsi="Indie Flower" w:cs="Indie Flower"/><w:color w:val="658C43"/><w:sz w:val="24"/><w:szCs w:val="24"/></w:rPr><w:t xml:space="preserve">x</w:t></w:r></w:p></w:tc><w:tc><w:tcPr><w:tcW w:w="605" w:type="dxa"/><w:tcMar><w:top w:w="0" w:type="dxa"/><w:bottom w:w="0" w:type="dxa"/><w:left w:w="20" w:type="dxa"/><w:right w:w="20" w:type="dxa"/></w:tcMar><w:vAlign w:val="center"/></w:tcPr><w:p><w:pPr><w:spacing w:before="0" w:after="0" w:line="240" w:lineRule="auto"/><w:jc w:val="center"/></w:pPr><w:r><w:rPr><w:rFonts w:ascii="Indie Flower" w:hAnsi="Indie Flower" w:cs="Indie Flower"/><w:color w:val="658C43"/><w:sz w:val="24"/><w:szCs w:val="24"/></w:rPr><w:t xml:space="preserve">x</w:t></w:r></w:p></w:tc><w:tc><w:tcPr><w:tcW w:w="590" w:type="dxa"/><w:tcMar><w:top w:w="0" w:type="dxa"/><w:bottom w:w="0" w:type="dxa"/><w:left w:w="20" w:type="dxa"/><w:right w:w="20" w:type="dxa"/></w:tcMar><w:vAlign w:val="center"/></w:tcPr><w:p><w:pPr><w:spacing w:before="0" w:after="0" w:line="240" w:lineRule="auto"/><w:jc w:val="center"/></w:pPr><w:r><w:rPr><w:rFonts w:ascii="Indie Flower" w:hAnsi="Indie Flower" w:cs="Indie Flower"/><w:color w:val="658C43"/><w:sz w:val="24"/><w:szCs w:val="24"/></w:rPr><w:t xml:space="preserve">x</w:t></w:r></w:p></w:tc><w:tc><w:tcPr><w:tcW w:w="576" w:type="dxa"/><w:tcMar><w:top w:w="0" w:type="dxa"/><w:bottom w:w="0" w:type="dxa"/><w:left w:w="20" w:type="dxa"/><w:right w:w="20" w:type="dxa"/></w:tcMar><w:vAlign w:val="center"/></w:tcPr><w:p><w:pPr><w:spacing w:before="0" w:after="0" w:line="240" w:lineRule="auto"/><w:jc w:val="center"/></w:pPr><w:r><w:rPr><w:rFonts w:ascii="Indie Flower" w:hAnsi="Indie Flower" w:cs="Indie Flower"/><w:color w:val="658C43"/><w:sz w:val="24"/><w:szCs w:val="24"/></w:rPr><w:t/></w:r></w:p></w:tc><w:tc><w:tcPr><w:tcW w:w="806" w:type="dxa"/><w:tcMar><w:top w:w="0" w:type="dxa"/><w:bottom w:w="0" w:type="dxa"/><w:left w:w="20" w:type="dxa"/><w:right w:w="20" w:type="dxa"/></w:tcMar><w:vAlign w:val="center"/></w:tcPr><w:p><w:pPr><w:spacing w:before="0" w:after="0" w:line="240" w:lineRule="auto"/><w:jc w:val="center"/></w:pPr><w:r><w:rPr><w:rFonts w:ascii="Indie Flower" w:hAnsi="Indie Flower" w:cs="Indie Flower"/><w:color w:val="658C43"/><w:sz w:val="24"/><w:szCs w:val="24"/></w:rPr><w:t/></w:r></w:p></w:tc><w:tc><w:tcPr><w:tcW w:w="826" w:type="dxa"/><w:tcMar><w:top w:w="0" w:type="dxa"/><w:bottom w:w="0" w:type="dxa"/><w:left w:w="20" w:type="dxa"/><w:right w:w="20" w:type="dxa"/></w:tcMar><w:vAlign w:val="center"/></w:tcPr><w:p><w:pPr><w:spacing w:before="0" w:after="0" w:line="240" w:lineRule="auto"/><w:jc w:val="center"/></w:pPr><w:r><w:rPr><w:rFonts w:ascii="Indie Flower" w:hAnsi="Indie Flower" w:cs="Indie Flower"/><w:color w:val="658C43"/><w:sz w:val="24"/><w:szCs w:val="24"/></w:rPr><w:t/></w:r></w:p></w:tc><w:tc><w:tcPr><w:tcW w:w="557" w:type="dxa"/><w:tcMar><w:top w:w="0" w:type="dxa"/><w:bottom w:w="0" w:type="dxa"/><w:left w:w="20" w:type="dxa"/><w:right w:w="20" w:type="dxa"/></w:tcMar><w:vAlign w:val="center"/></w:tcPr><w:p><w:pPr><w:spacing w:before="0" w:after="0" w:line="240" w:lineRule="auto"/><w:jc w:val="center"/></w:pPr><w:r><w:rPr><w:rFonts w:ascii="Indie Flower" w:hAnsi="Indie Flower" w:cs="Indie Flower"/><w:color w:val="658C43"/><w:sz w:val="24"/><w:szCs w:val="24"/></w:rPr><w:t xml:space="preserve">x</w:t></w:r></w:p></w:tc><w:tc><w:tcPr><w:tcW w:w="1090" w:type="dxa"/><w:tcMar><w:top w:w="0" w:type="dxa"/><w:bottom w:w="0" w:type="dxa"/><w:left w:w="20" w:type="dxa"/><w:right w:w="20" w:type="dxa"/></w:tcMar><w:vAlign w:val="center"/></w:tcPr><w:p><w:pPr><w:spacing w:before="0" w:after="0" w:line="240" w:lineRule="auto"/><w:jc w:val="center"/></w:pPr><w:r><w:rPr><w:rFonts w:ascii="Indie Flower" w:hAnsi="Indie Flower" w:cs="Indie Flower"/><w:color w:val="658C43"/><w:sz w:val="24"/><w:szCs w:val="24"/></w:rPr><w:t/></w:r></w:p></w:tc><w:tc><w:tcPr><w:tcW w:w="763" w:type="dxa"/><w:tcMar><w:top w:w="0" w:type="dxa"/><w:bottom w:w="0" w:type="dxa"/><w:left w:w="20" w:type="dxa"/><w:right w:w="20" w:type="dxa"/></w:tcMar><w:vAlign w:val="center"/></w:tcPr><w:p><w:pPr><w:spacing w:before="0" w:after="0" w:line="240" w:lineRule="auto"/><w:jc w:val="center"/></w:pPr><w:r><w:rPr><w:rFonts w:ascii="Indie Flower" w:hAnsi="Indie Flower" w:cs="Indie Flower"/><w:color w:val="658C43"/><w:sz w:val="24"/><w:szCs w:val="24"/></w:rPr><w:t/></w:r></w:p></w:tc><w:tc><w:tcPr><w:tcW w:w="581" w:type="dxa"/><w:tcMar><w:top w:w="0" w:type="dxa"/><w:bottom w:w="0" w:type="dxa"/><w:left w:w="20" w:type="dxa"/><w:right w:w="20" w:type="dxa"/></w:tcMar><w:vAlign w:val="center"/></w:tcPr><w:p><w:pPr><w:spacing w:before="0" w:after="0" w:line="240" w:lineRule="auto"/><w:jc w:val="center"/></w:pPr><w:r><w:rPr><w:rFonts w:ascii="Indie Flower" w:hAnsi="Indie Flower" w:cs="Indie Flower"/><w:color w:val="658C43"/><w:sz w:val="24"/><w:szCs w:val="24"/></w:rPr><w:t/></w:r></w:p></w:tc><w:tc><w:tcPr><w:tcW w:w="566" w:type="dxa"/><w:tcMar><w:top w:w="0" w:type="dxa"/><w:bottom w:w="0" w:type="dxa"/><w:left w:w="20" w:type="dxa"/><w:right w:w="20" w:type="dxa"/></w:tcMar><w:vAlign w:val="center"/></w:tcPr><w:p><w:pPr><w:spacing w:before="0" w:after="0" w:line="240" w:lineRule="auto"/><w:jc w:val="center"/></w:pPr><w:r><w:rPr><w:rFonts w:ascii="Indie Flower" w:hAnsi="Indie Flower" w:cs="Indie Flower"/><w:color w:val="658C43"/><w:sz w:val="24"/><w:szCs w:val="24"/></w:rPr><w:t/></w:r></w:p></w:tc><w:tc><w:tcPr><w:tcW w:w="600" w:type="dxa"/><w:tcMar><w:top w:w="0" w:type="dxa"/><w:bottom w:w="0" w:type="dxa"/><w:left w:w="20" w:type="dxa"/><w:right w:w="20" w:type="dxa"/></w:tcMar><w:vAlign w:val="center"/></w:tcPr><w:p><w:pPr><w:spacing w:before="0" w:after="0" w:line="240" w:lineRule="auto"/><w:jc w:val="center"/></w:pPr><w:r><w:rPr><w:rFonts w:ascii="Indie Flower" w:hAnsi="Indie Flower" w:cs="Indie Flower"/><w:color w:val="658C43"/><w:sz w:val="24"/><w:szCs w:val="24"/></w:rPr><w:t/></w:r></w:p></w:tc><w:tc><w:tcPr><w:tcW w:w="624" w:type="dxa"/><w:tcMar><w:top w:w="0" w:type="dxa"/><w:bottom w:w="0" w:type="dxa"/><w:left w:w="20" w:type="dxa"/><w:right w:w="20" w:type="dxa"/></w:tcMar><w:vAlign w:val="center"/></w:tcPr><w:p><w:pPr><w:spacing w:before="0" w:after="0" w:line="240" w:lineRule="auto"/><w:jc w:val="center"/></w:pPr><w:r><w:rPr><w:rFonts w:ascii="Indie Flower" w:hAnsi="Indie Flower" w:cs="Indie Flower"/><w:color w:val="658C43"/><w:sz w:val="24"/><w:szCs w:val="24"/></w:rPr><w:t xml:space="preserve">x</w:t></w:r></w:p></w:tc><w:tc><w:tcPr><w:tcW w:w="1435" w:type="dxa"/><w:tcMar><w:top w:w="0" w:type="dxa"/><w:bottom w:w="0" w:type="dxa"/><w:left w:w="20" w:type="dxa"/><w:right w:w="20" w:type="dxa"/></w:tcMar><w:vAlign w:val="center"/></w:tcPr><w:p><w:pPr><w:spacing w:before="0" w:after="0" w:line="240" w:lineRule="auto"/><w:jc w:val="center"/></w:pPr><w:r><w:rPr><w:rFonts w:ascii="Indie Flower" w:hAnsi="Indie Flower" w:cs="Indie Flower"/><w:color w:val="658C43"/><w:sz w:val="24"/><w:szCs w:val="24"/></w:rPr><w:t/></w:r></w:p></w:tc></w:tr><w:tr><w:trPr><w:cantSplit/><w:trHeight w:val="361" w:hRule="exact"/></w:trPr><w:tc><w:tcPr><w:tcW w:w="514" w:type="dxa"/><w:tcMar><w:top w:w="0" w:type="dxa"/><w:bottom w:w="0" w:type="dxa"/><w:left w:w="20" w:type="dxa"/><w:right w:w="20" w:type="dxa"/></w:tcMar><w:vAlign w:val="center"/></w:tcPr><w:p><w:pPr><w:spacing w:before="0" w:after="0" w:line="240" w:lineRule="auto"/><w:ind w:left="90"/><w:jc w:val="left"/></w:pPr><w:r><w:rPr><w:rFonts w:ascii="Glegoo" w:hAnsi="Glegoo" w:cs="Glegoo"/><w:color w:val="658C43"/><w:sz w:val="15"/><w:szCs w:val="15"/></w:rPr><w:t xml:space="preserve">Fr.</w:t></w:r></w:p></w:tc><w:tc><w:tcPr><w:tcW w:w="634" w:type="dxa"/><w:tcMar><w:top w:w="0" w:type="dxa"/><w:bottom w:w="0" w:type="dxa"/><w:left w:w="20" w:type="dxa"/><w:right w:w="20" w:type="dxa"/></w:tcMar><w:vAlign w:val="center"/></w:tcPr><w:p><w:pPr><w:spacing w:before="0" w:after="0" w:line="240" w:lineRule="auto"/><w:jc w:val="center"/></w:pPr><w:r><w:rPr><w:rFonts w:ascii="Indie Flower" w:hAnsi="Indie Flower" w:cs="Indie Flower"/><w:color w:val="658C43"/><w:sz w:val="24"/><w:szCs w:val="24"/></w:rPr><w:t xml:space="preserve">x</w:t></w:r></w:p></w:tc><w:tc><w:tcPr><w:tcW w:w="605" w:type="dxa"/><w:tcMar><w:top w:w="0" w:type="dxa"/><w:bottom w:w="0" w:type="dxa"/><w:left w:w="20" w:type="dxa"/><w:right w:w="20" w:type="dxa"/></w:tcMar><w:vAlign w:val="center"/></w:tcPr><w:p><w:pPr><w:spacing w:before="0" w:after="0" w:line="240" w:lineRule="auto"/><w:jc w:val="center"/></w:pPr><w:r><w:rPr><w:rFonts w:ascii="Indie Flower" w:hAnsi="Indie Flower" w:cs="Indie Flower"/><w:color w:val="658C43"/><w:sz w:val="24"/><w:szCs w:val="24"/></w:rPr><w:t xml:space="preserve">x</w:t></w:r></w:p></w:tc><w:tc><w:tcPr><w:tcW w:w="590" w:type="dxa"/><w:tcMar><w:top w:w="0" w:type="dxa"/><w:bottom w:w="0" w:type="dxa"/><w:left w:w="20" w:type="dxa"/><w:right w:w="20" w:type="dxa"/></w:tcMar><w:vAlign w:val="center"/></w:tcPr><w:p><w:pPr><w:spacing w:before="0" w:after="0" w:line="240" w:lineRule="auto"/><w:jc w:val="center"/></w:pPr><w:r><w:rPr><w:rFonts w:ascii="Indie Flower" w:hAnsi="Indie Flower" w:cs="Indie Flower"/><w:color w:val="658C43"/><w:sz w:val="24"/><w:szCs w:val="24"/></w:rPr><w:t xml:space="preserve">x</w:t></w:r></w:p></w:tc><w:tc><w:tcPr><w:tcW w:w="576" w:type="dxa"/><w:tcMar><w:top w:w="0" w:type="dxa"/><w:bottom w:w="0" w:type="dxa"/><w:left w:w="20" w:type="dxa"/><w:right w:w="20" w:type="dxa"/></w:tcMar><w:vAlign w:val="center"/></w:tcPr><w:p><w:pPr><w:spacing w:before="0" w:after="0" w:line="240" w:lineRule="auto"/><w:jc w:val="center"/></w:pPr><w:r><w:rPr><w:rFonts w:ascii="Indie Flower" w:hAnsi="Indie Flower" w:cs="Indie Flower"/><w:color w:val="658C43"/><w:sz w:val="24"/><w:szCs w:val="24"/></w:rPr><w:t xml:space="preserve">x</w:t></w:r></w:p></w:tc><w:tc><w:tcPr><w:tcW w:w="806" w:type="dxa"/><w:tcMar><w:top w:w="0" w:type="dxa"/><w:bottom w:w="0" w:type="dxa"/><w:left w:w="20" w:type="dxa"/><w:right w:w="20" w:type="dxa"/></w:tcMar><w:vAlign w:val="center"/></w:tcPr><w:p><w:pPr><w:spacing w:before="0" w:after="0" w:line="240" w:lineRule="auto"/><w:jc w:val="center"/></w:pPr><w:r><w:rPr><w:rFonts w:ascii="Indie Flower" w:hAnsi="Indie Flower" w:cs="Indie Flower"/><w:color w:val="658C43"/><w:sz w:val="24"/><w:szCs w:val="24"/></w:rPr><w:t/></w:r></w:p></w:tc><w:tc><w:tcPr><w:tcW w:w="826" w:type="dxa"/><w:tcMar><w:top w:w="0" w:type="dxa"/><w:bottom w:w="0" w:type="dxa"/><w:left w:w="20" w:type="dxa"/><w:right w:w="20" w:type="dxa"/></w:tcMar><w:vAlign w:val="center"/></w:tcPr><w:p><w:pPr><w:spacing w:before="0" w:after="0" w:line="240" w:lineRule="auto"/><w:jc w:val="center"/></w:pPr><w:r><w:rPr><w:rFonts w:ascii="Indie Flower" w:hAnsi="Indie Flower" w:cs="Indie Flower"/><w:color w:val="658C43"/><w:sz w:val="24"/><w:szCs w:val="24"/></w:rPr><w:t/></w:r></w:p></w:tc><w:tc><w:tcPr><w:tcW w:w="557" w:type="dxa"/><w:tcMar><w:top w:w="0" w:type="dxa"/><w:bottom w:w="0" w:type="dxa"/><w:left w:w="20" w:type="dxa"/><w:right w:w="20" w:type="dxa"/></w:tcMar><w:vAlign w:val="center"/></w:tcPr><w:p><w:pPr><w:spacing w:before="0" w:after="0" w:line="240" w:lineRule="auto"/><w:jc w:val="center"/></w:pPr><w:r><w:rPr><w:rFonts w:ascii="Indie Flower" w:hAnsi="Indie Flower" w:cs="Indie Flower"/><w:color w:val="658C43"/><w:sz w:val="24"/><w:szCs w:val="24"/></w:rPr><w:t xml:space="preserve">x</w:t></w:r></w:p></w:tc><w:tc><w:tcPr><w:tcW w:w="1090" w:type="dxa"/><w:tcMar><w:top w:w="0" w:type="dxa"/><w:bottom w:w="0" w:type="dxa"/><w:left w:w="20" w:type="dxa"/><w:right w:w="20" w:type="dxa"/></w:tcMar><w:vAlign w:val="center"/></w:tcPr><w:p><w:pPr><w:spacing w:before="0" w:after="0" w:line="240" w:lineRule="auto"/><w:jc w:val="center"/></w:pPr><w:r><w:rPr><w:rFonts w:ascii="Indie Flower" w:hAnsi="Indie Flower" w:cs="Indie Flower"/><w:color w:val="658C43"/><w:sz w:val="24"/><w:szCs w:val="24"/></w:rPr><w:t/></w:r></w:p></w:tc><w:tc><w:tcPr><w:tcW w:w="763" w:type="dxa"/><w:tcMar><w:top w:w="0" w:type="dxa"/><w:bottom w:w="0" w:type="dxa"/><w:left w:w="20" w:type="dxa"/><w:right w:w="20" w:type="dxa"/></w:tcMar><w:vAlign w:val="center"/></w:tcPr><w:p><w:pPr><w:spacing w:before="0" w:after="0" w:line="240" w:lineRule="auto"/><w:jc w:val="center"/></w:pPr><w:r><w:rPr><w:rFonts w:ascii="Indie Flower" w:hAnsi="Indie Flower" w:cs="Indie Flower"/><w:color w:val="658C43"/><w:sz w:val="24"/><w:szCs w:val="24"/></w:rPr><w:t/></w:r></w:p></w:tc><w:tc><w:tcPr><w:tcW w:w="581" w:type="dxa"/><w:tcMar><w:top w:w="0" w:type="dxa"/><w:bottom w:w="0" w:type="dxa"/><w:left w:w="20" w:type="dxa"/><w:right w:w="20" w:type="dxa"/></w:tcMar><w:vAlign w:val="center"/></w:tcPr><w:p><w:pPr><w:spacing w:before="0" w:after="0" w:line="240" w:lineRule="auto"/><w:jc w:val="center"/></w:pPr><w:r><w:rPr><w:rFonts w:ascii="Indie Flower" w:hAnsi="Indie Flower" w:cs="Indie Flower"/><w:color w:val="658C43"/><w:sz w:val="24"/><w:szCs w:val="24"/></w:rPr><w:t/></w:r></w:p></w:tc><w:tc><w:tcPr><w:tcW w:w="566" w:type="dxa"/><w:tcMar><w:top w:w="0" w:type="dxa"/><w:bottom w:w="0" w:type="dxa"/><w:left w:w="20" w:type="dxa"/><w:right w:w="20" w:type="dxa"/></w:tcMar><w:vAlign w:val="center"/></w:tcPr><w:p><w:pPr><w:spacing w:before="0" w:after="0" w:line="240" w:lineRule="auto"/><w:jc w:val="center"/></w:pPr><w:r><w:rPr><w:rFonts w:ascii="Indie Flower" w:hAnsi="Indie Flower" w:cs="Indie Flower"/><w:color w:val="658C43"/><w:sz w:val="24"/><w:szCs w:val="24"/></w:rPr><w:t/></w:r></w:p></w:tc><w:tc><w:tcPr><w:tcW w:w="600" w:type="dxa"/><w:tcMar><w:top w:w="0" w:type="dxa"/><w:bottom w:w="0" w:type="dxa"/><w:left w:w="20" w:type="dxa"/><w:right w:w="20" w:type="dxa"/></w:tcMar><w:vAlign w:val="center"/></w:tcPr><w:p><w:pPr><w:spacing w:before="0" w:after="0" w:line="240" w:lineRule="auto"/><w:jc w:val="center"/></w:pPr><w:r><w:rPr><w:rFonts w:ascii="Indie Flower" w:hAnsi="Indie Flower" w:cs="Indie Flower"/><w:color w:val="658C43"/><w:sz w:val="24"/><w:szCs w:val="24"/></w:rPr><w:t/></w:r></w:p></w:tc><w:tc><w:tcPr><w:tcW w:w="624" w:type="dxa"/><w:tcMar><w:top w:w="0" w:type="dxa"/><w:bottom w:w="0" w:type="dxa"/><w:left w:w="20" w:type="dxa"/><w:right w:w="20" w:type="dxa"/></w:tcMar><w:vAlign w:val="center"/></w:tcPr><w:p><w:pPr><w:spacing w:before="0" w:after="0" w:line="240" w:lineRule="auto"/><w:jc w:val="center"/></w:pPr><w:r><w:rPr><w:rFonts w:ascii="Indie Flower" w:hAnsi="Indie Flower" w:cs="Indie Flower"/><w:color w:val="658C43"/><w:sz w:val="24"/><w:szCs w:val="24"/></w:rPr><w:t xml:space="preserve">x</w:t></w:r></w:p></w:tc><w:tc><w:tcPr><w:tcW w:w="1435" w:type="dxa"/><w:tcMar><w:top w:w="0" w:type="dxa"/><w:bottom w:w="0" w:type="dxa"/><w:left w:w="20" w:type="dxa"/><w:right w:w="20" w:type="dxa"/></w:tcMar><w:vAlign w:val="center"/></w:tcPr><w:p><w:pPr><w:spacing w:before="0" w:after="0" w:line="240" w:lineRule="auto"/><w:jc w:val="center"/></w:pPr><w:r><w:rPr><w:rFonts w:ascii="Indie Flower" w:hAnsi="Indie Flower" w:cs="Indie Flower"/><w:color w:val="658C43"/><w:sz w:val="24"/><w:szCs w:val="24"/></w:rPr><w:t/></w:r></w:p></w:tc></w:tr></w:tbl><w:p><w:pPr><w:spacing w:before="0" w:after="0" w:line="20" w:lineRule="exact"/><w:rPr><w:sz w:val="2"/></w:rPr></w:pPr></w:p></w:txbxContent></wps:txbx><wps:bodyPr rot="0" vert="horz" wrap="square" lIns="0" tIns="0" rIns="0" bIns="0" anchor="t" anchorCtr="0"><a:noAutofit/></wps:bodyPr></wps:wsp></a:graphicData></a:graphic></wp:anchor></w:drawing></w:r></w:p><w:p><w:pPr><w:pStyle w:val="Fuzeile"/></w:pPr></w:p></w:ftr>
+<file path=word/footer2.xml><?xml version="1.0" encoding="utf-8"?>
+<w:ftr xmlns:wpc="http://schemas.microsoft.com/office/word/2010/wordprocessingCanvas" xmlns:cx="http://schemas.microsoft.com/office/drawing/2014/chartex" xmlns:cx1="http://schemas.microsoft.com/office/drawing/2015/9/8/chartex" xmlns:cx2="http://schemas.microsoft.com/office/drawing/2015/10/21/chartex" xmlns:cx3="http://schemas.microsoft.com/office/drawing/2016/5/9/chartex" xmlns:cx4="http://schemas.microsoft.com/office/drawing/2016/5/10/chartex" xmlns:cx5="http://schemas.microsoft.com/office/drawing/2016/5/11/chartex" xmlns:cx6="http://schemas.microsoft.com/office/drawing/2016/5/12/chartex" xmlns:cx7="http://schemas.microsoft.com/office/drawing/2016/5/13/chartex" xmlns:cx8="http://schemas.microsoft.com/office/drawing/2016/5/14/chartex" xmlns:mc="http://schemas.openxmlformats.org/markup-compatibility/2006" xmlns:m="http://schemas.openxmlformats.org/officeDocument/2006/math" xmlns:aink="http://schemas.microsoft.com/office/drawing/2016/ink" xmlns:am3d="http://schemas.microsoft.com/office/drawing/2017/model3d" xmlns:oel="http://schemas.microsoft.com/office/2019/extlst" xmlns:r="http://schemas.openxmlformats.org/officeDocument/2006/relationships" xmlns:wp14="http://schemas.microsoft.com/office/word/2010/wordprocessingDrawing" xmlns:wp="http://schemas.openxmlformats.org/drawingml/2006/wordprocessingDrawing" xmlns:wpg="http://schemas.microsoft.com/office/word/2010/wordprocessingGroup" xmlns:wpi="http://schemas.microsoft.com/office/word/2010/wordprocessingInk" xmlns:wps="http://schemas.microsoft.com/office/word/2010/wordprocessingShape" xmlns:o="urn:schemas-microsoft-com:office:office" xmlns:v="urn:schemas-microsoft-com:vml" xmlns:w10="urn:schemas-microsoft-com:office:word" xmlns:w="http://schemas.openxmlformats.org/wordprocessingml/2006/main" xmlns:w14="http://schemas.microsoft.com/office/word/2010/wordml" xmlns:w15="http://schemas.microsoft.com/office/word/2012/wordml" xmlns:w16cex="http://schemas.microsoft.com/office/word/2018/wordml/cex" xmlns:w16cid="http://schemas.microsoft.com/office/word/2016/wordml/cid" xmlns:w16="http://schemas.microsoft.com/office/word/2018/wordml" xmlns:w16sdtdh="http://schemas.microsoft.com/office/word/2020/wordml/sdtdatahash" xmlns:w16sdtfl="http://schemas.microsoft.com/office/word/2024/wordml/sdtformatlock" xmlns:w16se="http://schemas.microsoft.com/office/word/2015/wordml/symex" xmlns:w16du="http://schemas.microsoft.com/office/word/2023/wordml/word16du" xmlns:wne="http://schemas.microsoft.com/office/word/2006/wordml" mc:Ignorable="w14 w15 w16se w16cid w16 w16cex w16sdtdh w16sdtfl w16du wp14">
+  <w:p>
+    <w:pPr>
+      <w:pStyle w:val="berschriftengrnascute20"/>
+      <w:spacing w:line="240" w:lineRule="auto"/>
+      <w:jc w:val="center"/>
+      <w:rPr>
+        <w:rFonts w:ascii="Indie Flower" w:hAnsi="Indie Flower" w:cs="Indie Flower"/>
+        <w:color w:val="658C43"/>
+      </w:rPr>
+    </w:pPr>
+    <w:r>
+      <w:rPr>
+        <w:rFonts w:ascii="Indie Flower" w:hAnsi="Indie Flower" w:cs="Indie Flower"/>
+        <w:noProof/>
+        <w:color w:val="658C43"/>
+      </w:rPr>
+      <w:drawing>
+        <wp:anchor distT="0" distB="0" distL="0" distR="0" simplePos="0" relativeHeight="251660288" behindDoc="0" locked="1" layoutInCell="1" allowOverlap="1">
+          <wp:simplePos x="0" y="0"/>
+          <wp:positionH relativeFrom="page">
+            <wp:posOffset>356616</wp:posOffset>
+          </wp:positionH>
+          <wp:positionV relativeFrom="page">
+            <wp:posOffset>8427720</wp:posOffset>
+          </wp:positionV>
+          <wp:extent cx="6836664" cy="1517424"/>
+          <wp:effectExtent l="0" t="0" r="0" b="0"/>
+          <wp:wrapNone/>
+          <wp:docPr id="3000" name="Allergentabelle"/>
+          <wp:cNvGraphicFramePr/>
+          <a:graphic xmlns:a="http://schemas.openxmlformats.org/drawingml/2006/main">
+            <a:graphicData uri="http://schemas.microsoft.com/office/word/2010/wordprocessingShape">
+              <wps:wsp>
+                <wps:cNvSpPr txBox="1"/>
+                <wps:spPr>
+                  <a:xfrm>
+                    <a:off x="0" y="0"/>
+                    <a:ext cx="6836664" cy="1517424"/>
+                  </a:xfrm>
+                  <a:prstGeom prst="rect">
+                    <a:avLst/>
+                  </a:prstGeom>
+                  <a:noFill/>
+                  <a:ln>
+                    <a:noFill/>
+                  </a:ln>
+                </wps:spPr>
+                <wps:txbx>
+                  <w:txbxContent>
+                    <w:tbl>
+                      <w:tblPr>
+                        <w:tblW w:w="10767" w:type="dxa"/>
+                        <w:tblLayout w:type="fixed"/>
+                        <w:tblBorders>
+                          <w:top w:val="single" w:sz="10" w:space="0" w:color="658C43"/>
+                          <w:left w:val="single" w:sz="10" w:space="0" w:color="658C43"/>
+                          <w:bottom w:val="single" w:sz="10" w:space="0" w:color="658C43"/>
+                          <w:right w:val="single" w:sz="10" w:space="0" w:color="658C43"/>
+                          <w:insideH w:val="single" w:sz="4" w:space="0" w:color="658C43"/>
+                          <w:insideV w:val="single" w:sz="4" w:space="0" w:color="658C43"/>
+                        </w:tblBorders>
+                        <w:tblCellMar>
+                          <w:top w:w="0" w:type="dxa"/>
+                          <w:left w:w="0" w:type="dxa"/>
+                          <w:bottom w:w="0" w:type="dxa"/>
+                          <w:right w:w="0" w:type="dxa"/>
+                        </w:tblCellMar>
+                        <w:tblLook w:val="0000"/>
+                      </w:tblPr>
+                      <w:tblGrid>
+                        <w:gridCol w:w="514"/>
+                        <w:gridCol w:w="634"/>
+                        <w:gridCol w:w="605"/>
+                        <w:gridCol w:w="590"/>
+                        <w:gridCol w:w="576"/>
+                        <w:gridCol w:w="806"/>
+                        <w:gridCol w:w="826"/>
+                        <w:gridCol w:w="557"/>
+                        <w:gridCol w:w="1090"/>
+                        <w:gridCol w:w="763"/>
+                        <w:gridCol w:w="581"/>
+                        <w:gridCol w:w="566"/>
+                        <w:gridCol w:w="600"/>
+                        <w:gridCol w:w="624"/>
+                        <w:gridCol w:w="1435"/>
+                      </w:tblGrid>
+                      <w:tr>
+                        <w:trPr>
+                          <w:cantSplit/>
+                          <w:trHeight w:val="898" w:hRule="exact"/>
+                        </w:trPr>
+                        <w:tc>
+                          <w:tcPr>
+                            <w:tcW w:w="514" w:type="dxa"/>
+                            <w:tcMar>
+                              <w:top w:w="0" w:type="dxa"/>
+                              <w:bottom w:w="0" w:type="dxa"/>
+                              <w:left w:w="20" w:type="dxa"/>
+                              <w:right w:w="20" w:type="dxa"/>
+                            </w:tcMar>
+                            <w:vAlign w:val="center"/>
+                          </w:tcPr>
+                          <w:p>
+                            <w:pPr>
+                              <w:spacing w:before="0" w:after="0" w:line="240" w:lineRule="auto"/>
+                              <w:jc w:val="center"/>
+                            </w:pPr>
+                          </w:p>
+                        </w:tc>
+                        <w:tc>
+                          <w:tcPr>
+                            <w:tcW w:w="634" w:type="dxa"/>
+                            <w:tcMar>
+                              <w:top w:w="0" w:type="dxa"/>
+                              <w:bottom w:w="0" w:type="dxa"/>
+                              <w:left w:w="20" w:type="dxa"/>
+                              <w:right w:w="20" w:type="dxa"/>
+                            </w:tcMar>
+                            <w:vAlign w:val="center"/>
+                          </w:tcPr>
+                          <w:p>
+                            <w:pPr>
+                              <w:spacing w:before="0" w:after="0" w:line="240" w:lineRule="auto"/>
+                              <w:jc w:val="center"/>
+                            </w:pPr>
+                            <w:r>
+                              <w:rPr>
+                                <w:noProof/>
+                              </w:rPr>
+                              <w:drawing>
+                                <wp:inline distT="0" distB="0" distL="0" distR="0">
+                                  <wp:extent cx="237744" cy="237744"/>
+                                  <wp:effectExtent l="0" t="0" r="0" b="0"/>
+                                  <wp:docPr id="3101" name="Allergen Gluten" descr="Gluten"/>
+                                  <wp:cNvGraphicFramePr>
+                                    <a:graphicFrameLocks xmlns:a="http://schemas.openxmlformats.org/drawingml/2006/main" noChangeAspect="1"/>
+                                  </wp:cNvGraphicFramePr>
+                                  <a:graphic xmlns:a="http://schemas.openxmlformats.org/drawingml/2006/main">
+                                    <a:graphicData uri="http://schemas.openxmlformats.org/drawingml/2006/picture">
+                                      <pic:pic xmlns:pic="http://schemas.openxmlformats.org/drawingml/2006/picture">
+                                        <pic:nvPicPr>
+                                          <pic:cNvPr id="3101" name="allergen-gluten.png"/>
+                                          <pic:cNvPicPr/>
+                                        </pic:nvPicPr>
+                                        <pic:blipFill>
+                                          <a:blip r:embed="rIdAllergenPng1">
+                                            <a:extLst>
+                                              <a:ext uri="{96DAC541-7B7A-43D3-8B79-37D633B846F1}">
+                                                <asvg:svgBlip xmlns:asvg="http://schemas.microsoft.com/office/drawing/2016/SVG/main" r:embed="rIdAllergenSvg1"/>
+                                              </a:ext>
+                                            </a:extLst>
+                                          </a:blip>
+                                          <a:stretch>
+                                            <a:fillRect/>
+                                          </a:stretch>
+                                        </pic:blipFill>
+                                        <pic:spPr>
+                                          <a:xfrm>
+                                            <a:off x="0" y="0"/>
+                                            <a:ext cx="237744" cy="237744"/>
+                                          </a:xfrm>
+                                          <a:prstGeom prst="rect">
+                                            <a:avLst/>
+                                          </a:prstGeom>
+                                        </pic:spPr>
+                                      </pic:pic>
+                                    </a:graphicData>
+                                  </a:graphic>
+                                </wp:inline>
+                              </w:drawing>
+                            </w:r>
+                          </w:p>
+                          <w:p>
+                            <w:pPr>
+                              <w:spacing w:before="0" w:after="0" w:line="220" w:lineRule="auto"/>
+                              <w:jc w:val="center"/>
+                            </w:pPr>
+                            <w:r>
+                              <w:rPr>
+                                <w:rFonts w:ascii="Glegoo" w:hAnsi="Glegoo" w:cs="Glegoo"/>
+                                <w:color w:val="4A4A4A"/>
+                                <w:sz w:val="12"/>
+                                <w:szCs w:val="12"/>
+                              </w:rPr>
+                              <w:t xml:space="preserve">Gluten</w:t>
+                            </w:r>
+                          </w:p>
+                        </w:tc>
+                        <w:tc>
+                          <w:tcPr>
+                            <w:tcW w:w="605" w:type="dxa"/>
+                            <w:tcMar>
+                              <w:top w:w="0" w:type="dxa"/>
+                              <w:bottom w:w="0" w:type="dxa"/>
+                              <w:left w:w="20" w:type="dxa"/>
+                              <w:right w:w="20" w:type="dxa"/>
+                            </w:tcMar>
+                            <w:vAlign w:val="center"/>
+                          </w:tcPr>
+                          <w:p>
+                            <w:pPr>
+                              <w:spacing w:before="0" w:after="0" w:line="240" w:lineRule="auto"/>
+                              <w:jc w:val="center"/>
+                            </w:pPr>
+                            <w:r>
+                              <w:rPr>
+                                <w:noProof/>
+                              </w:rPr>
+                              <w:drawing>
+                                <wp:inline distT="0" distB="0" distL="0" distR="0">
+                                  <wp:extent cx="237744" cy="237744"/>
+                                  <wp:effectExtent l="0" t="0" r="0" b="0"/>
+                                  <wp:docPr id="3102" name="Allergen Milch" descr="Milch"/>
+                                  <wp:cNvGraphicFramePr>
+                                    <a:graphicFrameLocks xmlns:a="http://schemas.openxmlformats.org/drawingml/2006/main" noChangeAspect="1"/>
+                                  </wp:cNvGraphicFramePr>
+                                  <a:graphic xmlns:a="http://schemas.openxmlformats.org/drawingml/2006/main">
+                                    <a:graphicData uri="http://schemas.openxmlformats.org/drawingml/2006/picture">
+                                      <pic:pic xmlns:pic="http://schemas.openxmlformats.org/drawingml/2006/picture">
+                                        <pic:nvPicPr>
+                                          <pic:cNvPr id="3102" name="allergen-milch.png"/>
+                                          <pic:cNvPicPr/>
+                                        </pic:nvPicPr>
+                                        <pic:blipFill>
+                                          <a:blip r:embed="rIdAllergenPng2">
+                                            <a:extLst>
+                                              <a:ext uri="{96DAC541-7B7A-43D3-8B79-37D633B846F1}">
+                                                <asvg:svgBlip xmlns:asvg="http://schemas.microsoft.com/office/drawing/2016/SVG/main" r:embed="rIdAllergenSvg2"/>
+                                              </a:ext>
+                                            </a:extLst>
+                                          </a:blip>
+                                          <a:stretch>
+                                            <a:fillRect/>
+                                          </a:stretch>
+                                        </pic:blipFill>
+                                        <pic:spPr>
+                                          <a:xfrm>
+                                            <a:off x="0" y="0"/>
+                                            <a:ext cx="237744" cy="237744"/>
+                                          </a:xfrm>
+                                          <a:prstGeom prst="rect">
+                                            <a:avLst/>
+                                          </a:prstGeom>
+                                        </pic:spPr>
+                                      </pic:pic>
+                                    </a:graphicData>
+                                  </a:graphic>
+                                </wp:inline>
+                              </w:drawing>
+                            </w:r>
+                          </w:p>
+                          <w:p>
+                            <w:pPr>
+                              <w:spacing w:before="0" w:after="0" w:line="220" w:lineRule="auto"/>
+                              <w:jc w:val="center"/>
+                            </w:pPr>
+                            <w:r>
+                              <w:rPr>
+                                <w:rFonts w:ascii="Glegoo" w:hAnsi="Glegoo" w:cs="Glegoo"/>
+                                <w:color w:val="4A4A4A"/>
+                                <w:sz w:val="12"/>
+                                <w:szCs w:val="12"/>
+                              </w:rPr>
+                              <w:t xml:space="preserve">Milch</w:t>
+                            </w:r>
+                          </w:p>
+                        </w:tc>
+                        <w:tc>
+                          <w:tcPr>
+                            <w:tcW w:w="590" w:type="dxa"/>
+                            <w:tcMar>
+                              <w:top w:w="0" w:type="dxa"/>
+                              <w:bottom w:w="0" w:type="dxa"/>
+                              <w:left w:w="20" w:type="dxa"/>
+                              <w:right w:w="20" w:type="dxa"/>
+                            </w:tcMar>
+                            <w:vAlign w:val="center"/>
+                          </w:tcPr>
+                          <w:p>
+                            <w:pPr>
+                              <w:spacing w:before="0" w:after="0" w:line="240" w:lineRule="auto"/>
+                              <w:jc w:val="center"/>
+                            </w:pPr>
+                            <w:r>
+                              <w:rPr>
+                                <w:noProof/>
+                              </w:rPr>
+                              <w:drawing>
+                                <wp:inline distT="0" distB="0" distL="0" distR="0">
+                                  <wp:extent cx="237744" cy="237744"/>
+                                  <wp:effectExtent l="0" t="0" r="0" b="0"/>
+                                  <wp:docPr id="3103" name="Allergen Eier" descr="Eier"/>
+                                  <wp:cNvGraphicFramePr>
+                                    <a:graphicFrameLocks xmlns:a="http://schemas.openxmlformats.org/drawingml/2006/main" noChangeAspect="1"/>
+                                  </wp:cNvGraphicFramePr>
+                                  <a:graphic xmlns:a="http://schemas.openxmlformats.org/drawingml/2006/main">
+                                    <a:graphicData uri="http://schemas.openxmlformats.org/drawingml/2006/picture">
+                                      <pic:pic xmlns:pic="http://schemas.openxmlformats.org/drawingml/2006/picture">
+                                        <pic:nvPicPr>
+                                          <pic:cNvPr id="3103" name="allergen-eier.png"/>
+                                          <pic:cNvPicPr/>
+                                        </pic:nvPicPr>
+                                        <pic:blipFill>
+                                          <a:blip r:embed="rIdAllergenPng3">
+                                            <a:extLst>
+                                              <a:ext uri="{96DAC541-7B7A-43D3-8B79-37D633B846F1}">
+                                                <asvg:svgBlip xmlns:asvg="http://schemas.microsoft.com/office/drawing/2016/SVG/main" r:embed="rIdAllergenSvg3"/>
+                                              </a:ext>
+                                            </a:extLst>
+                                          </a:blip>
+                                          <a:stretch>
+                                            <a:fillRect/>
+                                          </a:stretch>
+                                        </pic:blipFill>
+                                        <pic:spPr>
+                                          <a:xfrm>
+                                            <a:off x="0" y="0"/>
+                                            <a:ext cx="237744" cy="237744"/>
+                                          </a:xfrm>
+                                          <a:prstGeom prst="rect">
+                                            <a:avLst/>
+                                          </a:prstGeom>
+                                        </pic:spPr>
+                                      </pic:pic>
+                                    </a:graphicData>
+                                  </a:graphic>
+                                </wp:inline>
+                              </w:drawing>
+                            </w:r>
+                          </w:p>
+                          <w:p>
+                            <w:pPr>
+                              <w:spacing w:before="0" w:after="0" w:line="220" w:lineRule="auto"/>
+                              <w:jc w:val="center"/>
+                            </w:pPr>
+                            <w:r>
+                              <w:rPr>
+                                <w:rFonts w:ascii="Glegoo" w:hAnsi="Glegoo" w:cs="Glegoo"/>
+                                <w:color w:val="4A4A4A"/>
+                                <w:sz w:val="12"/>
+                                <w:szCs w:val="12"/>
+                              </w:rPr>
+                              <w:t xml:space="preserve">Eier</w:t>
+                            </w:r>
+                          </w:p>
+                        </w:tc>
+                        <w:tc>
+                          <w:tcPr>
+                            <w:tcW w:w="576" w:type="dxa"/>
+                            <w:tcMar>
+                              <w:top w:w="0" w:type="dxa"/>
+                              <w:bottom w:w="0" w:type="dxa"/>
+                              <w:left w:w="20" w:type="dxa"/>
+                              <w:right w:w="20" w:type="dxa"/>
+                            </w:tcMar>
+                            <w:vAlign w:val="center"/>
+                          </w:tcPr>
+                          <w:p>
+                            <w:pPr>
+                              <w:spacing w:before="0" w:after="0" w:line="240" w:lineRule="auto"/>
+                              <w:jc w:val="center"/>
+                            </w:pPr>
+                            <w:r>
+                              <w:rPr>
+                                <w:noProof/>
+                              </w:rPr>
+                              <w:drawing>
+                                <wp:inline distT="0" distB="0" distL="0" distR="0">
+                                  <wp:extent cx="237744" cy="237744"/>
+                                  <wp:effectExtent l="0" t="0" r="0" b="0"/>
+                                  <wp:docPr id="3104" name="Allergen Fisch" descr="Fisch"/>
+                                  <wp:cNvGraphicFramePr>
+                                    <a:graphicFrameLocks xmlns:a="http://schemas.openxmlformats.org/drawingml/2006/main" noChangeAspect="1"/>
+                                  </wp:cNvGraphicFramePr>
+                                  <a:graphic xmlns:a="http://schemas.openxmlformats.org/drawingml/2006/main">
+                                    <a:graphicData uri="http://schemas.openxmlformats.org/drawingml/2006/picture">
+                                      <pic:pic xmlns:pic="http://schemas.openxmlformats.org/drawingml/2006/picture">
+                                        <pic:nvPicPr>
+                                          <pic:cNvPr id="3104" name="allergen-fisch.png"/>
+                                          <pic:cNvPicPr/>
+                                        </pic:nvPicPr>
+                                        <pic:blipFill>
+                                          <a:blip r:embed="rIdAllergenPng4">
+                                            <a:extLst>
+                                              <a:ext uri="{96DAC541-7B7A-43D3-8B79-37D633B846F1}">
+                                                <asvg:svgBlip xmlns:asvg="http://schemas.microsoft.com/office/drawing/2016/SVG/main" r:embed="rIdAllergenSvg4"/>
+                                              </a:ext>
+                                            </a:extLst>
+                                          </a:blip>
+                                          <a:stretch>
+                                            <a:fillRect/>
+                                          </a:stretch>
+                                        </pic:blipFill>
+                                        <pic:spPr>
+                                          <a:xfrm>
+                                            <a:off x="0" y="0"/>
+                                            <a:ext cx="237744" cy="237744"/>
+                                          </a:xfrm>
+                                          <a:prstGeom prst="rect">
+                                            <a:avLst/>
+                                          </a:prstGeom>
+                                        </pic:spPr>
+                                      </pic:pic>
+                                    </a:graphicData>
+                                  </a:graphic>
+                                </wp:inline>
+                              </w:drawing>
+                            </w:r>
+                          </w:p>
+                          <w:p>
+                            <w:pPr>
+                              <w:spacing w:before="0" w:after="0" w:line="220" w:lineRule="auto"/>
+                              <w:jc w:val="center"/>
+                            </w:pPr>
+                            <w:r>
+                              <w:rPr>
+                                <w:rFonts w:ascii="Glegoo" w:hAnsi="Glegoo" w:cs="Glegoo"/>
+                                <w:color w:val="4A4A4A"/>
+                                <w:sz w:val="12"/>
+                                <w:szCs w:val="12"/>
+                              </w:rPr>
+                              <w:t xml:space="preserve">Fisch</w:t>
+                            </w:r>
+                          </w:p>
+                        </w:tc>
+                        <w:tc>
+                          <w:tcPr>
+                            <w:tcW w:w="806" w:type="dxa"/>
+                            <w:tcMar>
+                              <w:top w:w="0" w:type="dxa"/>
+                              <w:bottom w:w="0" w:type="dxa"/>
+                              <w:left w:w="20" w:type="dxa"/>
+                              <w:right w:w="20" w:type="dxa"/>
+                            </w:tcMar>
+                            <w:vAlign w:val="center"/>
+                          </w:tcPr>
+                          <w:p>
+                            <w:pPr>
+                              <w:spacing w:before="0" w:after="0" w:line="240" w:lineRule="auto"/>
+                              <w:jc w:val="center"/>
+                            </w:pPr>
+                            <w:r>
+                              <w:rPr>
+                                <w:noProof/>
+                              </w:rPr>
+                              <w:drawing>
+                                <wp:inline distT="0" distB="0" distL="0" distR="0">
+                                  <wp:extent cx="237744" cy="237744"/>
+                                  <wp:effectExtent l="0" t="0" r="0" b="0"/>
+                                  <wp:docPr id="3105" name="Allergen Krebstiere" descr="Krebstiere"/>
+                                  <wp:cNvGraphicFramePr>
+                                    <a:graphicFrameLocks xmlns:a="http://schemas.openxmlformats.org/drawingml/2006/main" noChangeAspect="1"/>
+                                  </wp:cNvGraphicFramePr>
+                                  <a:graphic xmlns:a="http://schemas.openxmlformats.org/drawingml/2006/main">
+                                    <a:graphicData uri="http://schemas.openxmlformats.org/drawingml/2006/picture">
+                                      <pic:pic xmlns:pic="http://schemas.openxmlformats.org/drawingml/2006/picture">
+                                        <pic:nvPicPr>
+                                          <pic:cNvPr id="3105" name="allergen-krebstiere.png"/>
+                                          <pic:cNvPicPr/>
+                                        </pic:nvPicPr>
+                                        <pic:blipFill>
+                                          <a:blip r:embed="rIdAllergenPng5">
+                                            <a:extLst>
+                                              <a:ext uri="{96DAC541-7B7A-43D3-8B79-37D633B846F1}">
+                                                <asvg:svgBlip xmlns:asvg="http://schemas.microsoft.com/office/drawing/2016/SVG/main" r:embed="rIdAllergenSvg5"/>
+                                              </a:ext>
+                                            </a:extLst>
+                                          </a:blip>
+                                          <a:stretch>
+                                            <a:fillRect/>
+                                          </a:stretch>
+                                        </pic:blipFill>
+                                        <pic:spPr>
+                                          <a:xfrm>
+                                            <a:off x="0" y="0"/>
+                                            <a:ext cx="237744" cy="237744"/>
+                                          </a:xfrm>
+                                          <a:prstGeom prst="rect">
+                                            <a:avLst/>
+                                          </a:prstGeom>
+                                        </pic:spPr>
+                                      </pic:pic>
+                                    </a:graphicData>
+                                  </a:graphic>
+                                </wp:inline>
+                              </w:drawing>
+                            </w:r>
+                          </w:p>
+                          <w:p>
+                            <w:pPr>
+                              <w:spacing w:before="0" w:after="0" w:line="220" w:lineRule="auto"/>
+                              <w:jc w:val="center"/>
+                            </w:pPr>
+                            <w:r>
+                              <w:rPr>
+                                <w:rFonts w:ascii="Glegoo" w:hAnsi="Glegoo" w:cs="Glegoo"/>
+                                <w:color w:val="4A4A4A"/>
+                                <w:sz w:val="12"/>
+                                <w:szCs w:val="12"/>
+                              </w:rPr>
+                              <w:t xml:space="preserve">Krebstiere</w:t>
+                            </w:r>
+                          </w:p>
+                        </w:tc>
+                        <w:tc>
+                          <w:tcPr>
+                            <w:tcW w:w="826" w:type="dxa"/>
+                            <w:tcMar>
+                              <w:top w:w="0" w:type="dxa"/>
+                              <w:bottom w:w="0" w:type="dxa"/>
+                              <w:left w:w="20" w:type="dxa"/>
+                              <w:right w:w="20" w:type="dxa"/>
+                            </w:tcMar>
+                            <w:vAlign w:val="center"/>
+                          </w:tcPr>
+                          <w:p>
+                            <w:pPr>
+                              <w:spacing w:before="0" w:after="0" w:line="240" w:lineRule="auto"/>
+                              <w:jc w:val="center"/>
+                            </w:pPr>
+                            <w:r>
+                              <w:rPr>
+                                <w:noProof/>
+                              </w:rPr>
+                              <w:drawing>
+                                <wp:inline distT="0" distB="0" distL="0" distR="0">
+                                  <wp:extent cx="237744" cy="237744"/>
+                                  <wp:effectExtent l="0" t="0" r="0" b="0"/>
+                                  <wp:docPr id="3106" name="Allergen Weichtiere" descr="Weichtiere"/>
+                                  <wp:cNvGraphicFramePr>
+                                    <a:graphicFrameLocks xmlns:a="http://schemas.openxmlformats.org/drawingml/2006/main" noChangeAspect="1"/>
+                                  </wp:cNvGraphicFramePr>
+                                  <a:graphic xmlns:a="http://schemas.openxmlformats.org/drawingml/2006/main">
+                                    <a:graphicData uri="http://schemas.openxmlformats.org/drawingml/2006/picture">
+                                      <pic:pic xmlns:pic="http://schemas.openxmlformats.org/drawingml/2006/picture">
+                                        <pic:nvPicPr>
+                                          <pic:cNvPr id="3106" name="allergen-weichtiere.png"/>
+                                          <pic:cNvPicPr/>
+                                        </pic:nvPicPr>
+                                        <pic:blipFill>
+                                          <a:blip r:embed="rIdAllergenPng6">
+                                            <a:extLst>
+                                              <a:ext uri="{96DAC541-7B7A-43D3-8B79-37D633B846F1}">
+                                                <asvg:svgBlip xmlns:asvg="http://schemas.microsoft.com/office/drawing/2016/SVG/main" r:embed="rIdAllergenSvg6"/>
+                                              </a:ext>
+                                            </a:extLst>
+                                          </a:blip>
+                                          <a:stretch>
+                                            <a:fillRect/>
+                                          </a:stretch>
+                                        </pic:blipFill>
+                                        <pic:spPr>
+                                          <a:xfrm>
+                                            <a:off x="0" y="0"/>
+                                            <a:ext cx="237744" cy="237744"/>
+                                          </a:xfrm>
+                                          <a:prstGeom prst="rect">
+                                            <a:avLst/>
+                                          </a:prstGeom>
+                                        </pic:spPr>
+                                      </pic:pic>
+                                    </a:graphicData>
+                                  </a:graphic>
+                                </wp:inline>
+                              </w:drawing>
+                            </w:r>
+                          </w:p>
+                          <w:p>
+                            <w:pPr>
+                              <w:spacing w:before="0" w:after="0" w:line="220" w:lineRule="auto"/>
+                              <w:jc w:val="center"/>
+                            </w:pPr>
+                            <w:r>
+                              <w:rPr>
+                                <w:rFonts w:ascii="Glegoo" w:hAnsi="Glegoo" w:cs="Glegoo"/>
+                                <w:color w:val="4A4A4A"/>
+                                <w:sz w:val="12"/>
+                                <w:szCs w:val="12"/>
+                              </w:rPr>
+                              <w:t xml:space="preserve">Weichtiere</w:t>
+                            </w:r>
+                          </w:p>
+                        </w:tc>
+                        <w:tc>
+                          <w:tcPr>
+                            <w:tcW w:w="557" w:type="dxa"/>
+                            <w:tcMar>
+                              <w:top w:w="0" w:type="dxa"/>
+                              <w:bottom w:w="0" w:type="dxa"/>
+                              <w:left w:w="20" w:type="dxa"/>
+                              <w:right w:w="20" w:type="dxa"/>
+                            </w:tcMar>
+                            <w:vAlign w:val="center"/>
+                          </w:tcPr>
+                          <w:p>
+                            <w:pPr>
+                              <w:spacing w:before="0" w:after="0" w:line="240" w:lineRule="auto"/>
+                              <w:jc w:val="center"/>
+                            </w:pPr>
+                            <w:r>
+                              <w:rPr>
+                                <w:noProof/>
+                              </w:rPr>
+                              <w:drawing>
+                                <wp:inline distT="0" distB="0" distL="0" distR="0">
+                                  <wp:extent cx="237744" cy="237744"/>
+                                  <wp:effectExtent l="0" t="0" r="0" b="0"/>
+                                  <wp:docPr id="3107" name="Allergen Senf" descr="Senf"/>
+                                  <wp:cNvGraphicFramePr>
+                                    <a:graphicFrameLocks xmlns:a="http://schemas.openxmlformats.org/drawingml/2006/main" noChangeAspect="1"/>
+                                  </wp:cNvGraphicFramePr>
+                                  <a:graphic xmlns:a="http://schemas.openxmlformats.org/drawingml/2006/main">
+                                    <a:graphicData uri="http://schemas.openxmlformats.org/drawingml/2006/picture">
+                                      <pic:pic xmlns:pic="http://schemas.openxmlformats.org/drawingml/2006/picture">
+                                        <pic:nvPicPr>
+                                          <pic:cNvPr id="3107" name="allergen-senf.png"/>
+                                          <pic:cNvPicPr/>
+                                        </pic:nvPicPr>
+                                        <pic:blipFill>
+                                          <a:blip r:embed="rIdAllergenPng7">
+                                            <a:extLst>
+                                              <a:ext uri="{96DAC541-7B7A-43D3-8B79-37D633B846F1}">
+                                                <asvg:svgBlip xmlns:asvg="http://schemas.microsoft.com/office/drawing/2016/SVG/main" r:embed="rIdAllergenSvg7"/>
+                                              </a:ext>
+                                            </a:extLst>
+                                          </a:blip>
+                                          <a:stretch>
+                                            <a:fillRect/>
+                                          </a:stretch>
+                                        </pic:blipFill>
+                                        <pic:spPr>
+                                          <a:xfrm>
+                                            <a:off x="0" y="0"/>
+                                            <a:ext cx="237744" cy="237744"/>
+                                          </a:xfrm>
+                                          <a:prstGeom prst="rect">
+                                            <a:avLst/>
+                                          </a:prstGeom>
+                                        </pic:spPr>
+                                      </pic:pic>
+                                    </a:graphicData>
+                                  </a:graphic>
+                                </wp:inline>
+                              </w:drawing>
+                            </w:r>
+                          </w:p>
+                          <w:p>
+                            <w:pPr>
+                              <w:spacing w:before="0" w:after="0" w:line="220" w:lineRule="auto"/>
+                              <w:jc w:val="center"/>
+                            </w:pPr>
+                            <w:r>
+                              <w:rPr>
+                                <w:rFonts w:ascii="Glegoo" w:hAnsi="Glegoo" w:cs="Glegoo"/>
+                                <w:color w:val="4A4A4A"/>
+                                <w:sz w:val="12"/>
+                                <w:szCs w:val="12"/>
+                              </w:rPr>
+                              <w:t xml:space="preserve">Senf</w:t>
+                            </w:r>
+                          </w:p>
+                        </w:tc>
+                        <w:tc>
+                          <w:tcPr>
+                            <w:tcW w:w="1090" w:type="dxa"/>
+                            <w:tcMar>
+                              <w:top w:w="0" w:type="dxa"/>
+                              <w:bottom w:w="0" w:type="dxa"/>
+                              <w:left w:w="20" w:type="dxa"/>
+                              <w:right w:w="20" w:type="dxa"/>
+                            </w:tcMar>
+                            <w:vAlign w:val="center"/>
+                          </w:tcPr>
+                          <w:p>
+                            <w:pPr>
+                              <w:spacing w:before="0" w:after="0" w:line="240" w:lineRule="auto"/>
+                              <w:jc w:val="center"/>
+                            </w:pPr>
+                            <w:r>
+                              <w:rPr>
+                                <w:noProof/>
+                              </w:rPr>
+                              <w:drawing>
+                                <wp:inline distT="0" distB="0" distL="0" distR="0">
+                                  <wp:extent cx="237744" cy="237744"/>
+                                  <wp:effectExtent l="0" t="0" r="0" b="0"/>
+                                  <wp:docPr id="3108" name="Allergen Schalenfrüchte" descr="Schalenfrüchte"/>
+                                  <wp:cNvGraphicFramePr>
+                                    <a:graphicFrameLocks xmlns:a="http://schemas.openxmlformats.org/drawingml/2006/main" noChangeAspect="1"/>
+                                  </wp:cNvGraphicFramePr>
+                                  <a:graphic xmlns:a="http://schemas.openxmlformats.org/drawingml/2006/main">
+                                    <a:graphicData uri="http://schemas.openxmlformats.org/drawingml/2006/picture">
+                                      <pic:pic xmlns:pic="http://schemas.openxmlformats.org/drawingml/2006/picture">
+                                        <pic:nvPicPr>
+                                          <pic:cNvPr id="3108" name="allergen-schalenfruechte.png"/>
+                                          <pic:cNvPicPr/>
+                                        </pic:nvPicPr>
+                                        <pic:blipFill>
+                                          <a:blip r:embed="rIdAllergenPng8">
+                                            <a:extLst>
+                                              <a:ext uri="{96DAC541-7B7A-43D3-8B79-37D633B846F1}">
+                                                <asvg:svgBlip xmlns:asvg="http://schemas.microsoft.com/office/drawing/2016/SVG/main" r:embed="rIdAllergenSvg8"/>
+                                              </a:ext>
+                                            </a:extLst>
+                                          </a:blip>
+                                          <a:stretch>
+                                            <a:fillRect/>
+                                          </a:stretch>
+                                        </pic:blipFill>
+                                        <pic:spPr>
+                                          <a:xfrm>
+                                            <a:off x="0" y="0"/>
+                                            <a:ext cx="237744" cy="237744"/>
+                                          </a:xfrm>
+                                          <a:prstGeom prst="rect">
+                                            <a:avLst/>
+                                          </a:prstGeom>
+                                        </pic:spPr>
+                                      </pic:pic>
+                                    </a:graphicData>
+                                  </a:graphic>
+                                </wp:inline>
+                              </w:drawing>
+                            </w:r>
+                          </w:p>
+                          <w:p>
+                            <w:pPr>
+                              <w:spacing w:before="0" w:after="0" w:line="220" w:lineRule="auto"/>
+                              <w:jc w:val="center"/>
+                            </w:pPr>
+                            <w:r>
+                              <w:rPr>
+                                <w:rFonts w:ascii="Glegoo" w:hAnsi="Glegoo" w:cs="Glegoo"/>
+                                <w:color w:val="4A4A4A"/>
+                                <w:sz w:val="12"/>
+                                <w:szCs w:val="12"/>
+                              </w:rPr>
+                              <w:t xml:space="preserve">Schalenfrüchte</w:t>
+                            </w:r>
+                          </w:p>
+                        </w:tc>
+                        <w:tc>
+                          <w:tcPr>
+                            <w:tcW w:w="763" w:type="dxa"/>
+                            <w:tcMar>
+                              <w:top w:w="0" w:type="dxa"/>
+                              <w:bottom w:w="0" w:type="dxa"/>
+                              <w:left w:w="20" w:type="dxa"/>
+                              <w:right w:w="20" w:type="dxa"/>
+                            </w:tcMar>
+                            <w:vAlign w:val="center"/>
+                          </w:tcPr>
+                          <w:p>
+                            <w:pPr>
+                              <w:spacing w:before="0" w:after="0" w:line="240" w:lineRule="auto"/>
+                              <w:jc w:val="center"/>
+                            </w:pPr>
+                            <w:r>
+                              <w:rPr>
+                                <w:noProof/>
+                              </w:rPr>
+                              <w:drawing>
+                                <wp:inline distT="0" distB="0" distL="0" distR="0">
+                                  <wp:extent cx="237744" cy="237744"/>
+                                  <wp:effectExtent l="0" t="0" r="0" b="0"/>
+                                  <wp:docPr id="3109" name="Allergen Erdnüsse" descr="Erdnüsse"/>
+                                  <wp:cNvGraphicFramePr>
+                                    <a:graphicFrameLocks xmlns:a="http://schemas.openxmlformats.org/drawingml/2006/main" noChangeAspect="1"/>
+                                  </wp:cNvGraphicFramePr>
+                                  <a:graphic xmlns:a="http://schemas.openxmlformats.org/drawingml/2006/main">
+                                    <a:graphicData uri="http://schemas.openxmlformats.org/drawingml/2006/picture">
+                                      <pic:pic xmlns:pic="http://schemas.openxmlformats.org/drawingml/2006/picture">
+                                        <pic:nvPicPr>
+                                          <pic:cNvPr id="3109" name="allergen-erdnuesse.png"/>
+                                          <pic:cNvPicPr/>
+                                        </pic:nvPicPr>
+                                        <pic:blipFill>
+                                          <a:blip r:embed="rIdAllergenPng9">
+                                            <a:extLst>
+                                              <a:ext uri="{96DAC541-7B7A-43D3-8B79-37D633B846F1}">
+                                                <asvg:svgBlip xmlns:asvg="http://schemas.microsoft.com/office/drawing/2016/SVG/main" r:embed="rIdAllergenSvg9"/>
+                                              </a:ext>
+                                            </a:extLst>
+                                          </a:blip>
+                                          <a:stretch>
+                                            <a:fillRect/>
+                                          </a:stretch>
+                                        </pic:blipFill>
+                                        <pic:spPr>
+                                          <a:xfrm>
+                                            <a:off x="0" y="0"/>
+                                            <a:ext cx="237744" cy="237744"/>
+                                          </a:xfrm>
+                                          <a:prstGeom prst="rect">
+                                            <a:avLst/>
+                                          </a:prstGeom>
+                                        </pic:spPr>
+                                      </pic:pic>
+                                    </a:graphicData>
+                                  </a:graphic>
+                                </wp:inline>
+                              </w:drawing>
+                            </w:r>
+                          </w:p>
+                          <w:p>
+                            <w:pPr>
+                              <w:spacing w:before="0" w:after="0" w:line="220" w:lineRule="auto"/>
+                              <w:jc w:val="center"/>
+                            </w:pPr>
+                            <w:r>
+                              <w:rPr>
+                                <w:rFonts w:ascii="Glegoo" w:hAnsi="Glegoo" w:cs="Glegoo"/>
+                                <w:color w:val="4A4A4A"/>
+                                <w:sz w:val="12"/>
+                                <w:szCs w:val="12"/>
+                              </w:rPr>
+                              <w:t xml:space="preserve">Erdnüsse</w:t>
+                            </w:r>
+                          </w:p>
+                        </w:tc>
+                        <w:tc>
+                          <w:tcPr>
+                            <w:tcW w:w="581" w:type="dxa"/>
+                            <w:tcMar>
+                              <w:top w:w="0" w:type="dxa"/>
+                              <w:bottom w:w="0" w:type="dxa"/>
+                              <w:left w:w="20" w:type="dxa"/>
+                              <w:right w:w="20" w:type="dxa"/>
+                            </w:tcMar>
+                            <w:vAlign w:val="center"/>
+                          </w:tcPr>
+                          <w:p>
+                            <w:pPr>
+                              <w:spacing w:before="0" w:after="0" w:line="240" w:lineRule="auto"/>
+                              <w:jc w:val="center"/>
+                            </w:pPr>
+                            <w:r>
+                              <w:rPr>
+                                <w:noProof/>
+                              </w:rPr>
+                              <w:drawing>
+                                <wp:inline distT="0" distB="0" distL="0" distR="0">
+                                  <wp:extent cx="237744" cy="237744"/>
+                                  <wp:effectExtent l="0" t="0" r="0" b="0"/>
+                                  <wp:docPr id="3110" name="Allergen Sesam" descr="Sesam"/>
+                                  <wp:cNvGraphicFramePr>
+                                    <a:graphicFrameLocks xmlns:a="http://schemas.openxmlformats.org/drawingml/2006/main" noChangeAspect="1"/>
+                                  </wp:cNvGraphicFramePr>
+                                  <a:graphic xmlns:a="http://schemas.openxmlformats.org/drawingml/2006/main">
+                                    <a:graphicData uri="http://schemas.openxmlformats.org/drawingml/2006/picture">
+                                      <pic:pic xmlns:pic="http://schemas.openxmlformats.org/drawingml/2006/picture">
+                                        <pic:nvPicPr>
+                                          <pic:cNvPr id="3110" name="allergen-sesam.png"/>
+                                          <pic:cNvPicPr/>
+                                        </pic:nvPicPr>
+                                        <pic:blipFill>
+                                          <a:blip r:embed="rIdAllergenPng10">
+                                            <a:extLst>
+                                              <a:ext uri="{96DAC541-7B7A-43D3-8B79-37D633B846F1}">
+                                                <asvg:svgBlip xmlns:asvg="http://schemas.microsoft.com/office/drawing/2016/SVG/main" r:embed="rIdAllergenSvg10"/>
+                                              </a:ext>
+                                            </a:extLst>
+                                          </a:blip>
+                                          <a:stretch>
+                                            <a:fillRect/>
+                                          </a:stretch>
+                                        </pic:blipFill>
+                                        <pic:spPr>
+                                          <a:xfrm>
+                                            <a:off x="0" y="0"/>
+                                            <a:ext cx="237744" cy="237744"/>
+                                          </a:xfrm>
+                                          <a:prstGeom prst="rect">
+                                            <a:avLst/>
+                                          </a:prstGeom>
+                                        </pic:spPr>
+                                      </pic:pic>
+                                    </a:graphicData>
+                                  </a:graphic>
+                                </wp:inline>
+                              </w:drawing>
+                            </w:r>
+                          </w:p>
+                          <w:p>
+                            <w:pPr>
+                              <w:spacing w:before="0" w:after="0" w:line="220" w:lineRule="auto"/>
+                              <w:jc w:val="center"/>
+                            </w:pPr>
+                            <w:r>
+                              <w:rPr>
+                                <w:rFonts w:ascii="Glegoo" w:hAnsi="Glegoo" w:cs="Glegoo"/>
+                                <w:color w:val="4A4A4A"/>
+                                <w:sz w:val="12"/>
+                                <w:szCs w:val="12"/>
+                              </w:rPr>
+                              <w:t xml:space="preserve">Sesam</w:t>
+                            </w:r>
+                          </w:p>
+                        </w:tc>
+                        <w:tc>
+                          <w:tcPr>
+                            <w:tcW w:w="566" w:type="dxa"/>
+                            <w:tcMar>
+                              <w:top w:w="0" w:type="dxa"/>
+                              <w:bottom w:w="0" w:type="dxa"/>
+                              <w:left w:w="20" w:type="dxa"/>
+                              <w:right w:w="20" w:type="dxa"/>
+                            </w:tcMar>
+                            <w:vAlign w:val="center"/>
+                          </w:tcPr>
+                          <w:p>
+                            <w:pPr>
+                              <w:spacing w:before="0" w:after="0" w:line="240" w:lineRule="auto"/>
+                              <w:jc w:val="center"/>
+                            </w:pPr>
+                            <w:r>
+                              <w:rPr>
+                                <w:noProof/>
+                              </w:rPr>
+                              <w:drawing>
+                                <wp:inline distT="0" distB="0" distL="0" distR="0">
+                                  <wp:extent cx="237744" cy="237744"/>
+                                  <wp:effectExtent l="0" t="0" r="0" b="0"/>
+                                  <wp:docPr id="3111" name="Allergen Soja" descr="Soja"/>
+                                  <wp:cNvGraphicFramePr>
+                                    <a:graphicFrameLocks xmlns:a="http://schemas.openxmlformats.org/drawingml/2006/main" noChangeAspect="1"/>
+                                  </wp:cNvGraphicFramePr>
+                                  <a:graphic xmlns:a="http://schemas.openxmlformats.org/drawingml/2006/main">
+                                    <a:graphicData uri="http://schemas.openxmlformats.org/drawingml/2006/picture">
+                                      <pic:pic xmlns:pic="http://schemas.openxmlformats.org/drawingml/2006/picture">
+                                        <pic:nvPicPr>
+                                          <pic:cNvPr id="3111" name="allergen-soja.png"/>
+                                          <pic:cNvPicPr/>
+                                        </pic:nvPicPr>
+                                        <pic:blipFill>
+                                          <a:blip r:embed="rIdAllergenPng11">
+                                            <a:extLst>
+                                              <a:ext uri="{96DAC541-7B7A-43D3-8B79-37D633B846F1}">
+                                                <asvg:svgBlip xmlns:asvg="http://schemas.microsoft.com/office/drawing/2016/SVG/main" r:embed="rIdAllergenSvg11"/>
+                                              </a:ext>
+                                            </a:extLst>
+                                          </a:blip>
+                                          <a:stretch>
+                                            <a:fillRect/>
+                                          </a:stretch>
+                                        </pic:blipFill>
+                                        <pic:spPr>
+                                          <a:xfrm>
+                                            <a:off x="0" y="0"/>
+                                            <a:ext cx="237744" cy="237744"/>
+                                          </a:xfrm>
+                                          <a:prstGeom prst="rect">
+                                            <a:avLst/>
+                                          </a:prstGeom>
+                                        </pic:spPr>
+                                      </pic:pic>
+                                    </a:graphicData>
+                                  </a:graphic>
+                                </wp:inline>
+                              </w:drawing>
+                            </w:r>
+                          </w:p>
+                          <w:p>
+                            <w:pPr>
+                              <w:spacing w:before="0" w:after="0" w:line="220" w:lineRule="auto"/>
+                              <w:jc w:val="center"/>
+                            </w:pPr>
+                            <w:r>
+                              <w:rPr>
+                                <w:rFonts w:ascii="Glegoo" w:hAnsi="Glegoo" w:cs="Glegoo"/>
+                                <w:color w:val="4A4A4A"/>
+                                <w:sz w:val="12"/>
+                                <w:szCs w:val="12"/>
+                              </w:rPr>
+                              <w:t xml:space="preserve">Soja</w:t>
+                            </w:r>
+                          </w:p>
+                        </w:tc>
+                        <w:tc>
+                          <w:tcPr>
+                            <w:tcW w:w="600" w:type="dxa"/>
+                            <w:tcMar>
+                              <w:top w:w="0" w:type="dxa"/>
+                              <w:bottom w:w="0" w:type="dxa"/>
+                              <w:left w:w="20" w:type="dxa"/>
+                              <w:right w:w="20" w:type="dxa"/>
+                            </w:tcMar>
+                            <w:vAlign w:val="center"/>
+                          </w:tcPr>
+                          <w:p>
+                            <w:pPr>
+                              <w:spacing w:before="0" w:after="0" w:line="240" w:lineRule="auto"/>
+                              <w:jc w:val="center"/>
+                            </w:pPr>
+                            <w:r>
+                              <w:rPr>
+                                <w:noProof/>
+                              </w:rPr>
+                              <w:drawing>
+                                <wp:inline distT="0" distB="0" distL="0" distR="0">
+                                  <wp:extent cx="237744" cy="237744"/>
+                                  <wp:effectExtent l="0" t="0" r="0" b="0"/>
+                                  <wp:docPr id="3112" name="Allergen Lupine" descr="Lupine"/>
+                                  <wp:cNvGraphicFramePr>
+                                    <a:graphicFrameLocks xmlns:a="http://schemas.openxmlformats.org/drawingml/2006/main" noChangeAspect="1"/>
+                                  </wp:cNvGraphicFramePr>
+                                  <a:graphic xmlns:a="http://schemas.openxmlformats.org/drawingml/2006/main">
+                                    <a:graphicData uri="http://schemas.openxmlformats.org/drawingml/2006/picture">
+                                      <pic:pic xmlns:pic="http://schemas.openxmlformats.org/drawingml/2006/picture">
+                                        <pic:nvPicPr>
+                                          <pic:cNvPr id="3112" name="allergen-lupine.png"/>
+                                          <pic:cNvPicPr/>
+                                        </pic:nvPicPr>
+                                        <pic:blipFill>
+                                          <a:blip r:embed="rIdAllergenPng12">
+                                            <a:extLst>
+                                              <a:ext uri="{96DAC541-7B7A-43D3-8B79-37D633B846F1}">
+                                                <asvg:svgBlip xmlns:asvg="http://schemas.microsoft.com/office/drawing/2016/SVG/main" r:embed="rIdAllergenSvg12"/>
+                                              </a:ext>
+                                            </a:extLst>
+                                          </a:blip>
+                                          <a:stretch>
+                                            <a:fillRect/>
+                                          </a:stretch>
+                                        </pic:blipFill>
+                                        <pic:spPr>
+                                          <a:xfrm>
+                                            <a:off x="0" y="0"/>
+                                            <a:ext cx="237744" cy="237744"/>
+                                          </a:xfrm>
+                                          <a:prstGeom prst="rect">
+                                            <a:avLst/>
+                                          </a:prstGeom>
+                                        </pic:spPr>
+                                      </pic:pic>
+                                    </a:graphicData>
+                                  </a:graphic>
+                                </wp:inline>
+                              </w:drawing>
+                            </w:r>
+                          </w:p>
+                          <w:p>
+                            <w:pPr>
+                              <w:spacing w:before="0" w:after="0" w:line="220" w:lineRule="auto"/>
+                              <w:jc w:val="center"/>
+                            </w:pPr>
+                            <w:r>
+                              <w:rPr>
+                                <w:rFonts w:ascii="Glegoo" w:hAnsi="Glegoo" w:cs="Glegoo"/>
+                                <w:color w:val="4A4A4A"/>
+                                <w:sz w:val="12"/>
+                                <w:szCs w:val="12"/>
+                              </w:rPr>
+                              <w:t xml:space="preserve">Lupine</w:t>
+                            </w:r>
+                          </w:p>
+                        </w:tc>
+                        <w:tc>
+                          <w:tcPr>
+                            <w:tcW w:w="624" w:type="dxa"/>
+                            <w:tcMar>
+                              <w:top w:w="0" w:type="dxa"/>
+                              <w:bottom w:w="0" w:type="dxa"/>
+                              <w:left w:w="20" w:type="dxa"/>
+                              <w:right w:w="20" w:type="dxa"/>
+                            </w:tcMar>
+                            <w:vAlign w:val="center"/>
+                          </w:tcPr>
+                          <w:p>
+                            <w:pPr>
+                              <w:spacing w:before="0" w:after="0" w:line="240" w:lineRule="auto"/>
+                              <w:jc w:val="center"/>
+                            </w:pPr>
+                            <w:r>
+                              <w:rPr>
+                                <w:noProof/>
+                              </w:rPr>
+                              <w:drawing>
+                                <wp:inline distT="0" distB="0" distL="0" distR="0">
+                                  <wp:extent cx="237744" cy="237744"/>
+                                  <wp:effectExtent l="0" t="0" r="0" b="0"/>
+                                  <wp:docPr id="3113" name="Allergen Sellerie" descr="Sellerie"/>
+                                  <wp:cNvGraphicFramePr>
+                                    <a:graphicFrameLocks xmlns:a="http://schemas.openxmlformats.org/drawingml/2006/main" noChangeAspect="1"/>
+                                  </wp:cNvGraphicFramePr>
+                                  <a:graphic xmlns:a="http://schemas.openxmlformats.org/drawingml/2006/main">
+                                    <a:graphicData uri="http://schemas.openxmlformats.org/drawingml/2006/picture">
+                                      <pic:pic xmlns:pic="http://schemas.openxmlformats.org/drawingml/2006/picture">
+                                        <pic:nvPicPr>
+                                          <pic:cNvPr id="3113" name="allergen-sellerie.png"/>
+                                          <pic:cNvPicPr/>
+                                        </pic:nvPicPr>
+                                        <pic:blipFill>
+                                          <a:blip r:embed="rIdAllergenPng13">
+                                            <a:extLst>
+                                              <a:ext uri="{96DAC541-7B7A-43D3-8B79-37D633B846F1}">
+                                                <asvg:svgBlip xmlns:asvg="http://schemas.microsoft.com/office/drawing/2016/SVG/main" r:embed="rIdAllergenSvg13"/>
+                                              </a:ext>
+                                            </a:extLst>
+                                          </a:blip>
+                                          <a:stretch>
+                                            <a:fillRect/>
+                                          </a:stretch>
+                                        </pic:blipFill>
+                                        <pic:spPr>
+                                          <a:xfrm>
+                                            <a:off x="0" y="0"/>
+                                            <a:ext cx="237744" cy="237744"/>
+                                          </a:xfrm>
+                                          <a:prstGeom prst="rect">
+                                            <a:avLst/>
+                                          </a:prstGeom>
+                                        </pic:spPr>
+                                      </pic:pic>
+                                    </a:graphicData>
+                                  </a:graphic>
+                                </wp:inline>
+                              </w:drawing>
+                            </w:r>
+                          </w:p>
+                          <w:p>
+                            <w:pPr>
+                              <w:spacing w:before="0" w:after="0" w:line="220" w:lineRule="auto"/>
+                              <w:jc w:val="center"/>
+                            </w:pPr>
+                            <w:r>
+                              <w:rPr>
+                                <w:rFonts w:ascii="Glegoo" w:hAnsi="Glegoo" w:cs="Glegoo"/>
+                                <w:color w:val="4A4A4A"/>
+                                <w:sz w:val="12"/>
+                                <w:szCs w:val="12"/>
+                              </w:rPr>
+                              <w:t xml:space="preserve">Sellerie</w:t>
+                            </w:r>
+                          </w:p>
+                        </w:tc>
+                        <w:tc>
+                          <w:tcPr>
+                            <w:tcW w:w="1435" w:type="dxa"/>
+                            <w:tcMar>
+                              <w:top w:w="0" w:type="dxa"/>
+                              <w:bottom w:w="0" w:type="dxa"/>
+                              <w:left w:w="20" w:type="dxa"/>
+                              <w:right w:w="20" w:type="dxa"/>
+                            </w:tcMar>
+                            <w:vAlign w:val="center"/>
+                          </w:tcPr>
+                          <w:p>
+                            <w:pPr>
+                              <w:spacing w:before="0" w:after="0" w:line="240" w:lineRule="auto"/>
+                              <w:jc w:val="center"/>
+                            </w:pPr>
+                            <w:r>
+                              <w:rPr>
+                                <w:noProof/>
+                              </w:rPr>
+                              <w:drawing>
+                                <wp:inline distT="0" distB="0" distL="0" distR="0">
+                                  <wp:extent cx="237744" cy="237744"/>
+                                  <wp:effectExtent l="0" t="0" r="0" b="0"/>
+                                  <wp:docPr id="3114" name="Allergen Schwefeldioxid u. Sulfite" descr="Schwefeldioxid u. Sulfite"/>
+                                  <wp:cNvGraphicFramePr>
+                                    <a:graphicFrameLocks xmlns:a="http://schemas.openxmlformats.org/drawingml/2006/main" noChangeAspect="1"/>
+                                  </wp:cNvGraphicFramePr>
+                                  <a:graphic xmlns:a="http://schemas.openxmlformats.org/drawingml/2006/main">
+                                    <a:graphicData uri="http://schemas.openxmlformats.org/drawingml/2006/picture">
+                                      <pic:pic xmlns:pic="http://schemas.openxmlformats.org/drawingml/2006/picture">
+                                        <pic:nvPicPr>
+                                          <pic:cNvPr id="3114" name="allergen-sulfite.png"/>
+                                          <pic:cNvPicPr/>
+                                        </pic:nvPicPr>
+                                        <pic:blipFill>
+                                          <a:blip r:embed="rIdAllergenPng14">
+                                            <a:extLst>
+                                              <a:ext uri="{96DAC541-7B7A-43D3-8B79-37D633B846F1}">
+                                                <asvg:svgBlip xmlns:asvg="http://schemas.microsoft.com/office/drawing/2016/SVG/main" r:embed="rIdAllergenSvg14"/>
+                                              </a:ext>
+                                            </a:extLst>
+                                          </a:blip>
+                                          <a:stretch>
+                                            <a:fillRect/>
+                                          </a:stretch>
+                                        </pic:blipFill>
+                                        <pic:spPr>
+                                          <a:xfrm>
+                                            <a:off x="0" y="0"/>
+                                            <a:ext cx="237744" cy="237744"/>
+                                          </a:xfrm>
+                                          <a:prstGeom prst="rect">
+                                            <a:avLst/>
+                                          </a:prstGeom>
+                                        </pic:spPr>
+                                      </pic:pic>
+                                    </a:graphicData>
+                                  </a:graphic>
+                                </wp:inline>
+                              </w:drawing>
+                            </w:r>
+                          </w:p>
+                          <w:p>
+                            <w:pPr>
+                              <w:spacing w:before="0" w:after="0" w:line="200" w:lineRule="auto"/>
+                              <w:jc w:val="center"/>
+                            </w:pPr>
+                            <w:r>
+                              <w:rPr>
+                                <w:rFonts w:ascii="Glegoo" w:hAnsi="Glegoo" w:cs="Glegoo"/>
+                                <w:color w:val="4A4A4A"/>
+                                <w:sz w:val="10"/>
+                                <w:szCs w:val="10"/>
+                              </w:rPr>
+                              <w:t xml:space="preserve">Schwefeldioxid u. Sulfit &gt;10 mg/kg, ltr.</w:t>
+                            </w:r>
+                          </w:p>
+                        </w:tc>
+                      </w:tr>
+                      <w:tr>
+                        <w:trPr>
+                          <w:cantSplit/>
+                          <w:trHeight w:val="361" w:hRule="exact"/>
+                        </w:trPr>
+                        <w:tc>
+                          <w:tcPr>
+                            <w:tcW w:w="514" w:type="dxa"/>
+                            <w:tcMar>
+                              <w:top w:w="0" w:type="dxa"/>
+                              <w:bottom w:w="0" w:type="dxa"/>
+                              <w:left w:w="20" w:type="dxa"/>
+                              <w:right w:w="20" w:type="dxa"/>
+                            </w:tcMar>
+                            <w:vAlign w:val="center"/>
+                          </w:tcPr>
+                          <w:p>
+                            <w:pPr>
+                              <w:spacing w:before="0" w:after="0" w:line="240" w:lineRule="auto"/>
+                              <w:ind w:left="90"/>
+                              <w:jc w:val="left"/>
+                            </w:pPr>
+                            <w:r>
+                              <w:rPr>
+                                <w:rFonts w:ascii="Glegoo" w:hAnsi="Glegoo" w:cs="Glegoo"/>
+                                <w:color w:val="658C43"/>
+                                <w:sz w:val="15"/>
+                                <w:szCs w:val="15"/>
+                              </w:rPr>
+                              <w:t xml:space="preserve">Di.</w:t>
+                            </w:r>
+                          </w:p>
+                        </w:tc>
+                        <w:tc>
+                          <w:tcPr>
+                            <w:tcW w:w="634" w:type="dxa"/>
+                            <w:tcMar>
+                              <w:top w:w="0" w:type="dxa"/>
+                              <w:bottom w:w="0" w:type="dxa"/>
+                              <w:left w:w="20" w:type="dxa"/>
+                              <w:right w:w="20" w:type="dxa"/>
+                            </w:tcMar>
+                            <w:vAlign w:val="center"/>
+                          </w:tcPr>
+                          <w:p>
+                            <w:pPr>
+                              <w:spacing w:before="0" w:after="0" w:line="240" w:lineRule="auto"/>
+                              <w:jc w:val="center"/>
+                            </w:pPr>
+                            <w:r>
+                              <w:rPr>
+                                <w:rFonts w:ascii="Indie Flower" w:hAnsi="Indie Flower" w:cs="Indie Flower"/>
+                                <w:color w:val="658C43"/>
+                                <w:sz w:val="24"/>
+                                <w:szCs w:val="24"/>
+                              </w:rPr>
+                              <w:t/>
+                            </w:r>
+                          </w:p>
+                        </w:tc>
+                        <w:tc>
+                          <w:tcPr>
+                            <w:tcW w:w="605" w:type="dxa"/>
+                            <w:tcMar>
+                              <w:top w:w="0" w:type="dxa"/>
+                              <w:bottom w:w="0" w:type="dxa"/>
+                              <w:left w:w="20" w:type="dxa"/>
+                              <w:right w:w="20" w:type="dxa"/>
+                            </w:tcMar>
+                            <w:vAlign w:val="center"/>
+                          </w:tcPr>
+                          <w:p>
+                            <w:pPr>
+                              <w:spacing w:before="0" w:after="0" w:line="240" w:lineRule="auto"/>
+                              <w:jc w:val="center"/>
+                            </w:pPr>
+                            <w:r>
+                              <w:rPr>
+                                <w:rFonts w:ascii="Indie Flower" w:hAnsi="Indie Flower" w:cs="Indie Flower"/>
+                                <w:color w:val="658C43"/>
+                                <w:sz w:val="24"/>
+                                <w:szCs w:val="24"/>
+                              </w:rPr>
+                              <w:t/>
+                            </w:r>
+                          </w:p>
+                        </w:tc>
+                        <w:tc>
+                          <w:tcPr>
+                            <w:tcW w:w="590" w:type="dxa"/>
+                            <w:tcMar>
+                              <w:top w:w="0" w:type="dxa"/>
+                              <w:bottom w:w="0" w:type="dxa"/>
+                              <w:left w:w="20" w:type="dxa"/>
+                              <w:right w:w="20" w:type="dxa"/>
+                            </w:tcMar>
+                            <w:vAlign w:val="center"/>
+                          </w:tcPr>
+                          <w:p>
+                            <w:pPr>
+                              <w:spacing w:before="0" w:after="0" w:line="240" w:lineRule="auto"/>
+                              <w:jc w:val="center"/>
+                            </w:pPr>
+                            <w:r>
+                              <w:rPr>
+                                <w:rFonts w:ascii="Indie Flower" w:hAnsi="Indie Flower" w:cs="Indie Flower"/>
+                                <w:color w:val="658C43"/>
+                                <w:sz w:val="24"/>
+                                <w:szCs w:val="24"/>
+                              </w:rPr>
+                              <w:t/>
+                            </w:r>
+                          </w:p>
+                        </w:tc>
+                        <w:tc>
+                          <w:tcPr>
+                            <w:tcW w:w="576" w:type="dxa"/>
+                            <w:tcMar>
+                              <w:top w:w="0" w:type="dxa"/>
+                              <w:bottom w:w="0" w:type="dxa"/>
+                              <w:left w:w="20" w:type="dxa"/>
+                              <w:right w:w="20" w:type="dxa"/>
+                            </w:tcMar>
+                            <w:vAlign w:val="center"/>
+                          </w:tcPr>
+                          <w:p>
+                            <w:pPr>
+                              <w:spacing w:before="0" w:after="0" w:line="240" w:lineRule="auto"/>
+                              <w:jc w:val="center"/>
+                            </w:pPr>
+                            <w:r>
+                              <w:rPr>
+                                <w:rFonts w:ascii="Indie Flower" w:hAnsi="Indie Flower" w:cs="Indie Flower"/>
+                                <w:color w:val="658C43"/>
+                                <w:sz w:val="24"/>
+                                <w:szCs w:val="24"/>
+                              </w:rPr>
+                              <w:t/>
+                            </w:r>
+                          </w:p>
+                        </w:tc>
+                        <w:tc>
+                          <w:tcPr>
+                            <w:tcW w:w="806" w:type="dxa"/>
+                            <w:tcMar>
+                              <w:top w:w="0" w:type="dxa"/>
+                              <w:bottom w:w="0" w:type="dxa"/>
+                              <w:left w:w="20" w:type="dxa"/>
+                              <w:right w:w="20" w:type="dxa"/>
+                            </w:tcMar>
+                            <w:vAlign w:val="center"/>
+                          </w:tcPr>
+                          <w:p>
+                            <w:pPr>
+                              <w:spacing w:before="0" w:after="0" w:line="240" w:lineRule="auto"/>
+                              <w:jc w:val="center"/>
+                            </w:pPr>
+                            <w:r>
+                              <w:rPr>
+                                <w:rFonts w:ascii="Indie Flower" w:hAnsi="Indie Flower" w:cs="Indie Flower"/>
+                                <w:color w:val="658C43"/>
+                                <w:sz w:val="24"/>
+                                <w:szCs w:val="24"/>
+                              </w:rPr>
+                              <w:t/>
+                            </w:r>
+                          </w:p>
+                        </w:tc>
+                        <w:tc>
+                          <w:tcPr>
+                            <w:tcW w:w="826" w:type="dxa"/>
+                            <w:tcMar>
+                              <w:top w:w="0" w:type="dxa"/>
+                              <w:bottom w:w="0" w:type="dxa"/>
+                              <w:left w:w="20" w:type="dxa"/>
+                              <w:right w:w="20" w:type="dxa"/>
+                            </w:tcMar>
+                            <w:vAlign w:val="center"/>
+                          </w:tcPr>
+                          <w:p>
+                            <w:pPr>
+                              <w:spacing w:before="0" w:after="0" w:line="240" w:lineRule="auto"/>
+                              <w:jc w:val="center"/>
+                            </w:pPr>
+                            <w:r>
+                              <w:rPr>
+                                <w:rFonts w:ascii="Indie Flower" w:hAnsi="Indie Flower" w:cs="Indie Flower"/>
+                                <w:color w:val="658C43"/>
+                                <w:sz w:val="24"/>
+                                <w:szCs w:val="24"/>
+                              </w:rPr>
+                              <w:t/>
+                            </w:r>
+                          </w:p>
+                        </w:tc>
+                        <w:tc>
+                          <w:tcPr>
+                            <w:tcW w:w="557" w:type="dxa"/>
+                            <w:tcMar>
+                              <w:top w:w="0" w:type="dxa"/>
+                              <w:bottom w:w="0" w:type="dxa"/>
+                              <w:left w:w="20" w:type="dxa"/>
+                              <w:right w:w="20" w:type="dxa"/>
+                            </w:tcMar>
+                            <w:vAlign w:val="center"/>
+                          </w:tcPr>
+                          <w:p>
+                            <w:pPr>
+                              <w:spacing w:before="0" w:after="0" w:line="240" w:lineRule="auto"/>
+                              <w:jc w:val="center"/>
+                            </w:pPr>
+                            <w:r>
+                              <w:rPr>
+                                <w:rFonts w:ascii="Indie Flower" w:hAnsi="Indie Flower" w:cs="Indie Flower"/>
+                                <w:color w:val="658C43"/>
+                                <w:sz w:val="24"/>
+                                <w:szCs w:val="24"/>
+                              </w:rPr>
+                              <w:t/>
+                            </w:r>
+                          </w:p>
+                        </w:tc>
+                        <w:tc>
+                          <w:tcPr>
+                            <w:tcW w:w="1090" w:type="dxa"/>
+                            <w:tcMar>
+                              <w:top w:w="0" w:type="dxa"/>
+                              <w:bottom w:w="0" w:type="dxa"/>
+                              <w:left w:w="20" w:type="dxa"/>
+                              <w:right w:w="20" w:type="dxa"/>
+                            </w:tcMar>
+                            <w:vAlign w:val="center"/>
+                          </w:tcPr>
+                          <w:p>
+                            <w:pPr>
+                              <w:spacing w:before="0" w:after="0" w:line="240" w:lineRule="auto"/>
+                              <w:jc w:val="center"/>
+                            </w:pPr>
+                            <w:r>
+                              <w:rPr>
+                                <w:rFonts w:ascii="Indie Flower" w:hAnsi="Indie Flower" w:cs="Indie Flower"/>
+                                <w:color w:val="658C43"/>
+                                <w:sz w:val="24"/>
+                                <w:szCs w:val="24"/>
+                              </w:rPr>
+                              <w:t/>
+                            </w:r>
+                          </w:p>
+                        </w:tc>
+                        <w:tc>
+                          <w:tcPr>
+                            <w:tcW w:w="763" w:type="dxa"/>
+                            <w:tcMar>
+                              <w:top w:w="0" w:type="dxa"/>
+                              <w:bottom w:w="0" w:type="dxa"/>
+                              <w:left w:w="20" w:type="dxa"/>
+                              <w:right w:w="20" w:type="dxa"/>
+                            </w:tcMar>
+                            <w:vAlign w:val="center"/>
+                          </w:tcPr>
+                          <w:p>
+                            <w:pPr>
+                              <w:spacing w:before="0" w:after="0" w:line="240" w:lineRule="auto"/>
+                              <w:jc w:val="center"/>
+                            </w:pPr>
+                            <w:r>
+                              <w:rPr>
+                                <w:rFonts w:ascii="Indie Flower" w:hAnsi="Indie Flower" w:cs="Indie Flower"/>
+                                <w:color w:val="658C43"/>
+                                <w:sz w:val="24"/>
+                                <w:szCs w:val="24"/>
+                              </w:rPr>
+                              <w:t/>
+                            </w:r>
+                          </w:p>
+                        </w:tc>
+                        <w:tc>
+                          <w:tcPr>
+                            <w:tcW w:w="581" w:type="dxa"/>
+                            <w:tcMar>
+                              <w:top w:w="0" w:type="dxa"/>
+                              <w:bottom w:w="0" w:type="dxa"/>
+                              <w:left w:w="20" w:type="dxa"/>
+                              <w:right w:w="20" w:type="dxa"/>
+                            </w:tcMar>
+                            <w:vAlign w:val="center"/>
+                          </w:tcPr>
+                          <w:p>
+                            <w:pPr>
+                              <w:spacing w:before="0" w:after="0" w:line="240" w:lineRule="auto"/>
+                              <w:jc w:val="center"/>
+                            </w:pPr>
+                            <w:r>
+                              <w:rPr>
+                                <w:rFonts w:ascii="Indie Flower" w:hAnsi="Indie Flower" w:cs="Indie Flower"/>
+                                <w:color w:val="658C43"/>
+                                <w:sz w:val="24"/>
+                                <w:szCs w:val="24"/>
+                              </w:rPr>
+                              <w:t/>
+                            </w:r>
+                          </w:p>
+                        </w:tc>
+                        <w:tc>
+                          <w:tcPr>
+                            <w:tcW w:w="566" w:type="dxa"/>
+                            <w:tcMar>
+                              <w:top w:w="0" w:type="dxa"/>
+                              <w:bottom w:w="0" w:type="dxa"/>
+                              <w:left w:w="20" w:type="dxa"/>
+                              <w:right w:w="20" w:type="dxa"/>
+                            </w:tcMar>
+                            <w:vAlign w:val="center"/>
+                          </w:tcPr>
+                          <w:p>
+                            <w:pPr>
+                              <w:spacing w:before="0" w:after="0" w:line="240" w:lineRule="auto"/>
+                              <w:jc w:val="center"/>
+                            </w:pPr>
+                            <w:r>
+                              <w:rPr>
+                                <w:rFonts w:ascii="Indie Flower" w:hAnsi="Indie Flower" w:cs="Indie Flower"/>
+                                <w:color w:val="658C43"/>
+                                <w:sz w:val="24"/>
+                                <w:szCs w:val="24"/>
+                              </w:rPr>
+                              <w:t/>
+                            </w:r>
+                          </w:p>
+                        </w:tc>
+                        <w:tc>
+                          <w:tcPr>
+                            <w:tcW w:w="600" w:type="dxa"/>
+                            <w:tcMar>
+                              <w:top w:w="0" w:type="dxa"/>
+                              <w:bottom w:w="0" w:type="dxa"/>
+                              <w:left w:w="20" w:type="dxa"/>
+                              <w:right w:w="20" w:type="dxa"/>
+                            </w:tcMar>
+                            <w:vAlign w:val="center"/>
+                          </w:tcPr>
+                          <w:p>
+                            <w:pPr>
+                              <w:spacing w:before="0" w:after="0" w:line="240" w:lineRule="auto"/>
+                              <w:jc w:val="center"/>
+                            </w:pPr>
+                            <w:r>
+                              <w:rPr>
+                                <w:rFonts w:ascii="Indie Flower" w:hAnsi="Indie Flower" w:cs="Indie Flower"/>
+                                <w:color w:val="658C43"/>
+                                <w:sz w:val="24"/>
+                                <w:szCs w:val="24"/>
+                              </w:rPr>
+                              <w:t/>
+                            </w:r>
+                          </w:p>
+                        </w:tc>
+                        <w:tc>
+                          <w:tcPr>
+                            <w:tcW w:w="624" w:type="dxa"/>
+                            <w:tcMar>
+                              <w:top w:w="0" w:type="dxa"/>
+                              <w:bottom w:w="0" w:type="dxa"/>
+                              <w:left w:w="20" w:type="dxa"/>
+                              <w:right w:w="20" w:type="dxa"/>
+                            </w:tcMar>
+                            <w:vAlign w:val="center"/>
+                          </w:tcPr>
+                          <w:p>
+                            <w:pPr>
+                              <w:spacing w:before="0" w:after="0" w:line="240" w:lineRule="auto"/>
+                              <w:jc w:val="center"/>
+                            </w:pPr>
+                            <w:r>
+                              <w:rPr>
+                                <w:rFonts w:ascii="Indie Flower" w:hAnsi="Indie Flower" w:cs="Indie Flower"/>
+                                <w:color w:val="658C43"/>
+                                <w:sz w:val="24"/>
+                                <w:szCs w:val="24"/>
+                              </w:rPr>
+                              <w:t/>
+                            </w:r>
+                          </w:p>
+                        </w:tc>
+                        <w:tc>
+                          <w:tcPr>
+                            <w:tcW w:w="1435" w:type="dxa"/>
+                            <w:tcMar>
+                              <w:top w:w="0" w:type="dxa"/>
+                              <w:bottom w:w="0" w:type="dxa"/>
+                              <w:left w:w="20" w:type="dxa"/>
+                              <w:right w:w="20" w:type="dxa"/>
+                            </w:tcMar>
+                            <w:vAlign w:val="center"/>
+                          </w:tcPr>
+                          <w:p>
+                            <w:pPr>
+                              <w:spacing w:before="0" w:after="0" w:line="240" w:lineRule="auto"/>
+                              <w:jc w:val="center"/>
+                            </w:pPr>
+                            <w:r>
+                              <w:rPr>
+                                <w:rFonts w:ascii="Indie Flower" w:hAnsi="Indie Flower" w:cs="Indie Flower"/>
+                                <w:color w:val="658C43"/>
+                                <w:sz w:val="24"/>
+                                <w:szCs w:val="24"/>
+                              </w:rPr>
+                              <w:t/>
+                            </w:r>
+                          </w:p>
+                        </w:tc>
+                      </w:tr>
+                      <w:tr>
+                        <w:trPr>
+                          <w:cantSplit/>
+                          <w:trHeight w:val="361" w:hRule="exact"/>
+                        </w:trPr>
+                        <w:tc>
+                          <w:tcPr>
+                            <w:tcW w:w="514" w:type="dxa"/>
+                            <w:tcMar>
+                              <w:top w:w="0" w:type="dxa"/>
+                              <w:bottom w:w="0" w:type="dxa"/>
+                              <w:left w:w="20" w:type="dxa"/>
+                              <w:right w:w="20" w:type="dxa"/>
+                            </w:tcMar>
+                            <w:vAlign w:val="center"/>
+                          </w:tcPr>
+                          <w:p>
+                            <w:pPr>
+                              <w:spacing w:before="0" w:after="0" w:line="240" w:lineRule="auto"/>
+                              <w:ind w:left="90"/>
+                              <w:jc w:val="left"/>
+                            </w:pPr>
+                            <w:r>
+                              <w:rPr>
+                                <w:rFonts w:ascii="Glegoo" w:hAnsi="Glegoo" w:cs="Glegoo"/>
+                                <w:color w:val="658C43"/>
+                                <w:sz w:val="15"/>
+                                <w:szCs w:val="15"/>
+                              </w:rPr>
+                              <w:t xml:space="preserve">Mi.</w:t>
+                            </w:r>
+                          </w:p>
+                        </w:tc>
+                        <w:tc>
+                          <w:tcPr>
+                            <w:tcW w:w="634" w:type="dxa"/>
+                            <w:tcMar>
+                              <w:top w:w="0" w:type="dxa"/>
+                              <w:bottom w:w="0" w:type="dxa"/>
+                              <w:left w:w="20" w:type="dxa"/>
+                              <w:right w:w="20" w:type="dxa"/>
+                            </w:tcMar>
+                            <w:vAlign w:val="center"/>
+                          </w:tcPr>
+                          <w:p>
+                            <w:pPr>
+                              <w:spacing w:before="0" w:after="0" w:line="240" w:lineRule="auto"/>
+                              <w:jc w:val="center"/>
+                            </w:pPr>
+                            <w:r>
+                              <w:rPr>
+                                <w:rFonts w:ascii="Indie Flower" w:hAnsi="Indie Flower" w:cs="Indie Flower"/>
+                                <w:color w:val="658C43"/>
+                                <w:sz w:val="24"/>
+                                <w:szCs w:val="24"/>
+                              </w:rPr>
+                              <w:t xml:space="preserve">x</w:t>
+                            </w:r>
+                          </w:p>
+                        </w:tc>
+                        <w:tc>
+                          <w:tcPr>
+                            <w:tcW w:w="605" w:type="dxa"/>
+                            <w:tcMar>
+                              <w:top w:w="0" w:type="dxa"/>
+                              <w:bottom w:w="0" w:type="dxa"/>
+                              <w:left w:w="20" w:type="dxa"/>
+                              <w:right w:w="20" w:type="dxa"/>
+                            </w:tcMar>
+                            <w:vAlign w:val="center"/>
+                          </w:tcPr>
+                          <w:p>
+                            <w:pPr>
+                              <w:spacing w:before="0" w:after="0" w:line="240" w:lineRule="auto"/>
+                              <w:jc w:val="center"/>
+                            </w:pPr>
+                            <w:r>
+                              <w:rPr>
+                                <w:rFonts w:ascii="Indie Flower" w:hAnsi="Indie Flower" w:cs="Indie Flower"/>
+                                <w:color w:val="658C43"/>
+                                <w:sz w:val="24"/>
+                                <w:szCs w:val="24"/>
+                              </w:rPr>
+                              <w:t xml:space="preserve">x</w:t>
+                            </w:r>
+                          </w:p>
+                        </w:tc>
+                        <w:tc>
+                          <w:tcPr>
+                            <w:tcW w:w="590" w:type="dxa"/>
+                            <w:tcMar>
+                              <w:top w:w="0" w:type="dxa"/>
+                              <w:bottom w:w="0" w:type="dxa"/>
+                              <w:left w:w="20" w:type="dxa"/>
+                              <w:right w:w="20" w:type="dxa"/>
+                            </w:tcMar>
+                            <w:vAlign w:val="center"/>
+                          </w:tcPr>
+                          <w:p>
+                            <w:pPr>
+                              <w:spacing w:before="0" w:after="0" w:line="240" w:lineRule="auto"/>
+                              <w:jc w:val="center"/>
+                            </w:pPr>
+                            <w:r>
+                              <w:rPr>
+                                <w:rFonts w:ascii="Indie Flower" w:hAnsi="Indie Flower" w:cs="Indie Flower"/>
+                                <w:color w:val="658C43"/>
+                                <w:sz w:val="24"/>
+                                <w:szCs w:val="24"/>
+                              </w:rPr>
+                              <w:t xml:space="preserve">x</w:t>
+                            </w:r>
+                          </w:p>
+                        </w:tc>
+                        <w:tc>
+                          <w:tcPr>
+                            <w:tcW w:w="576" w:type="dxa"/>
+                            <w:tcMar>
+                              <w:top w:w="0" w:type="dxa"/>
+                              <w:bottom w:w="0" w:type="dxa"/>
+                              <w:left w:w="20" w:type="dxa"/>
+                              <w:right w:w="20" w:type="dxa"/>
+                            </w:tcMar>
+                            <w:vAlign w:val="center"/>
+                          </w:tcPr>
+                          <w:p>
+                            <w:pPr>
+                              <w:spacing w:before="0" w:after="0" w:line="240" w:lineRule="auto"/>
+                              <w:jc w:val="center"/>
+                            </w:pPr>
+                            <w:r>
+                              <w:rPr>
+                                <w:rFonts w:ascii="Indie Flower" w:hAnsi="Indie Flower" w:cs="Indie Flower"/>
+                                <w:color w:val="658C43"/>
+                                <w:sz w:val="24"/>
+                                <w:szCs w:val="24"/>
+                              </w:rPr>
+                              <w:t/>
+                            </w:r>
+                          </w:p>
+                        </w:tc>
+                        <w:tc>
+                          <w:tcPr>
+                            <w:tcW w:w="806" w:type="dxa"/>
+                            <w:tcMar>
+                              <w:top w:w="0" w:type="dxa"/>
+                              <w:bottom w:w="0" w:type="dxa"/>
+                              <w:left w:w="20" w:type="dxa"/>
+                              <w:right w:w="20" w:type="dxa"/>
+                            </w:tcMar>
+                            <w:vAlign w:val="center"/>
+                          </w:tcPr>
+                          <w:p>
+                            <w:pPr>
+                              <w:spacing w:before="0" w:after="0" w:line="240" w:lineRule="auto"/>
+                              <w:jc w:val="center"/>
+                            </w:pPr>
+                            <w:r>
+                              <w:rPr>
+                                <w:rFonts w:ascii="Indie Flower" w:hAnsi="Indie Flower" w:cs="Indie Flower"/>
+                                <w:color w:val="658C43"/>
+                                <w:sz w:val="24"/>
+                                <w:szCs w:val="24"/>
+                              </w:rPr>
+                              <w:t/>
+                            </w:r>
+                          </w:p>
+                        </w:tc>
+                        <w:tc>
+                          <w:tcPr>
+                            <w:tcW w:w="826" w:type="dxa"/>
+                            <w:tcMar>
+                              <w:top w:w="0" w:type="dxa"/>
+                              <w:bottom w:w="0" w:type="dxa"/>
+                              <w:left w:w="20" w:type="dxa"/>
+                              <w:right w:w="20" w:type="dxa"/>
+                            </w:tcMar>
+                            <w:vAlign w:val="center"/>
+                          </w:tcPr>
+                          <w:p>
+                            <w:pPr>
+                              <w:spacing w:before="0" w:after="0" w:line="240" w:lineRule="auto"/>
+                              <w:jc w:val="center"/>
+                            </w:pPr>
+                            <w:r>
+                              <w:rPr>
+                                <w:rFonts w:ascii="Indie Flower" w:hAnsi="Indie Flower" w:cs="Indie Flower"/>
+                                <w:color w:val="658C43"/>
+                                <w:sz w:val="24"/>
+                                <w:szCs w:val="24"/>
+                              </w:rPr>
+                              <w:t/>
+                            </w:r>
+                          </w:p>
+                        </w:tc>
+                        <w:tc>
+                          <w:tcPr>
+                            <w:tcW w:w="557" w:type="dxa"/>
+                            <w:tcMar>
+                              <w:top w:w="0" w:type="dxa"/>
+                              <w:bottom w:w="0" w:type="dxa"/>
+                              <w:left w:w="20" w:type="dxa"/>
+                              <w:right w:w="20" w:type="dxa"/>
+                            </w:tcMar>
+                            <w:vAlign w:val="center"/>
+                          </w:tcPr>
+                          <w:p>
+                            <w:pPr>
+                              <w:spacing w:before="0" w:after="0" w:line="240" w:lineRule="auto"/>
+                              <w:jc w:val="center"/>
+                            </w:pPr>
+                            <w:r>
+                              <w:rPr>
+                                <w:rFonts w:ascii="Indie Flower" w:hAnsi="Indie Flower" w:cs="Indie Flower"/>
+                                <w:color w:val="658C43"/>
+                                <w:sz w:val="24"/>
+                                <w:szCs w:val="24"/>
+                              </w:rPr>
+                              <w:t xml:space="preserve">x</w:t>
+                            </w:r>
+                          </w:p>
+                        </w:tc>
+                        <w:tc>
+                          <w:tcPr>
+                            <w:tcW w:w="1090" w:type="dxa"/>
+                            <w:tcMar>
+                              <w:top w:w="0" w:type="dxa"/>
+                              <w:bottom w:w="0" w:type="dxa"/>
+                              <w:left w:w="20" w:type="dxa"/>
+                              <w:right w:w="20" w:type="dxa"/>
+                            </w:tcMar>
+                            <w:vAlign w:val="center"/>
+                          </w:tcPr>
+                          <w:p>
+                            <w:pPr>
+                              <w:spacing w:before="0" w:after="0" w:line="240" w:lineRule="auto"/>
+                              <w:jc w:val="center"/>
+                            </w:pPr>
+                            <w:r>
+                              <w:rPr>
+                                <w:rFonts w:ascii="Indie Flower" w:hAnsi="Indie Flower" w:cs="Indie Flower"/>
+                                <w:color w:val="658C43"/>
+                                <w:sz w:val="24"/>
+                                <w:szCs w:val="24"/>
+                              </w:rPr>
+                              <w:t/>
+                            </w:r>
+                          </w:p>
+                        </w:tc>
+                        <w:tc>
+                          <w:tcPr>
+                            <w:tcW w:w="763" w:type="dxa"/>
+                            <w:tcMar>
+                              <w:top w:w="0" w:type="dxa"/>
+                              <w:bottom w:w="0" w:type="dxa"/>
+                              <w:left w:w="20" w:type="dxa"/>
+                              <w:right w:w="20" w:type="dxa"/>
+                            </w:tcMar>
+                            <w:vAlign w:val="center"/>
+                          </w:tcPr>
+                          <w:p>
+                            <w:pPr>
+                              <w:spacing w:before="0" w:after="0" w:line="240" w:lineRule="auto"/>
+                              <w:jc w:val="center"/>
+                            </w:pPr>
+                            <w:r>
+                              <w:rPr>
+                                <w:rFonts w:ascii="Indie Flower" w:hAnsi="Indie Flower" w:cs="Indie Flower"/>
+                                <w:color w:val="658C43"/>
+                                <w:sz w:val="24"/>
+                                <w:szCs w:val="24"/>
+                              </w:rPr>
+                              <w:t/>
+                            </w:r>
+                          </w:p>
+                        </w:tc>
+                        <w:tc>
+                          <w:tcPr>
+                            <w:tcW w:w="581" w:type="dxa"/>
+                            <w:tcMar>
+                              <w:top w:w="0" w:type="dxa"/>
+                              <w:bottom w:w="0" w:type="dxa"/>
+                              <w:left w:w="20" w:type="dxa"/>
+                              <w:right w:w="20" w:type="dxa"/>
+                            </w:tcMar>
+                            <w:vAlign w:val="center"/>
+                          </w:tcPr>
+                          <w:p>
+                            <w:pPr>
+                              <w:spacing w:before="0" w:after="0" w:line="240" w:lineRule="auto"/>
+                              <w:jc w:val="center"/>
+                            </w:pPr>
+                            <w:r>
+                              <w:rPr>
+                                <w:rFonts w:ascii="Indie Flower" w:hAnsi="Indie Flower" w:cs="Indie Flower"/>
+                                <w:color w:val="658C43"/>
+                                <w:sz w:val="24"/>
+                                <w:szCs w:val="24"/>
+                              </w:rPr>
+                              <w:t/>
+                            </w:r>
+                          </w:p>
+                        </w:tc>
+                        <w:tc>
+                          <w:tcPr>
+                            <w:tcW w:w="566" w:type="dxa"/>
+                            <w:tcMar>
+                              <w:top w:w="0" w:type="dxa"/>
+                              <w:bottom w:w="0" w:type="dxa"/>
+                              <w:left w:w="20" w:type="dxa"/>
+                              <w:right w:w="20" w:type="dxa"/>
+                            </w:tcMar>
+                            <w:vAlign w:val="center"/>
+                          </w:tcPr>
+                          <w:p>
+                            <w:pPr>
+                              <w:spacing w:before="0" w:after="0" w:line="240" w:lineRule="auto"/>
+                              <w:jc w:val="center"/>
+                            </w:pPr>
+                            <w:r>
+                              <w:rPr>
+                                <w:rFonts w:ascii="Indie Flower" w:hAnsi="Indie Flower" w:cs="Indie Flower"/>
+                                <w:color w:val="658C43"/>
+                                <w:sz w:val="24"/>
+                                <w:szCs w:val="24"/>
+                              </w:rPr>
+                              <w:t/>
+                            </w:r>
+                          </w:p>
+                        </w:tc>
+                        <w:tc>
+                          <w:tcPr>
+                            <w:tcW w:w="600" w:type="dxa"/>
+                            <w:tcMar>
+                              <w:top w:w="0" w:type="dxa"/>
+                              <w:bottom w:w="0" w:type="dxa"/>
+                              <w:left w:w="20" w:type="dxa"/>
+                              <w:right w:w="20" w:type="dxa"/>
+                            </w:tcMar>
+                            <w:vAlign w:val="center"/>
+                          </w:tcPr>
+                          <w:p>
+                            <w:pPr>
+                              <w:spacing w:before="0" w:after="0" w:line="240" w:lineRule="auto"/>
+                              <w:jc w:val="center"/>
+                            </w:pPr>
+                            <w:r>
+                              <w:rPr>
+                                <w:rFonts w:ascii="Indie Flower" w:hAnsi="Indie Flower" w:cs="Indie Flower"/>
+                                <w:color w:val="658C43"/>
+                                <w:sz w:val="24"/>
+                                <w:szCs w:val="24"/>
+                              </w:rPr>
+                              <w:t/>
+                            </w:r>
+                          </w:p>
+                        </w:tc>
+                        <w:tc>
+                          <w:tcPr>
+                            <w:tcW w:w="624" w:type="dxa"/>
+                            <w:tcMar>
+                              <w:top w:w="0" w:type="dxa"/>
+                              <w:bottom w:w="0" w:type="dxa"/>
+                              <w:left w:w="20" w:type="dxa"/>
+                              <w:right w:w="20" w:type="dxa"/>
+                            </w:tcMar>
+                            <w:vAlign w:val="center"/>
+                          </w:tcPr>
+                          <w:p>
+                            <w:pPr>
+                              <w:spacing w:before="0" w:after="0" w:line="240" w:lineRule="auto"/>
+                              <w:jc w:val="center"/>
+                            </w:pPr>
+                            <w:r>
+                              <w:rPr>
+                                <w:rFonts w:ascii="Indie Flower" w:hAnsi="Indie Flower" w:cs="Indie Flower"/>
+                                <w:color w:val="658C43"/>
+                                <w:sz w:val="24"/>
+                                <w:szCs w:val="24"/>
+                              </w:rPr>
+                              <w:t xml:space="preserve">x</w:t>
+                            </w:r>
+                          </w:p>
+                        </w:tc>
+                        <w:tc>
+                          <w:tcPr>
+                            <w:tcW w:w="1435" w:type="dxa"/>
+                            <w:tcMar>
+                              <w:top w:w="0" w:type="dxa"/>
+                              <w:bottom w:w="0" w:type="dxa"/>
+                              <w:left w:w="20" w:type="dxa"/>
+                              <w:right w:w="20" w:type="dxa"/>
+                            </w:tcMar>
+                            <w:vAlign w:val="center"/>
+                          </w:tcPr>
+                          <w:p>
+                            <w:pPr>
+                              <w:spacing w:before="0" w:after="0" w:line="240" w:lineRule="auto"/>
+                              <w:jc w:val="center"/>
+                            </w:pPr>
+                            <w:r>
+                              <w:rPr>
+                                <w:rFonts w:ascii="Indie Flower" w:hAnsi="Indie Flower" w:cs="Indie Flower"/>
+                                <w:color w:val="658C43"/>
+                                <w:sz w:val="24"/>
+                                <w:szCs w:val="24"/>
+                              </w:rPr>
+                              <w:t/>
+                            </w:r>
+                          </w:p>
+                        </w:tc>
+                      </w:tr>
+                      <w:tr>
+                        <w:trPr>
+                          <w:cantSplit/>
+                          <w:trHeight w:val="361" w:hRule="exact"/>
+                        </w:trPr>
+                        <w:tc>
+                          <w:tcPr>
+                            <w:tcW w:w="514" w:type="dxa"/>
+                            <w:tcMar>
+                              <w:top w:w="0" w:type="dxa"/>
+                              <w:bottom w:w="0" w:type="dxa"/>
+                              <w:left w:w="20" w:type="dxa"/>
+                              <w:right w:w="20" w:type="dxa"/>
+                            </w:tcMar>
+                            <w:vAlign w:val="center"/>
+                          </w:tcPr>
+                          <w:p>
+                            <w:pPr>
+                              <w:spacing w:before="0" w:after="0" w:line="240" w:lineRule="auto"/>
+                              <w:ind w:left="90"/>
+                              <w:jc w:val="left"/>
+                            </w:pPr>
+                            <w:r>
+                              <w:rPr>
+                                <w:rFonts w:ascii="Glegoo" w:hAnsi="Glegoo" w:cs="Glegoo"/>
+                                <w:color w:val="658C43"/>
+                                <w:sz w:val="15"/>
+                                <w:szCs w:val="15"/>
+                              </w:rPr>
+                              <w:t xml:space="preserve">Do.</w:t>
+                            </w:r>
+                          </w:p>
+                        </w:tc>
+                        <w:tc>
+                          <w:tcPr>
+                            <w:tcW w:w="634" w:type="dxa"/>
+                            <w:tcMar>
+                              <w:top w:w="0" w:type="dxa"/>
+                              <w:bottom w:w="0" w:type="dxa"/>
+                              <w:left w:w="20" w:type="dxa"/>
+                              <w:right w:w="20" w:type="dxa"/>
+                            </w:tcMar>
+                            <w:vAlign w:val="center"/>
+                          </w:tcPr>
+                          <w:p>
+                            <w:pPr>
+                              <w:spacing w:before="0" w:after="0" w:line="240" w:lineRule="auto"/>
+                              <w:jc w:val="center"/>
+                            </w:pPr>
+                            <w:r>
+                              <w:rPr>
+                                <w:rFonts w:ascii="Indie Flower" w:hAnsi="Indie Flower" w:cs="Indie Flower"/>
+                                <w:color w:val="658C43"/>
+                                <w:sz w:val="24"/>
+                                <w:szCs w:val="24"/>
+                              </w:rPr>
+                              <w:t xml:space="preserve">x</w:t>
+                            </w:r>
+                          </w:p>
+                        </w:tc>
+                        <w:tc>
+                          <w:tcPr>
+                            <w:tcW w:w="605" w:type="dxa"/>
+                            <w:tcMar>
+                              <w:top w:w="0" w:type="dxa"/>
+                              <w:bottom w:w="0" w:type="dxa"/>
+                              <w:left w:w="20" w:type="dxa"/>
+                              <w:right w:w="20" w:type="dxa"/>
+                            </w:tcMar>
+                            <w:vAlign w:val="center"/>
+                          </w:tcPr>
+                          <w:p>
+                            <w:pPr>
+                              <w:spacing w:before="0" w:after="0" w:line="240" w:lineRule="auto"/>
+                              <w:jc w:val="center"/>
+                            </w:pPr>
+                            <w:r>
+                              <w:rPr>
+                                <w:rFonts w:ascii="Indie Flower" w:hAnsi="Indie Flower" w:cs="Indie Flower"/>
+                                <w:color w:val="658C43"/>
+                                <w:sz w:val="24"/>
+                                <w:szCs w:val="24"/>
+                              </w:rPr>
+                              <w:t xml:space="preserve">x</w:t>
+                            </w:r>
+                          </w:p>
+                        </w:tc>
+                        <w:tc>
+                          <w:tcPr>
+                            <w:tcW w:w="590" w:type="dxa"/>
+                            <w:tcMar>
+                              <w:top w:w="0" w:type="dxa"/>
+                              <w:bottom w:w="0" w:type="dxa"/>
+                              <w:left w:w="20" w:type="dxa"/>
+                              <w:right w:w="20" w:type="dxa"/>
+                            </w:tcMar>
+                            <w:vAlign w:val="center"/>
+                          </w:tcPr>
+                          <w:p>
+                            <w:pPr>
+                              <w:spacing w:before="0" w:after="0" w:line="240" w:lineRule="auto"/>
+                              <w:jc w:val="center"/>
+                            </w:pPr>
+                            <w:r>
+                              <w:rPr>
+                                <w:rFonts w:ascii="Indie Flower" w:hAnsi="Indie Flower" w:cs="Indie Flower"/>
+                                <w:color w:val="658C43"/>
+                                <w:sz w:val="24"/>
+                                <w:szCs w:val="24"/>
+                              </w:rPr>
+                              <w:t xml:space="preserve">x</w:t>
+                            </w:r>
+                          </w:p>
+                        </w:tc>
+                        <w:tc>
+                          <w:tcPr>
+                            <w:tcW w:w="576" w:type="dxa"/>
+                            <w:tcMar>
+                              <w:top w:w="0" w:type="dxa"/>
+                              <w:bottom w:w="0" w:type="dxa"/>
+                              <w:left w:w="20" w:type="dxa"/>
+                              <w:right w:w="20" w:type="dxa"/>
+                            </w:tcMar>
+                            <w:vAlign w:val="center"/>
+                          </w:tcPr>
+                          <w:p>
+                            <w:pPr>
+                              <w:spacing w:before="0" w:after="0" w:line="240" w:lineRule="auto"/>
+                              <w:jc w:val="center"/>
+                            </w:pPr>
+                            <w:r>
+                              <w:rPr>
+                                <w:rFonts w:ascii="Indie Flower" w:hAnsi="Indie Flower" w:cs="Indie Flower"/>
+                                <w:color w:val="658C43"/>
+                                <w:sz w:val="24"/>
+                                <w:szCs w:val="24"/>
+                              </w:rPr>
+                              <w:t/>
+                            </w:r>
+                          </w:p>
+                        </w:tc>
+                        <w:tc>
+                          <w:tcPr>
+                            <w:tcW w:w="806" w:type="dxa"/>
+                            <w:tcMar>
+                              <w:top w:w="0" w:type="dxa"/>
+                              <w:bottom w:w="0" w:type="dxa"/>
+                              <w:left w:w="20" w:type="dxa"/>
+                              <w:right w:w="20" w:type="dxa"/>
+                            </w:tcMar>
+                            <w:vAlign w:val="center"/>
+                          </w:tcPr>
+                          <w:p>
+                            <w:pPr>
+                              <w:spacing w:before="0" w:after="0" w:line="240" w:lineRule="auto"/>
+                              <w:jc w:val="center"/>
+                            </w:pPr>
+                            <w:r>
+                              <w:rPr>
+                                <w:rFonts w:ascii="Indie Flower" w:hAnsi="Indie Flower" w:cs="Indie Flower"/>
+                                <w:color w:val="658C43"/>
+                                <w:sz w:val="24"/>
+                                <w:szCs w:val="24"/>
+                              </w:rPr>
+                              <w:t/>
+                            </w:r>
+                          </w:p>
+                        </w:tc>
+                        <w:tc>
+                          <w:tcPr>
+                            <w:tcW w:w="826" w:type="dxa"/>
+                            <w:tcMar>
+                              <w:top w:w="0" w:type="dxa"/>
+                              <w:bottom w:w="0" w:type="dxa"/>
+                              <w:left w:w="20" w:type="dxa"/>
+                              <w:right w:w="20" w:type="dxa"/>
+                            </w:tcMar>
+                            <w:vAlign w:val="center"/>
+                          </w:tcPr>
+                          <w:p>
+                            <w:pPr>
+                              <w:spacing w:before="0" w:after="0" w:line="240" w:lineRule="auto"/>
+                              <w:jc w:val="center"/>
+                            </w:pPr>
+                            <w:r>
+                              <w:rPr>
+                                <w:rFonts w:ascii="Indie Flower" w:hAnsi="Indie Flower" w:cs="Indie Flower"/>
+                                <w:color w:val="658C43"/>
+                                <w:sz w:val="24"/>
+                                <w:szCs w:val="24"/>
+                              </w:rPr>
+                              <w:t/>
+                            </w:r>
+                          </w:p>
+                        </w:tc>
+                        <w:tc>
+                          <w:tcPr>
+                            <w:tcW w:w="557" w:type="dxa"/>
+                            <w:tcMar>
+                              <w:top w:w="0" w:type="dxa"/>
+                              <w:bottom w:w="0" w:type="dxa"/>
+                              <w:left w:w="20" w:type="dxa"/>
+                              <w:right w:w="20" w:type="dxa"/>
+                            </w:tcMar>
+                            <w:vAlign w:val="center"/>
+                          </w:tcPr>
+                          <w:p>
+                            <w:pPr>
+                              <w:spacing w:before="0" w:after="0" w:line="240" w:lineRule="auto"/>
+                              <w:jc w:val="center"/>
+                            </w:pPr>
+                            <w:r>
+                              <w:rPr>
+                                <w:rFonts w:ascii="Indie Flower" w:hAnsi="Indie Flower" w:cs="Indie Flower"/>
+                                <w:color w:val="658C43"/>
+                                <w:sz w:val="24"/>
+                                <w:szCs w:val="24"/>
+                              </w:rPr>
+                              <w:t xml:space="preserve">x</w:t>
+                            </w:r>
+                          </w:p>
+                        </w:tc>
+                        <w:tc>
+                          <w:tcPr>
+                            <w:tcW w:w="1090" w:type="dxa"/>
+                            <w:tcMar>
+                              <w:top w:w="0" w:type="dxa"/>
+                              <w:bottom w:w="0" w:type="dxa"/>
+                              <w:left w:w="20" w:type="dxa"/>
+                              <w:right w:w="20" w:type="dxa"/>
+                            </w:tcMar>
+                            <w:vAlign w:val="center"/>
+                          </w:tcPr>
+                          <w:p>
+                            <w:pPr>
+                              <w:spacing w:before="0" w:after="0" w:line="240" w:lineRule="auto"/>
+                              <w:jc w:val="center"/>
+                            </w:pPr>
+                            <w:r>
+                              <w:rPr>
+                                <w:rFonts w:ascii="Indie Flower" w:hAnsi="Indie Flower" w:cs="Indie Flower"/>
+                                <w:color w:val="658C43"/>
+                                <w:sz w:val="24"/>
+                                <w:szCs w:val="24"/>
+                              </w:rPr>
+                              <w:t/>
+                            </w:r>
+                          </w:p>
+                        </w:tc>
+                        <w:tc>
+                          <w:tcPr>
+                            <w:tcW w:w="763" w:type="dxa"/>
+                            <w:tcMar>
+                              <w:top w:w="0" w:type="dxa"/>
+                              <w:bottom w:w="0" w:type="dxa"/>
+                              <w:left w:w="20" w:type="dxa"/>
+                              <w:right w:w="20" w:type="dxa"/>
+                            </w:tcMar>
+                            <w:vAlign w:val="center"/>
+                          </w:tcPr>
+                          <w:p>
+                            <w:pPr>
+                              <w:spacing w:before="0" w:after="0" w:line="240" w:lineRule="auto"/>
+                              <w:jc w:val="center"/>
+                            </w:pPr>
+                            <w:r>
+                              <w:rPr>
+                                <w:rFonts w:ascii="Indie Flower" w:hAnsi="Indie Flower" w:cs="Indie Flower"/>
+                                <w:color w:val="658C43"/>
+                                <w:sz w:val="24"/>
+                                <w:szCs w:val="24"/>
+                              </w:rPr>
+                              <w:t/>
+                            </w:r>
+                          </w:p>
+                        </w:tc>
+                        <w:tc>
+                          <w:tcPr>
+                            <w:tcW w:w="581" w:type="dxa"/>
+                            <w:tcMar>
+                              <w:top w:w="0" w:type="dxa"/>
+                              <w:bottom w:w="0" w:type="dxa"/>
+                              <w:left w:w="20" w:type="dxa"/>
+                              <w:right w:w="20" w:type="dxa"/>
+                            </w:tcMar>
+                            <w:vAlign w:val="center"/>
+                          </w:tcPr>
+                          <w:p>
+                            <w:pPr>
+                              <w:spacing w:before="0" w:after="0" w:line="240" w:lineRule="auto"/>
+                              <w:jc w:val="center"/>
+                            </w:pPr>
+                            <w:r>
+                              <w:rPr>
+                                <w:rFonts w:ascii="Indie Flower" w:hAnsi="Indie Flower" w:cs="Indie Flower"/>
+                                <w:color w:val="658C43"/>
+                                <w:sz w:val="24"/>
+                                <w:szCs w:val="24"/>
+                              </w:rPr>
+                              <w:t/>
+                            </w:r>
+                          </w:p>
+                        </w:tc>
+                        <w:tc>
+                          <w:tcPr>
+                            <w:tcW w:w="566" w:type="dxa"/>
+                            <w:tcMar>
+                              <w:top w:w="0" w:type="dxa"/>
+                              <w:bottom w:w="0" w:type="dxa"/>
+                              <w:left w:w="20" w:type="dxa"/>
+                              <w:right w:w="20" w:type="dxa"/>
+                            </w:tcMar>
+                            <w:vAlign w:val="center"/>
+                          </w:tcPr>
+                          <w:p>
+                            <w:pPr>
+                              <w:spacing w:before="0" w:after="0" w:line="240" w:lineRule="auto"/>
+                              <w:jc w:val="center"/>
+                            </w:pPr>
+                            <w:r>
+                              <w:rPr>
+                                <w:rFonts w:ascii="Indie Flower" w:hAnsi="Indie Flower" w:cs="Indie Flower"/>
+                                <w:color w:val="658C43"/>
+                                <w:sz w:val="24"/>
+                                <w:szCs w:val="24"/>
+                              </w:rPr>
+                              <w:t/>
+                            </w:r>
+                          </w:p>
+                        </w:tc>
+                        <w:tc>
+                          <w:tcPr>
+                            <w:tcW w:w="600" w:type="dxa"/>
+                            <w:tcMar>
+                              <w:top w:w="0" w:type="dxa"/>
+                              <w:bottom w:w="0" w:type="dxa"/>
+                              <w:left w:w="20" w:type="dxa"/>
+                              <w:right w:w="20" w:type="dxa"/>
+                            </w:tcMar>
+                            <w:vAlign w:val="center"/>
+                          </w:tcPr>
+                          <w:p>
+                            <w:pPr>
+                              <w:spacing w:before="0" w:after="0" w:line="240" w:lineRule="auto"/>
+                              <w:jc w:val="center"/>
+                            </w:pPr>
+                            <w:r>
+                              <w:rPr>
+                                <w:rFonts w:ascii="Indie Flower" w:hAnsi="Indie Flower" w:cs="Indie Flower"/>
+                                <w:color w:val="658C43"/>
+                                <w:sz w:val="24"/>
+                                <w:szCs w:val="24"/>
+                              </w:rPr>
+                              <w:t/>
+                            </w:r>
+                          </w:p>
+                        </w:tc>
+                        <w:tc>
+                          <w:tcPr>
+                            <w:tcW w:w="624" w:type="dxa"/>
+                            <w:tcMar>
+                              <w:top w:w="0" w:type="dxa"/>
+                              <w:bottom w:w="0" w:type="dxa"/>
+                              <w:left w:w="20" w:type="dxa"/>
+                              <w:right w:w="20" w:type="dxa"/>
+                            </w:tcMar>
+                            <w:vAlign w:val="center"/>
+                          </w:tcPr>
+                          <w:p>
+                            <w:pPr>
+                              <w:spacing w:before="0" w:after="0" w:line="240" w:lineRule="auto"/>
+                              <w:jc w:val="center"/>
+                            </w:pPr>
+                            <w:r>
+                              <w:rPr>
+                                <w:rFonts w:ascii="Indie Flower" w:hAnsi="Indie Flower" w:cs="Indie Flower"/>
+                                <w:color w:val="658C43"/>
+                                <w:sz w:val="24"/>
+                                <w:szCs w:val="24"/>
+                              </w:rPr>
+                              <w:t xml:space="preserve">x</w:t>
+                            </w:r>
+                          </w:p>
+                        </w:tc>
+                        <w:tc>
+                          <w:tcPr>
+                            <w:tcW w:w="1435" w:type="dxa"/>
+                            <w:tcMar>
+                              <w:top w:w="0" w:type="dxa"/>
+                              <w:bottom w:w="0" w:type="dxa"/>
+                              <w:left w:w="20" w:type="dxa"/>
+                              <w:right w:w="20" w:type="dxa"/>
+                            </w:tcMar>
+                            <w:vAlign w:val="center"/>
+                          </w:tcPr>
+                          <w:p>
+                            <w:pPr>
+                              <w:spacing w:before="0" w:after="0" w:line="240" w:lineRule="auto"/>
+                              <w:jc w:val="center"/>
+                            </w:pPr>
+                            <w:r>
+                              <w:rPr>
+                                <w:rFonts w:ascii="Indie Flower" w:hAnsi="Indie Flower" w:cs="Indie Flower"/>
+                                <w:color w:val="658C43"/>
+                                <w:sz w:val="24"/>
+                                <w:szCs w:val="24"/>
+                              </w:rPr>
+                              <w:t/>
+                            </w:r>
+                          </w:p>
+                        </w:tc>
+                      </w:tr>
+                      <w:tr>
+                        <w:trPr>
+                          <w:cantSplit/>
+                          <w:trHeight w:val="361" w:hRule="exact"/>
+                        </w:trPr>
+                        <w:tc>
+                          <w:tcPr>
+                            <w:tcW w:w="514" w:type="dxa"/>
+                            <w:tcMar>
+                              <w:top w:w="0" w:type="dxa"/>
+                              <w:bottom w:w="0" w:type="dxa"/>
+                              <w:left w:w="20" w:type="dxa"/>
+                              <w:right w:w="20" w:type="dxa"/>
+                            </w:tcMar>
+                            <w:vAlign w:val="center"/>
+                          </w:tcPr>
+                          <w:p>
+                            <w:pPr>
+                              <w:spacing w:before="0" w:after="0" w:line="240" w:lineRule="auto"/>
+                              <w:ind w:left="90"/>
+                              <w:jc w:val="left"/>
+                            </w:pPr>
+                            <w:r>
+                              <w:rPr>
+                                <w:rFonts w:ascii="Glegoo" w:hAnsi="Glegoo" w:cs="Glegoo"/>
+                                <w:color w:val="658C43"/>
+                                <w:sz w:val="15"/>
+                                <w:szCs w:val="15"/>
+                              </w:rPr>
+                              <w:t xml:space="preserve">Fr.</w:t>
+                            </w:r>
+                          </w:p>
+                        </w:tc>
+                        <w:tc>
+                          <w:tcPr>
+                            <w:tcW w:w="634" w:type="dxa"/>
+                            <w:tcMar>
+                              <w:top w:w="0" w:type="dxa"/>
+                              <w:bottom w:w="0" w:type="dxa"/>
+                              <w:left w:w="20" w:type="dxa"/>
+                              <w:right w:w="20" w:type="dxa"/>
+                            </w:tcMar>
+                            <w:vAlign w:val="center"/>
+                          </w:tcPr>
+                          <w:p>
+                            <w:pPr>
+                              <w:spacing w:before="0" w:after="0" w:line="240" w:lineRule="auto"/>
+                              <w:jc w:val="center"/>
+                            </w:pPr>
+                            <w:r>
+                              <w:rPr>
+                                <w:rFonts w:ascii="Indie Flower" w:hAnsi="Indie Flower" w:cs="Indie Flower"/>
+                                <w:color w:val="658C43"/>
+                                <w:sz w:val="24"/>
+                                <w:szCs w:val="24"/>
+                              </w:rPr>
+                              <w:t xml:space="preserve">x</w:t>
+                            </w:r>
+                          </w:p>
+                        </w:tc>
+                        <w:tc>
+                          <w:tcPr>
+                            <w:tcW w:w="605" w:type="dxa"/>
+                            <w:tcMar>
+                              <w:top w:w="0" w:type="dxa"/>
+                              <w:bottom w:w="0" w:type="dxa"/>
+                              <w:left w:w="20" w:type="dxa"/>
+                              <w:right w:w="20" w:type="dxa"/>
+                            </w:tcMar>
+                            <w:vAlign w:val="center"/>
+                          </w:tcPr>
+                          <w:p>
+                            <w:pPr>
+                              <w:spacing w:before="0" w:after="0" w:line="240" w:lineRule="auto"/>
+                              <w:jc w:val="center"/>
+                            </w:pPr>
+                            <w:r>
+                              <w:rPr>
+                                <w:rFonts w:ascii="Indie Flower" w:hAnsi="Indie Flower" w:cs="Indie Flower"/>
+                                <w:color w:val="658C43"/>
+                                <w:sz w:val="24"/>
+                                <w:szCs w:val="24"/>
+                              </w:rPr>
+                              <w:t xml:space="preserve">x</w:t>
+                            </w:r>
+                          </w:p>
+                        </w:tc>
+                        <w:tc>
+                          <w:tcPr>
+                            <w:tcW w:w="590" w:type="dxa"/>
+                            <w:tcMar>
+                              <w:top w:w="0" w:type="dxa"/>
+                              <w:bottom w:w="0" w:type="dxa"/>
+                              <w:left w:w="20" w:type="dxa"/>
+                              <w:right w:w="20" w:type="dxa"/>
+                            </w:tcMar>
+                            <w:vAlign w:val="center"/>
+                          </w:tcPr>
+                          <w:p>
+                            <w:pPr>
+                              <w:spacing w:before="0" w:after="0" w:line="240" w:lineRule="auto"/>
+                              <w:jc w:val="center"/>
+                            </w:pPr>
+                            <w:r>
+                              <w:rPr>
+                                <w:rFonts w:ascii="Indie Flower" w:hAnsi="Indie Flower" w:cs="Indie Flower"/>
+                                <w:color w:val="658C43"/>
+                                <w:sz w:val="24"/>
+                                <w:szCs w:val="24"/>
+                              </w:rPr>
+                              <w:t xml:space="preserve">x</w:t>
+                            </w:r>
+                          </w:p>
+                        </w:tc>
+                        <w:tc>
+                          <w:tcPr>
+                            <w:tcW w:w="576" w:type="dxa"/>
+                            <w:tcMar>
+                              <w:top w:w="0" w:type="dxa"/>
+                              <w:bottom w:w="0" w:type="dxa"/>
+                              <w:left w:w="20" w:type="dxa"/>
+                              <w:right w:w="20" w:type="dxa"/>
+                            </w:tcMar>
+                            <w:vAlign w:val="center"/>
+                          </w:tcPr>
+                          <w:p>
+                            <w:pPr>
+                              <w:spacing w:before="0" w:after="0" w:line="240" w:lineRule="auto"/>
+                              <w:jc w:val="center"/>
+                            </w:pPr>
+                            <w:r>
+                              <w:rPr>
+                                <w:rFonts w:ascii="Indie Flower" w:hAnsi="Indie Flower" w:cs="Indie Flower"/>
+                                <w:color w:val="658C43"/>
+                                <w:sz w:val="24"/>
+                                <w:szCs w:val="24"/>
+                              </w:rPr>
+                              <w:t xml:space="preserve">x</w:t>
+                            </w:r>
+                          </w:p>
+                        </w:tc>
+                        <w:tc>
+                          <w:tcPr>
+                            <w:tcW w:w="806" w:type="dxa"/>
+                            <w:tcMar>
+                              <w:top w:w="0" w:type="dxa"/>
+                              <w:bottom w:w="0" w:type="dxa"/>
+                              <w:left w:w="20" w:type="dxa"/>
+                              <w:right w:w="20" w:type="dxa"/>
+                            </w:tcMar>
+                            <w:vAlign w:val="center"/>
+                          </w:tcPr>
+                          <w:p>
+                            <w:pPr>
+                              <w:spacing w:before="0" w:after="0" w:line="240" w:lineRule="auto"/>
+                              <w:jc w:val="center"/>
+                            </w:pPr>
+                            <w:r>
+                              <w:rPr>
+                                <w:rFonts w:ascii="Indie Flower" w:hAnsi="Indie Flower" w:cs="Indie Flower"/>
+                                <w:color w:val="658C43"/>
+                                <w:sz w:val="24"/>
+                                <w:szCs w:val="24"/>
+                              </w:rPr>
+                              <w:t/>
+                            </w:r>
+                          </w:p>
+                        </w:tc>
+                        <w:tc>
+                          <w:tcPr>
+                            <w:tcW w:w="826" w:type="dxa"/>
+                            <w:tcMar>
+                              <w:top w:w="0" w:type="dxa"/>
+                              <w:bottom w:w="0" w:type="dxa"/>
+                              <w:left w:w="20" w:type="dxa"/>
+                              <w:right w:w="20" w:type="dxa"/>
+                            </w:tcMar>
+                            <w:vAlign w:val="center"/>
+                          </w:tcPr>
+                          <w:p>
+                            <w:pPr>
+                              <w:spacing w:before="0" w:after="0" w:line="240" w:lineRule="auto"/>
+                              <w:jc w:val="center"/>
+                            </w:pPr>
+                            <w:r>
+                              <w:rPr>
+                                <w:rFonts w:ascii="Indie Flower" w:hAnsi="Indie Flower" w:cs="Indie Flower"/>
+                                <w:color w:val="658C43"/>
+                                <w:sz w:val="24"/>
+                                <w:szCs w:val="24"/>
+                              </w:rPr>
+                              <w:t/>
+                            </w:r>
+                          </w:p>
+                        </w:tc>
+                        <w:tc>
+                          <w:tcPr>
+                            <w:tcW w:w="557" w:type="dxa"/>
+                            <w:tcMar>
+                              <w:top w:w="0" w:type="dxa"/>
+                              <w:bottom w:w="0" w:type="dxa"/>
+                              <w:left w:w="20" w:type="dxa"/>
+                              <w:right w:w="20" w:type="dxa"/>
+                            </w:tcMar>
+                            <w:vAlign w:val="center"/>
+                          </w:tcPr>
+                          <w:p>
+                            <w:pPr>
+                              <w:spacing w:before="0" w:after="0" w:line="240" w:lineRule="auto"/>
+                              <w:jc w:val="center"/>
+                            </w:pPr>
+                            <w:r>
+                              <w:rPr>
+                                <w:rFonts w:ascii="Indie Flower" w:hAnsi="Indie Flower" w:cs="Indie Flower"/>
+                                <w:color w:val="658C43"/>
+                                <w:sz w:val="24"/>
+                                <w:szCs w:val="24"/>
+                              </w:rPr>
+                              <w:t xml:space="preserve">x</w:t>
+                            </w:r>
+                          </w:p>
+                        </w:tc>
+                        <w:tc>
+                          <w:tcPr>
+                            <w:tcW w:w="1090" w:type="dxa"/>
+                            <w:tcMar>
+                              <w:top w:w="0" w:type="dxa"/>
+                              <w:bottom w:w="0" w:type="dxa"/>
+                              <w:left w:w="20" w:type="dxa"/>
+                              <w:right w:w="20" w:type="dxa"/>
+                            </w:tcMar>
+                            <w:vAlign w:val="center"/>
+                          </w:tcPr>
+                          <w:p>
+                            <w:pPr>
+                              <w:spacing w:before="0" w:after="0" w:line="240" w:lineRule="auto"/>
+                              <w:jc w:val="center"/>
+                            </w:pPr>
+                            <w:r>
+                              <w:rPr>
+                                <w:rFonts w:ascii="Indie Flower" w:hAnsi="Indie Flower" w:cs="Indie Flower"/>
+                                <w:color w:val="658C43"/>
+                                <w:sz w:val="24"/>
+                                <w:szCs w:val="24"/>
+                              </w:rPr>
+                              <w:t/>
+                            </w:r>
+                          </w:p>
+                        </w:tc>
+                        <w:tc>
+                          <w:tcPr>
+                            <w:tcW w:w="763" w:type="dxa"/>
+                            <w:tcMar>
+                              <w:top w:w="0" w:type="dxa"/>
+                              <w:bottom w:w="0" w:type="dxa"/>
+                              <w:left w:w="20" w:type="dxa"/>
+                              <w:right w:w="20" w:type="dxa"/>
+                            </w:tcMar>
+                            <w:vAlign w:val="center"/>
+                          </w:tcPr>
+                          <w:p>
+                            <w:pPr>
+                              <w:spacing w:before="0" w:after="0" w:line="240" w:lineRule="auto"/>
+                              <w:jc w:val="center"/>
+                            </w:pPr>
+                            <w:r>
+                              <w:rPr>
+                                <w:rFonts w:ascii="Indie Flower" w:hAnsi="Indie Flower" w:cs="Indie Flower"/>
+                                <w:color w:val="658C43"/>
+                                <w:sz w:val="24"/>
+                                <w:szCs w:val="24"/>
+                              </w:rPr>
+                              <w:t/>
+                            </w:r>
+                          </w:p>
+                        </w:tc>
+                        <w:tc>
+                          <w:tcPr>
+                            <w:tcW w:w="581" w:type="dxa"/>
+                            <w:tcMar>
+                              <w:top w:w="0" w:type="dxa"/>
+                              <w:bottom w:w="0" w:type="dxa"/>
+                              <w:left w:w="20" w:type="dxa"/>
+                              <w:right w:w="20" w:type="dxa"/>
+                            </w:tcMar>
+                            <w:vAlign w:val="center"/>
+                          </w:tcPr>
+                          <w:p>
+                            <w:pPr>
+                              <w:spacing w:before="0" w:after="0" w:line="240" w:lineRule="auto"/>
+                              <w:jc w:val="center"/>
+                            </w:pPr>
+                            <w:r>
+                              <w:rPr>
+                                <w:rFonts w:ascii="Indie Flower" w:hAnsi="Indie Flower" w:cs="Indie Flower"/>
+                                <w:color w:val="658C43"/>
+                                <w:sz w:val="24"/>
+                                <w:szCs w:val="24"/>
+                              </w:rPr>
+                              <w:t/>
+                            </w:r>
+                          </w:p>
+                        </w:tc>
+                        <w:tc>
+                          <w:tcPr>
+                            <w:tcW w:w="566" w:type="dxa"/>
+                            <w:tcMar>
+                              <w:top w:w="0" w:type="dxa"/>
+                              <w:bottom w:w="0" w:type="dxa"/>
+                              <w:left w:w="20" w:type="dxa"/>
+                              <w:right w:w="20" w:type="dxa"/>
+                            </w:tcMar>
+                            <w:vAlign w:val="center"/>
+                          </w:tcPr>
+                          <w:p>
+                            <w:pPr>
+                              <w:spacing w:before="0" w:after="0" w:line="240" w:lineRule="auto"/>
+                              <w:jc w:val="center"/>
+                            </w:pPr>
+                            <w:r>
+                              <w:rPr>
+                                <w:rFonts w:ascii="Indie Flower" w:hAnsi="Indie Flower" w:cs="Indie Flower"/>
+                                <w:color w:val="658C43"/>
+                                <w:sz w:val="24"/>
+                                <w:szCs w:val="24"/>
+                              </w:rPr>
+                              <w:t/>
+                            </w:r>
+                          </w:p>
+                        </w:tc>
+                        <w:tc>
+                          <w:tcPr>
+                            <w:tcW w:w="600" w:type="dxa"/>
+                            <w:tcMar>
+                              <w:top w:w="0" w:type="dxa"/>
+                              <w:bottom w:w="0" w:type="dxa"/>
+                              <w:left w:w="20" w:type="dxa"/>
+                              <w:right w:w="20" w:type="dxa"/>
+                            </w:tcMar>
+                            <w:vAlign w:val="center"/>
+                          </w:tcPr>
+                          <w:p>
+                            <w:pPr>
+                              <w:spacing w:before="0" w:after="0" w:line="240" w:lineRule="auto"/>
+                              <w:jc w:val="center"/>
+                            </w:pPr>
+                            <w:r>
+                              <w:rPr>
+                                <w:rFonts w:ascii="Indie Flower" w:hAnsi="Indie Flower" w:cs="Indie Flower"/>
+                                <w:color w:val="658C43"/>
+                                <w:sz w:val="24"/>
+                                <w:szCs w:val="24"/>
+                              </w:rPr>
+                              <w:t/>
+                            </w:r>
+                          </w:p>
+                        </w:tc>
+                        <w:tc>
+                          <w:tcPr>
+                            <w:tcW w:w="624" w:type="dxa"/>
+                            <w:tcMar>
+                              <w:top w:w="0" w:type="dxa"/>
+                              <w:bottom w:w="0" w:type="dxa"/>
+                              <w:left w:w="20" w:type="dxa"/>
+                              <w:right w:w="20" w:type="dxa"/>
+                            </w:tcMar>
+                            <w:vAlign w:val="center"/>
+                          </w:tcPr>
+                          <w:p>
+                            <w:pPr>
+                              <w:spacing w:before="0" w:after="0" w:line="240" w:lineRule="auto"/>
+                              <w:jc w:val="center"/>
+                            </w:pPr>
+                            <w:r>
+                              <w:rPr>
+                                <w:rFonts w:ascii="Indie Flower" w:hAnsi="Indie Flower" w:cs="Indie Flower"/>
+                                <w:color w:val="658C43"/>
+                                <w:sz w:val="24"/>
+                                <w:szCs w:val="24"/>
+                              </w:rPr>
+                              <w:t xml:space="preserve">x</w:t>
+                            </w:r>
+                          </w:p>
+                        </w:tc>
+                        <w:tc>
+                          <w:tcPr>
+                            <w:tcW w:w="1435" w:type="dxa"/>
+                            <w:tcMar>
+                              <w:top w:w="0" w:type="dxa"/>
+                              <w:bottom w:w="0" w:type="dxa"/>
+                              <w:left w:w="20" w:type="dxa"/>
+                              <w:right w:w="20" w:type="dxa"/>
+                            </w:tcMar>
+                            <w:vAlign w:val="center"/>
+                          </w:tcPr>
+                          <w:p>
+                            <w:pPr>
+                              <w:spacing w:before="0" w:after="0" w:line="240" w:lineRule="auto"/>
+                              <w:jc w:val="center"/>
+                            </w:pPr>
+                            <w:r>
+                              <w:rPr>
+                                <w:rFonts w:ascii="Indie Flower" w:hAnsi="Indie Flower" w:cs="Indie Flower"/>
+                                <w:color w:val="658C43"/>
+                                <w:sz w:val="24"/>
+                                <w:szCs w:val="24"/>
+                              </w:rPr>
+                              <w:t/>
+                            </w:r>
+                          </w:p>
+                        </w:tc>
+                      </w:tr>
+                    </w:tbl>
+                    <w:p>
+                      <w:pPr>
+                        <w:spacing w:before="0" w:after="0" w:line="20" w:lineRule="exact"/>
+                        <w:rPr>
+                          <w:sz w:val="2"/>
+                        </w:rPr>
+                      </w:pPr>
+                    </w:p>
+                  </w:txbxContent>
+                </wps:txbx>
+                <wps:bodyPr rot="0" vert="horz" wrap="square" lIns="0" tIns="0" rIns="0" bIns="0" anchor="t" anchorCtr="0">
+                  <a:noAutofit/>
+                </wps:bodyPr>
+              </wps:wsp>
+            </a:graphicData>
+          </a:graphic>
+        </wp:anchor>
+      </w:drawing>
+    </w:r>
+  </w:p>
+  <w:p>
+    <w:pPr>
+      <w:pStyle w:val="Fuzeile"/>
+    </w:pPr>
+  </w:p>
+</w:ftr>
 </file>
 
 <file path=word/footer3.xml><?xml version="1.0" encoding="utf-8"?>

</xml_diff>

<commit_message>
Testkarte: Allergen-Icons in Originalfarben
Co-Authored-By: Claude Opus 5.5 <noreply@anthropic.com>
</commit_message>
<xml_diff>
--- a/karten/2026-10-07/karte.docx
+++ b/karten/2026-10-07/karte.docx
@@ -1894,7 +1894,17 @@
                                 <w:sz w:val="10"/>
                                 <w:szCs w:val="10"/>
                               </w:rPr>
-                              <w:t xml:space="preserve">Schwefeldioxid u. Sulfit &gt;10 mg/kg, ltr.</w:t>
+                              <w:t xml:space="preserve">Schwefeldioxid u.</w:t>
+                            </w:r>
+                            <w:r>
+                              <w:rPr>
+                                <w:rFonts w:ascii="Glegoo" w:hAnsi="Glegoo" w:cs="Glegoo"/>
+                                <w:color w:val="4A4A4A"/>
+                                <w:sz w:val="10"/>
+                                <w:szCs w:val="10"/>
+                              </w:rPr>
+                              <w:br/>
+                              <w:t xml:space="preserve">Sulfit &gt;10 mg/kg, ltr.</w:t>
                             </w:r>
                           </w:p>
                         </w:tc>

</xml_diff>

<commit_message>
Karte 07.10. bis 09.10.2026 (aus der App)
</commit_message>
<xml_diff>
--- a/karten/2026-10-07/karte.docx
+++ b/karten/2026-10-07/karte.docx
@@ -2789,39 +2789,39 @@
                                 <w:sz w:val="24"/>
                                 <w:szCs w:val="24"/>
                               </w:rPr>
+                              <w:t/>
+                            </w:r>
+                          </w:p>
+                        </w:tc>
+                        <w:tc>
+                          <w:tcPr>
+                            <w:tcW w:w="605" w:type="dxa"/>
+                            <w:tcMar>
+                              <w:top w:w="0" w:type="dxa"/>
+                              <w:bottom w:w="0" w:type="dxa"/>
+                              <w:left w:w="20" w:type="dxa"/>
+                              <w:right w:w="20" w:type="dxa"/>
+                            </w:tcMar>
+                            <w:vAlign w:val="center"/>
+                          </w:tcPr>
+                          <w:p>
+                            <w:pPr>
+                              <w:spacing w:before="0" w:after="0" w:line="240" w:lineRule="auto"/>
+                              <w:jc w:val="center"/>
+                            </w:pPr>
+                            <w:r>
+                              <w:rPr>
+                                <w:rFonts w:ascii="Indie Flower" w:hAnsi="Indie Flower" w:cs="Indie Flower"/>
+                                <w:color w:val="658C43"/>
+                                <w:sz w:val="24"/>
+                                <w:szCs w:val="24"/>
+                              </w:rPr>
                               <w:t xml:space="preserve">x</w:t>
                             </w:r>
                           </w:p>
                         </w:tc>
                         <w:tc>
                           <w:tcPr>
-                            <w:tcW w:w="605" w:type="dxa"/>
-                            <w:tcMar>
-                              <w:top w:w="0" w:type="dxa"/>
-                              <w:bottom w:w="0" w:type="dxa"/>
-                              <w:left w:w="20" w:type="dxa"/>
-                              <w:right w:w="20" w:type="dxa"/>
-                            </w:tcMar>
-                            <w:vAlign w:val="center"/>
-                          </w:tcPr>
-                          <w:p>
-                            <w:pPr>
-                              <w:spacing w:before="0" w:after="0" w:line="240" w:lineRule="auto"/>
-                              <w:jc w:val="center"/>
-                            </w:pPr>
-                            <w:r>
-                              <w:rPr>
-                                <w:rFonts w:ascii="Indie Flower" w:hAnsi="Indie Flower" w:cs="Indie Flower"/>
-                                <w:color w:val="658C43"/>
-                                <w:sz w:val="24"/>
-                                <w:szCs w:val="24"/>
-                              </w:rPr>
-                              <w:t xml:space="preserve">x</w:t>
-                            </w:r>
-                          </w:p>
-                        </w:tc>
-                        <w:tc>
-                          <w:tcPr>
                             <w:tcW w:w="590" w:type="dxa"/>
                             <w:tcMar>
                               <w:top w:w="0" w:type="dxa"/>
@@ -2843,7 +2843,7 @@
                                 <w:sz w:val="24"/>
                                 <w:szCs w:val="24"/>
                               </w:rPr>
-                              <w:t xml:space="preserve">x</w:t>
+                              <w:t/>
                             </w:r>
                           </w:p>
                         </w:tc>
@@ -3201,7 +3201,7 @@
                                 <w:sz w:val="24"/>
                                 <w:szCs w:val="24"/>
                               </w:rPr>
-                              <w:t xml:space="preserve">x</w:t>
+                              <w:t/>
                             </w:r>
                           </w:p>
                         </w:tc>
@@ -3228,7 +3228,7 @@
                                 <w:sz w:val="24"/>
                                 <w:szCs w:val="24"/>
                               </w:rPr>
-                              <w:t xml:space="preserve">x</w:t>
+                              <w:t/>
                             </w:r>
                           </w:p>
                         </w:tc>
@@ -3255,7 +3255,7 @@
                                 <w:sz w:val="24"/>
                                 <w:szCs w:val="24"/>
                               </w:rPr>
-                              <w:t xml:space="preserve">x</w:t>
+                              <w:t/>
                             </w:r>
                           </w:p>
                         </w:tc>
@@ -3282,7 +3282,7 @@
                                 <w:sz w:val="24"/>
                                 <w:szCs w:val="24"/>
                               </w:rPr>
-                              <w:t xml:space="preserve">x</w:t>
+                              <w:t/>
                             </w:r>
                           </w:p>
                         </w:tc>
@@ -3363,7 +3363,7 @@
                                 <w:sz w:val="24"/>
                                 <w:szCs w:val="24"/>
                               </w:rPr>
-                              <w:t xml:space="preserve">x</w:t>
+                              <w:t/>
                             </w:r>
                           </w:p>
                         </w:tc>
@@ -3525,7 +3525,7 @@
                                 <w:sz w:val="24"/>
                                 <w:szCs w:val="24"/>
                               </w:rPr>
-                              <w:t xml:space="preserve">x</w:t>
+                              <w:t/>
                             </w:r>
                           </w:p>
                         </w:tc>

</xml_diff>

<commit_message>
Testkarte: freigegebene Allergen-Icons, ohne doppelte Uhrzeit
Co-Authored-By: Claude Opus 5.5 <noreply@anthropic.com>
</commit_message>
<xml_diff>
--- a/karten/2026-10-07/karte.docx
+++ b/karten/2026-10-07/karte.docx
@@ -598,22 +598,6 @@
         <w:jc w:val="center"/>
         <w:rPr>
           <w:rFonts w:ascii="Indie Flower" w:hAnsi="Indie Flower" w:cs="Indie Flower"/>
-          <w:color w:val="658C43"/>
-        </w:rPr>
-      </w:pPr>
-      <w:r>
-        <w:rPr>
-          <w:rFonts w:ascii="Indie Flower" w:hAnsi="Indie Flower" w:cs="Indie Flower"/>
-          <w:color w:val="658C43"/>
-        </w:rPr>
-        <w:t xml:space="preserve"> (11:30 Uhr - 14:00 Uhr)</w:t>
-      </w:r>
-    </w:p>
-    <w:p>
-      <w:pPr>
-        <w:jc w:val="center"/>
-        <w:rPr>
-          <w:rFonts w:ascii="Indie Flower" w:hAnsi="Indie Flower" w:cs="Indie Flower"/>
         </w:rPr>
       </w:pPr>
     </w:p>
@@ -2789,7 +2773,7 @@
                                 <w:sz w:val="24"/>
                                 <w:szCs w:val="24"/>
                               </w:rPr>
-                              <w:t/>
+                              <w:t xml:space="preserve">x</w:t>
                             </w:r>
                           </w:p>
                         </w:tc>
@@ -2843,7 +2827,7 @@
                                 <w:sz w:val="24"/>
                                 <w:szCs w:val="24"/>
                               </w:rPr>
-                              <w:t/>
+                              <w:t xml:space="preserve">x</w:t>
                             </w:r>
                           </w:p>
                         </w:tc>
@@ -3201,13 +3185,121 @@
                                 <w:sz w:val="24"/>
                                 <w:szCs w:val="24"/>
                               </w:rPr>
+                              <w:t xml:space="preserve">x</w:t>
+                            </w:r>
+                          </w:p>
+                        </w:tc>
+                        <w:tc>
+                          <w:tcPr>
+                            <w:tcW w:w="605" w:type="dxa"/>
+                            <w:tcMar>
+                              <w:top w:w="0" w:type="dxa"/>
+                              <w:bottom w:w="0" w:type="dxa"/>
+                              <w:left w:w="20" w:type="dxa"/>
+                              <w:right w:w="20" w:type="dxa"/>
+                            </w:tcMar>
+                            <w:vAlign w:val="center"/>
+                          </w:tcPr>
+                          <w:p>
+                            <w:pPr>
+                              <w:spacing w:before="0" w:after="0" w:line="240" w:lineRule="auto"/>
+                              <w:jc w:val="center"/>
+                            </w:pPr>
+                            <w:r>
+                              <w:rPr>
+                                <w:rFonts w:ascii="Indie Flower" w:hAnsi="Indie Flower" w:cs="Indie Flower"/>
+                                <w:color w:val="658C43"/>
+                                <w:sz w:val="24"/>
+                                <w:szCs w:val="24"/>
+                              </w:rPr>
+                              <w:t xml:space="preserve">x</w:t>
+                            </w:r>
+                          </w:p>
+                        </w:tc>
+                        <w:tc>
+                          <w:tcPr>
+                            <w:tcW w:w="590" w:type="dxa"/>
+                            <w:tcMar>
+                              <w:top w:w="0" w:type="dxa"/>
+                              <w:bottom w:w="0" w:type="dxa"/>
+                              <w:left w:w="20" w:type="dxa"/>
+                              <w:right w:w="20" w:type="dxa"/>
+                            </w:tcMar>
+                            <w:vAlign w:val="center"/>
+                          </w:tcPr>
+                          <w:p>
+                            <w:pPr>
+                              <w:spacing w:before="0" w:after="0" w:line="240" w:lineRule="auto"/>
+                              <w:jc w:val="center"/>
+                            </w:pPr>
+                            <w:r>
+                              <w:rPr>
+                                <w:rFonts w:ascii="Indie Flower" w:hAnsi="Indie Flower" w:cs="Indie Flower"/>
+                                <w:color w:val="658C43"/>
+                                <w:sz w:val="24"/>
+                                <w:szCs w:val="24"/>
+                              </w:rPr>
+                              <w:t xml:space="preserve">x</w:t>
+                            </w:r>
+                          </w:p>
+                        </w:tc>
+                        <w:tc>
+                          <w:tcPr>
+                            <w:tcW w:w="576" w:type="dxa"/>
+                            <w:tcMar>
+                              <w:top w:w="0" w:type="dxa"/>
+                              <w:bottom w:w="0" w:type="dxa"/>
+                              <w:left w:w="20" w:type="dxa"/>
+                              <w:right w:w="20" w:type="dxa"/>
+                            </w:tcMar>
+                            <w:vAlign w:val="center"/>
+                          </w:tcPr>
+                          <w:p>
+                            <w:pPr>
+                              <w:spacing w:before="0" w:after="0" w:line="240" w:lineRule="auto"/>
+                              <w:jc w:val="center"/>
+                            </w:pPr>
+                            <w:r>
+                              <w:rPr>
+                                <w:rFonts w:ascii="Indie Flower" w:hAnsi="Indie Flower" w:cs="Indie Flower"/>
+                                <w:color w:val="658C43"/>
+                                <w:sz w:val="24"/>
+                                <w:szCs w:val="24"/>
+                              </w:rPr>
+                              <w:t xml:space="preserve">x</w:t>
+                            </w:r>
+                          </w:p>
+                        </w:tc>
+                        <w:tc>
+                          <w:tcPr>
+                            <w:tcW w:w="806" w:type="dxa"/>
+                            <w:tcMar>
+                              <w:top w:w="0" w:type="dxa"/>
+                              <w:bottom w:w="0" w:type="dxa"/>
+                              <w:left w:w="20" w:type="dxa"/>
+                              <w:right w:w="20" w:type="dxa"/>
+                            </w:tcMar>
+                            <w:vAlign w:val="center"/>
+                          </w:tcPr>
+                          <w:p>
+                            <w:pPr>
+                              <w:spacing w:before="0" w:after="0" w:line="240" w:lineRule="auto"/>
+                              <w:jc w:val="center"/>
+                            </w:pPr>
+                            <w:r>
+                              <w:rPr>
+                                <w:rFonts w:ascii="Indie Flower" w:hAnsi="Indie Flower" w:cs="Indie Flower"/>
+                                <w:color w:val="658C43"/>
+                                <w:sz w:val="24"/>
+                                <w:szCs w:val="24"/>
+                              </w:rPr>
                               <w:t/>
                             </w:r>
                           </w:p>
                         </w:tc>
                         <w:tc>
                           <w:tcPr>
-                            <w:tcW w:w="605" w:type="dxa"/>
+                            <w:tcW w:w="826" w:type="dxa"/>
                             <w:tcMar>
                               <w:top w:w="0" w:type="dxa"/>
                               <w:bottom w:w="0" w:type="dxa"/>
@@ -3234,7 +3326,34 @@
                         </w:tc>
                         <w:tc>
                           <w:tcPr>
-                            <w:tcW w:w="590" w:type="dxa"/>
+                            <w:tcW w:w="557" w:type="dxa"/>
+                            <w:tcMar>
+                              <w:top w:w="0" w:type="dxa"/>
+                              <w:bottom w:w="0" w:type="dxa"/>
+                              <w:left w:w="20" w:type="dxa"/>
+                              <w:right w:w="20" w:type="dxa"/>
+                            </w:tcMar>
+                            <w:vAlign w:val="center"/>
+                          </w:tcPr>
+                          <w:p>
+                            <w:pPr>
+                              <w:spacing w:before="0" w:after="0" w:line="240" w:lineRule="auto"/>
+                              <w:jc w:val="center"/>
+                            </w:pPr>
+                            <w:r>
+                              <w:rPr>
+                                <w:rFonts w:ascii="Indie Flower" w:hAnsi="Indie Flower" w:cs="Indie Flower"/>
+                                <w:color w:val="658C43"/>
+                                <w:sz w:val="24"/>
+                                <w:szCs w:val="24"/>
+                              </w:rPr>
+                              <w:t xml:space="preserve">x</w:t>
+                            </w:r>
+                          </w:p>
+                        </w:tc>
+                        <w:tc>
+                          <w:tcPr>
+                            <w:tcW w:w="1090" w:type="dxa"/>
                             <w:tcMar>
                               <w:top w:w="0" w:type="dxa"/>
                               <w:bottom w:w="0" w:type="dxa"/>
@@ -3261,7 +3380,7 @@
                         </w:tc>
                         <w:tc>
                           <w:tcPr>
-                            <w:tcW w:w="576" w:type="dxa"/>
+                            <w:tcW w:w="763" w:type="dxa"/>
                             <w:tcMar>
                               <w:top w:w="0" w:type="dxa"/>
                               <w:bottom w:w="0" w:type="dxa"/>
@@ -3288,7 +3407,7 @@
                         </w:tc>
                         <w:tc>
                           <w:tcPr>
-                            <w:tcW w:w="806" w:type="dxa"/>
+                            <w:tcW w:w="581" w:type="dxa"/>
                             <w:tcMar>
                               <w:top w:w="0" w:type="dxa"/>
                               <w:bottom w:w="0" w:type="dxa"/>
@@ -3315,7 +3434,7 @@
                         </w:tc>
                         <w:tc>
                           <w:tcPr>
-                            <w:tcW w:w="826" w:type="dxa"/>
+                            <w:tcW w:w="566" w:type="dxa"/>
                             <w:tcMar>
                               <w:top w:w="0" w:type="dxa"/>
                               <w:bottom w:w="0" w:type="dxa"/>
@@ -3342,7 +3461,7 @@
                         </w:tc>
                         <w:tc>
                           <w:tcPr>
-                            <w:tcW w:w="557" w:type="dxa"/>
+                            <w:tcW w:w="600" w:type="dxa"/>
                             <w:tcMar>
                               <w:top w:w="0" w:type="dxa"/>
                               <w:bottom w:w="0" w:type="dxa"/>
@@ -3369,141 +3488,6 @@
                         </w:tc>
                         <w:tc>
                           <w:tcPr>
-                            <w:tcW w:w="1090" w:type="dxa"/>
-                            <w:tcMar>
-                              <w:top w:w="0" w:type="dxa"/>
-                              <w:bottom w:w="0" w:type="dxa"/>
-                              <w:left w:w="20" w:type="dxa"/>
-                              <w:right w:w="20" w:type="dxa"/>
-                            </w:tcMar>
-                            <w:vAlign w:val="center"/>
-                          </w:tcPr>
-                          <w:p>
-                            <w:pPr>
-                              <w:spacing w:before="0" w:after="0" w:line="240" w:lineRule="auto"/>
-                              <w:jc w:val="center"/>
-                            </w:pPr>
-                            <w:r>
-                              <w:rPr>
-                                <w:rFonts w:ascii="Indie Flower" w:hAnsi="Indie Flower" w:cs="Indie Flower"/>
-                                <w:color w:val="658C43"/>
-                                <w:sz w:val="24"/>
-                                <w:szCs w:val="24"/>
-                              </w:rPr>
-                              <w:t/>
-                            </w:r>
-                          </w:p>
-                        </w:tc>
-                        <w:tc>
-                          <w:tcPr>
-                            <w:tcW w:w="763" w:type="dxa"/>
-                            <w:tcMar>
-                              <w:top w:w="0" w:type="dxa"/>
-                              <w:bottom w:w="0" w:type="dxa"/>
-                              <w:left w:w="20" w:type="dxa"/>
-                              <w:right w:w="20" w:type="dxa"/>
-                            </w:tcMar>
-                            <w:vAlign w:val="center"/>
-                          </w:tcPr>
-                          <w:p>
-                            <w:pPr>
-                              <w:spacing w:before="0" w:after="0" w:line="240" w:lineRule="auto"/>
-                              <w:jc w:val="center"/>
-                            </w:pPr>
-                            <w:r>
-                              <w:rPr>
-                                <w:rFonts w:ascii="Indie Flower" w:hAnsi="Indie Flower" w:cs="Indie Flower"/>
-                                <w:color w:val="658C43"/>
-                                <w:sz w:val="24"/>
-                                <w:szCs w:val="24"/>
-                              </w:rPr>
-                              <w:t/>
-                            </w:r>
-                          </w:p>
-                        </w:tc>
-                        <w:tc>
-                          <w:tcPr>
-                            <w:tcW w:w="581" w:type="dxa"/>
-                            <w:tcMar>
-                              <w:top w:w="0" w:type="dxa"/>
-                              <w:bottom w:w="0" w:type="dxa"/>
-                              <w:left w:w="20" w:type="dxa"/>
-                              <w:right w:w="20" w:type="dxa"/>
-                            </w:tcMar>
-                            <w:vAlign w:val="center"/>
-                          </w:tcPr>
-                          <w:p>
-                            <w:pPr>
-                              <w:spacing w:before="0" w:after="0" w:line="240" w:lineRule="auto"/>
-                              <w:jc w:val="center"/>
-                            </w:pPr>
-                            <w:r>
-                              <w:rPr>
-                                <w:rFonts w:ascii="Indie Flower" w:hAnsi="Indie Flower" w:cs="Indie Flower"/>
-                                <w:color w:val="658C43"/>
-                                <w:sz w:val="24"/>
-                                <w:szCs w:val="24"/>
-                              </w:rPr>
-                              <w:t/>
-                            </w:r>
-                          </w:p>
-                        </w:tc>
-                        <w:tc>
-                          <w:tcPr>
-                            <w:tcW w:w="566" w:type="dxa"/>
-                            <w:tcMar>
-                              <w:top w:w="0" w:type="dxa"/>
-                              <w:bottom w:w="0" w:type="dxa"/>
-                              <w:left w:w="20" w:type="dxa"/>
-                              <w:right w:w="20" w:type="dxa"/>
-                            </w:tcMar>
-                            <w:vAlign w:val="center"/>
-                          </w:tcPr>
-                          <w:p>
-                            <w:pPr>
-                              <w:spacing w:before="0" w:after="0" w:line="240" w:lineRule="auto"/>
-                              <w:jc w:val="center"/>
-                            </w:pPr>
-                            <w:r>
-                              <w:rPr>
-                                <w:rFonts w:ascii="Indie Flower" w:hAnsi="Indie Flower" w:cs="Indie Flower"/>
-                                <w:color w:val="658C43"/>
-                                <w:sz w:val="24"/>
-                                <w:szCs w:val="24"/>
-                              </w:rPr>
-                              <w:t/>
-                            </w:r>
-                          </w:p>
-                        </w:tc>
-                        <w:tc>
-                          <w:tcPr>
-                            <w:tcW w:w="600" w:type="dxa"/>
-                            <w:tcMar>
-                              <w:top w:w="0" w:type="dxa"/>
-                              <w:bottom w:w="0" w:type="dxa"/>
-                              <w:left w:w="20" w:type="dxa"/>
-                              <w:right w:w="20" w:type="dxa"/>
-                            </w:tcMar>
-                            <w:vAlign w:val="center"/>
-                          </w:tcPr>
-                          <w:p>
-                            <w:pPr>
-                              <w:spacing w:before="0" w:after="0" w:line="240" w:lineRule="auto"/>
-                              <w:jc w:val="center"/>
-                            </w:pPr>
-                            <w:r>
-                              <w:rPr>
-                                <w:rFonts w:ascii="Indie Flower" w:hAnsi="Indie Flower" w:cs="Indie Flower"/>
-                                <w:color w:val="658C43"/>
-                                <w:sz w:val="24"/>
-                                <w:szCs w:val="24"/>
-                              </w:rPr>
-                              <w:t/>
-                            </w:r>
-                          </w:p>
-                        </w:tc>
-                        <w:tc>
-                          <w:tcPr>
                             <w:tcW w:w="624" w:type="dxa"/>
                             <w:tcMar>
                               <w:top w:w="0" w:type="dxa"/>
@@ -3525,7 +3509,7 @@
                                 <w:sz w:val="24"/>
                                 <w:szCs w:val="24"/>
                               </w:rPr>
-                              <w:t/>
+                              <w:t xml:space="preserve">x</w:t>
                             </w:r>
                           </w:p>
                         </w:tc>

</xml_diff>